<commit_message>
DOC-11 e DOC-12 regerados (medição dos feeds, Supabase Storage)
</commit_message>
<xml_diff>
--- a/docs/DOC-12_Eleicoes.docx
+++ b/docs/DOC-12_Eleicoes.docx
@@ -267,7 +267,7 @@
                 <w:sz w:val="19"/>
                 <w:szCs w:val="19"/>
               </w:rPr>
-              <w:t xml:space="preserve">1.2</w:t>
+              <w:t xml:space="preserve">1.3</w:t>
             </w:r>
           </w:p>
         </w:tc>
@@ -326,7 +326,7 @@
                 <w:sz w:val="19"/>
                 <w:szCs w:val="19"/>
               </w:rPr>
-              <w:t xml:space="preserve">7 de outubro de 2026</w:t>
+              <w:t xml:space="preserve">13 de outubro de 2026</w:t>
             </w:r>
           </w:p>
         </w:tc>
@@ -14186,7 +14186,7 @@
                 <w:sz w:val="17"/>
                 <w:szCs w:val="17"/>
               </w:rPr>
-              <w:t xml:space="preserve">Endereço S3 do R2: https://&lt;id da conta&gt;.r2.cloudflarestorage.com</w:t>
+              <w:t xml:space="preserve">Endereço S3 do R2 (https://&lt;id da conta&gt;.r2.cloudflarestorage.com) ou do Supabase (https://&lt;ref&gt;.storage.supabase.co/storage/v1/s3, seção 9.7)</w:t>
             </w:r>
           </w:p>
         </w:tc>
@@ -14447,7 +14447,7 @@
                 <w:sz w:val="17"/>
                 <w:szCs w:val="17"/>
               </w:rPr>
-              <w:t xml:space="preserve">Região da assinatura; o R2 usa auto</w:t>
+              <w:t xml:space="preserve">Região da assinatura: o R2 usa auto; o Supabase, a região do projeto (ex.: sa-east-1), e a configuração recusa endpoint do Supabase sem ela</w:t>
             </w:r>
           </w:p>
         </w:tc>
@@ -14534,7 +14534,7 @@
                 <w:sz w:val="17"/>
                 <w:szCs w:val="17"/>
               </w:rPr>
-              <w:t xml:space="preserve">Token da API S3 do R2, com leitura e escrita só nos dois buckets</w:t>
+              <w:t xml:space="preserve">Token da API S3 do R2, com leitura e escrita só nos dois buckets; no Supabase, as chaves S3 do projeto</w:t>
             </w:r>
           </w:p>
         </w:tc>
@@ -14803,7 +14803,7 @@
                 <w:sz w:val="17"/>
                 <w:szCs w:val="17"/>
               </w:rPr>
-              <w:t xml:space="preserve">Envia ao R2 os feeds novos ou alterados e grava o estado; imprime enviados, iguais e bytes</w:t>
+              <w:t xml:space="preserve">Envia ao bucket os feeds novos ou alterados e grava o estado; imprime enviados, iguais e bytes</w:t>
             </w:r>
           </w:p>
         </w:tc>
@@ -14836,7 +14836,7 @@
                 <w:sz w:val="17"/>
                 <w:szCs w:val="17"/>
               </w:rPr>
-              <w:t xml:space="preserve">lumen eleicoes catalogo</w:t>
+              <w:t xml:space="preserve">lumen eleicoes medir [--resumo arquivo]</w:t>
             </w:r>
           </w:p>
         </w:tc>
@@ -14863,7 +14863,7 @@
                 <w:sz w:val="17"/>
                 <w:szCs w:val="17"/>
               </w:rPr>
-              <w:t xml:space="preserve">Lista as eleições do sistema de resultados e os anos dos dados abertos</w:t>
+              <w:t xml:space="preserve">Tamanho dos feeds gravados: total, por grupo, maiores arquivos, se cabem no R2 e no Supabase gratuitos e o pior caso de saída por visitante e hora de apuração (seção 9.7); JSON na saída, Markdown no arquivo</w:t>
             </w:r>
           </w:p>
         </w:tc>
@@ -14896,7 +14896,7 @@
                 <w:sz w:val="17"/>
                 <w:szCs w:val="17"/>
               </w:rPr>
-              <w:t xml:space="preserve">lumen eleicoes municipios [--eleicao &lt;id&gt;]</w:t>
+              <w:t xml:space="preserve">lumen eleicoes catalogo</w:t>
             </w:r>
           </w:p>
         </w:tc>
@@ -14923,7 +14923,7 @@
                 <w:sz w:val="17"/>
                 <w:szCs w:val="17"/>
               </w:rPr>
-              <w:t xml:space="preserve">Grava municipios.json (TSE ↔ IBGE)</w:t>
+              <w:t xml:space="preserve">Lista as eleições do sistema de resultados e os anos dos dados abertos</w:t>
             </w:r>
           </w:p>
         </w:tc>
@@ -14956,7 +14956,7 @@
                 <w:sz w:val="17"/>
                 <w:szCs w:val="17"/>
               </w:rPr>
-              <w:t xml:space="preserve">lumen eleicoes mapas [--ufs] [--qualidade]</w:t>
+              <w:t xml:space="preserve">lumen eleicoes municipios [--eleicao &lt;id&gt;]</w:t>
             </w:r>
           </w:p>
         </w:tc>
@@ -14983,7 +14983,7 @@
                 <w:sz w:val="17"/>
                 <w:szCs w:val="17"/>
               </w:rPr>
-              <w:t xml:space="preserve">Baixa as malhas do IBGE</w:t>
+              <w:t xml:space="preserve">Grava municipios.json (TSE ↔ IBGE)</w:t>
             </w:r>
           </w:p>
         </w:tc>
@@ -15016,7 +15016,7 @@
                 <w:sz w:val="17"/>
                 <w:szCs w:val="17"/>
               </w:rPr>
-              <w:t xml:space="preserve">lumen eleicoes ao-vivo --eleicao &lt;id&gt; [--nuvem]</w:t>
+              <w:t xml:space="preserve">lumen eleicoes mapas [--ufs] [--qualidade]</w:t>
             </w:r>
           </w:p>
         </w:tc>
@@ -15043,7 +15043,7 @@
                 <w:sz w:val="17"/>
                 <w:szCs w:val="17"/>
               </w:rPr>
-              <w:t xml:space="preserve">Coleta a apuração em andamento (seção 5); com --nuvem, publica a cada passada</w:t>
+              <w:t xml:space="preserve">Baixa as malhas do IBGE</w:t>
             </w:r>
           </w:p>
         </w:tc>
@@ -15076,7 +15076,7 @@
                 <w:sz w:val="17"/>
                 <w:szCs w:val="17"/>
               </w:rPr>
-              <w:t xml:space="preserve">lumen eleicoes historico baixar --anos</w:t>
+              <w:t xml:space="preserve">lumen eleicoes ao-vivo --eleicao &lt;id&gt; [--nuvem]</w:t>
             </w:r>
           </w:p>
         </w:tc>
@@ -15103,7 +15103,7 @@
                 <w:sz w:val="17"/>
                 <w:szCs w:val="17"/>
               </w:rPr>
-              <w:t xml:space="preserve">Baixa os ZIPs dos dados abertos (1933 a 2024)</w:t>
+              <w:t xml:space="preserve">Coleta a apuração em andamento (seção 5); com --nuvem, publica a cada passada</w:t>
             </w:r>
           </w:p>
         </w:tc>
@@ -15136,7 +15136,7 @@
                 <w:sz w:val="17"/>
                 <w:szCs w:val="17"/>
               </w:rPr>
-              <w:t xml:space="preserve">lumen eleicoes historico processar --anos</w:t>
+              <w:t xml:space="preserve">lumen eleicoes historico baixar --anos</w:t>
             </w:r>
           </w:p>
         </w:tc>
@@ -15163,7 +15163,7 @@
                 <w:sz w:val="17"/>
                 <w:szCs w:val="17"/>
               </w:rPr>
-              <w:t xml:space="preserve">Gera os feeds das eleições passadas</w:t>
+              <w:t xml:space="preserve">Baixa os ZIPs dos dados abertos (1933 a 2024)</w:t>
             </w:r>
           </w:p>
         </w:tc>
@@ -15196,7 +15196,7 @@
                 <w:sz w:val="17"/>
                 <w:szCs w:val="17"/>
               </w:rPr>
-              <w:t xml:space="preserve">lumen eleicoes simular</w:t>
+              <w:t xml:space="preserve">lumen eleicoes historico processar --anos</w:t>
             </w:r>
           </w:p>
         </w:tc>
@@ -15223,7 +15223,7 @@
                 <w:sz w:val="17"/>
                 <w:szCs w:val="17"/>
               </w:rPr>
-              <w:t xml:space="preserve">Apuração fictícia a partir de arquivos finais reais</w:t>
+              <w:t xml:space="preserve">Gera os feeds das eleições passadas</w:t>
             </w:r>
           </w:p>
         </w:tc>
@@ -15256,7 +15256,7 @@
                 <w:sz w:val="17"/>
                 <w:szCs w:val="17"/>
               </w:rPr>
-              <w:t xml:space="preserve">lumen eleicoes amostra [--sem-referencias]</w:t>
+              <w:t xml:space="preserve">lumen eleicoes simular</w:t>
             </w:r>
           </w:p>
         </w:tc>
@@ -15283,7 +15283,7 @@
                 <w:sz w:val="17"/>
                 <w:szCs w:val="17"/>
               </w:rPr>
-              <w:t xml:space="preserve">Feeds de exemplo a partir das fixtures, sem rede, com o mapa e o cadastro</w:t>
+              <w:t xml:space="preserve">Apuração fictícia a partir de arquivos finais reais</w:t>
             </w:r>
           </w:p>
         </w:tc>
@@ -15316,7 +15316,7 @@
                 <w:sz w:val="17"/>
                 <w:szCs w:val="17"/>
               </w:rPr>
-              <w:t xml:space="preserve">lumen eleicoes servir [--porta 8080]</w:t>
+              <w:t xml:space="preserve">lumen eleicoes amostra [--sem-referencias]</w:t>
             </w:r>
           </w:p>
         </w:tc>
@@ -15343,7 +15343,7 @@
                 <w:sz w:val="17"/>
                 <w:szCs w:val="17"/>
               </w:rPr>
-              <w:t xml:space="preserve">Serve o portal exportado e os feeds localmente</w:t>
+              <w:t xml:space="preserve">Feeds de exemplo a partir das fixtures, sem rede, com o mapa e o cadastro</w:t>
             </w:r>
           </w:p>
         </w:tc>
@@ -15376,6 +15376,66 @@
                 <w:sz w:val="17"/>
                 <w:szCs w:val="17"/>
               </w:rPr>
+              <w:t xml:space="preserve">lumen eleicoes servir [--porta 8080]</w:t>
+            </w:r>
+          </w:p>
+        </w:tc>
+        <w:tc>
+          <w:tcPr>
+            <w:tcW w:type="dxa" w:w="5200"/>
+            <w:shd w:fill="FFFFFF" w:val="clear"/>
+            <w:tcMar>
+              <w:top w:type="dxa" w:w="70"/>
+              <w:left w:type="dxa" w:w="110"/>
+              <w:bottom w:type="dxa" w:w="70"/>
+              <w:right w:type="dxa" w:w="110"/>
+            </w:tcMar>
+            <w:vAlign w:val="center"/>
+          </w:tcPr>
+          <w:p>
+            <w:pPr>
+              <w:spacing w:after="0"/>
+            </w:pPr>
+            <w:r>
+              <w:rPr>
+                <w:b w:val="false"/>
+                <w:bCs w:val="false"/>
+                <w:sz w:val="17"/>
+                <w:szCs w:val="17"/>
+              </w:rPr>
+              <w:t xml:space="preserve">Serve o portal exportado e os feeds localmente</w:t>
+            </w:r>
+          </w:p>
+        </w:tc>
+      </w:tr>
+      <w:tr>
+        <w:trPr>
+          <w:cantSplit/>
+        </w:trPr>
+        <w:tc>
+          <w:tcPr>
+            <w:tcW w:type="dxa" w:w="4400"/>
+            <w:shd w:fill="F2F2F2" w:val="clear"/>
+            <w:tcMar>
+              <w:top w:type="dxa" w:w="70"/>
+              <w:left w:type="dxa" w:w="110"/>
+              <w:bottom w:type="dxa" w:w="70"/>
+              <w:right w:type="dxa" w:w="110"/>
+            </w:tcMar>
+            <w:vAlign w:val="center"/>
+          </w:tcPr>
+          <w:p>
+            <w:pPr>
+              <w:spacing w:after="0"/>
+            </w:pPr>
+            <w:r>
+              <w:rPr>
+                <w:rFonts w:ascii="Consolas" w:cs="Consolas" w:eastAsia="Consolas" w:hAnsi="Consolas"/>
+                <w:b w:val="false"/>
+                <w:bCs w:val="false"/>
+                <w:sz w:val="17"/>
+                <w:szCs w:val="17"/>
+              </w:rPr>
               <w:t xml:space="preserve">lumen eleicoes verificar</w:t>
             </w:r>
           </w:p>
@@ -15383,7 +15443,7 @@
         <w:tc>
           <w:tcPr>
             <w:tcW w:type="dxa" w:w="5200"/>
-            <w:shd w:fill="FFFFFF" w:val="clear"/>
+            <w:shd w:fill="F2F2F2" w:val="clear"/>
             <w:tcMar>
               <w:top w:type="dxa" w:w="70"/>
               <w:left w:type="dxa" w:w="110"/>
@@ -16623,7 +16683,7 @@
         <w:t xml:space="preserve">Cloudflare.</w:t>
       </w:r>
       <w:r>
-        <w:t xml:space="preserve"> Criar uma conta gratuita e, em Storage &amp; databases → R2, concluir a assinatura do R2. A tela de assinatura aparece mesmo no plano gratuito e pode pedir um meio de pagamento; o uso dentro dos limites da seção 9.6 não é cobrado.</w:t>
+        <w:t xml:space="preserve"> Criar uma conta gratuita e, em Storage &amp; databases → R2, concluir a assinatura do R2. A tela de assinatura aparece mesmo no plano gratuito e pode pedir um meio de pagamento; o uso dentro dos limites da seção 9.6 não é cobrado. Sem cartão, a alternativa para o 2º turno de 2026 é a da seção 9.7.</w:t>
       </w:r>
     </w:p>
     <w:p>
@@ -18996,24 +19056,861 @@
     </w:tbl>
     <w:p>
       <w:pPr>
-        <w:pStyle w:val="Heading1"/>
-        <w:keepNext/>
-        <w:keepLines/>
-        <w:spacing w:after="160" w:before="380"/>
-      </w:pPr>
-      <w:r>
-        <w:t xml:space="preserve">10. Verificação</w:t>
-      </w:r>
-    </w:p>
-    <w:p>
-      <w:pPr>
         <w:pStyle w:val="Heading2"/>
         <w:keepNext/>
         <w:keepLines/>
         <w:spacing w:after="120" w:before="280"/>
       </w:pPr>
       <w:r>
-        <w:t xml:space="preserve">10.1 Testes automatizados</w:t>
+        <w:t xml:space="preserve">9.7 Alternativa sem cartão: Supabase Storage, só 2026 (adendo do ADR-026)</w:t>
+      </w:r>
+    </w:p>
+    <w:p>
+      <w:pPr>
+        <w:spacing w:after="120"/>
+      </w:pPr>
+      <w:r>
+        <w:t xml:space="preserve">O R2 pede um meio de pagamento na assinatura, mesmo no plano gratuito. Sem ele, os feeds de 2026 (1º turno e o 2º turno de 25 de outubro) cabem no armazenamento gratuito do Supabase, que fala o mesmo protocolo S3: o código é o mesmo, muda só a configuração. As eleições de 1933 a 2024 ficam de fora, porque somam 2 a 3 GB e o Supabase gratuito guarda 1 GB.</w:t>
+      </w:r>
+    </w:p>
+    <w:tbl>
+      <w:tblPr>
+        <w:tblW w:type="dxa" w:w="9600"/>
+        <w:tblBorders>
+          <w:top w:val="single" w:color="BFBFBF" w:sz="4"/>
+          <w:left w:val="single" w:color="BFBFBF" w:sz="4"/>
+          <w:bottom w:val="single" w:color="BFBFBF" w:sz="4"/>
+          <w:right w:val="single" w:color="BFBFBF" w:sz="4"/>
+          <w:insideH w:val="single" w:color="D9D9D9" w:sz="2"/>
+          <w:insideV w:val="single" w:color="D9D9D9" w:sz="2"/>
+        </w:tblBorders>
+      </w:tblPr>
+      <w:tblGrid>
+        <w:gridCol w:w="2400"/>
+        <w:gridCol w:w="3600"/>
+        <w:gridCol w:w="3600"/>
+      </w:tblGrid>
+      <w:tr>
+        <w:trPr>
+          <w:tblHeader/>
+        </w:trPr>
+        <w:tc>
+          <w:tcPr>
+            <w:tcW w:type="dxa" w:w="2400"/>
+            <w:shd w:fill="1F3864" w:val="clear"/>
+            <w:tcMar>
+              <w:top w:type="dxa" w:w="80"/>
+              <w:left w:type="dxa" w:w="110"/>
+              <w:bottom w:type="dxa" w:w="80"/>
+              <w:right w:type="dxa" w:w="110"/>
+            </w:tcMar>
+            <w:vAlign w:val="center"/>
+          </w:tcPr>
+          <w:p>
+            <w:pPr>
+              <w:spacing w:after="0"/>
+            </w:pPr>
+            <w:r>
+              <w:rPr>
+                <w:b/>
+                <w:bCs/>
+                <w:color w:val="FFFFFF"/>
+                <w:sz w:val="19"/>
+                <w:szCs w:val="19"/>
+              </w:rPr>
+              <w:t xml:space="preserve"/>
+            </w:r>
+          </w:p>
+        </w:tc>
+        <w:tc>
+          <w:tcPr>
+            <w:tcW w:type="dxa" w:w="3600"/>
+            <w:shd w:fill="1F3864" w:val="clear"/>
+            <w:tcMar>
+              <w:top w:type="dxa" w:w="80"/>
+              <w:left w:type="dxa" w:w="110"/>
+              <w:bottom w:type="dxa" w:w="80"/>
+              <w:right w:type="dxa" w:w="110"/>
+            </w:tcMar>
+            <w:vAlign w:val="center"/>
+          </w:tcPr>
+          <w:p>
+            <w:pPr>
+              <w:spacing w:after="0"/>
+            </w:pPr>
+            <w:r>
+              <w:rPr>
+                <w:b/>
+                <w:bCs/>
+                <w:color w:val="FFFFFF"/>
+                <w:sz w:val="19"/>
+                <w:szCs w:val="19"/>
+              </w:rPr>
+              <w:t xml:space="preserve">Cloudflare R2</w:t>
+            </w:r>
+          </w:p>
+        </w:tc>
+        <w:tc>
+          <w:tcPr>
+            <w:tcW w:type="dxa" w:w="3600"/>
+            <w:shd w:fill="1F3864" w:val="clear"/>
+            <w:tcMar>
+              <w:top w:type="dxa" w:w="80"/>
+              <w:left w:type="dxa" w:w="110"/>
+              <w:bottom w:type="dxa" w:w="80"/>
+              <w:right w:type="dxa" w:w="110"/>
+            </w:tcMar>
+            <w:vAlign w:val="center"/>
+          </w:tcPr>
+          <w:p>
+            <w:pPr>
+              <w:spacing w:after="0"/>
+            </w:pPr>
+            <w:r>
+              <w:rPr>
+                <w:b/>
+                <w:bCs/>
+                <w:color w:val="FFFFFF"/>
+                <w:sz w:val="19"/>
+                <w:szCs w:val="19"/>
+              </w:rPr>
+              <w:t xml:space="preserve">Supabase Storage gratuito</w:t>
+            </w:r>
+          </w:p>
+        </w:tc>
+      </w:tr>
+      <w:tr>
+        <w:trPr>
+          <w:cantSplit/>
+        </w:trPr>
+        <w:tc>
+          <w:tcPr>
+            <w:tcW w:type="dxa" w:w="2400"/>
+            <w:shd w:fill="FFFFFF" w:val="clear"/>
+            <w:tcMar>
+              <w:top w:type="dxa" w:w="70"/>
+              <w:left w:type="dxa" w:w="110"/>
+              <w:bottom w:type="dxa" w:w="70"/>
+              <w:right w:type="dxa" w:w="110"/>
+            </w:tcMar>
+            <w:vAlign w:val="center"/>
+          </w:tcPr>
+          <w:p>
+            <w:pPr>
+              <w:spacing w:after="0"/>
+            </w:pPr>
+            <w:r>
+              <w:rPr>
+                <w:b/>
+                <w:bCs/>
+                <w:sz w:val="17"/>
+                <w:szCs w:val="17"/>
+              </w:rPr>
+              <w:t xml:space="preserve">Armazenamento</w:t>
+            </w:r>
+          </w:p>
+        </w:tc>
+        <w:tc>
+          <w:tcPr>
+            <w:tcW w:type="dxa" w:w="3600"/>
+            <w:shd w:fill="FFFFFF" w:val="clear"/>
+            <w:tcMar>
+              <w:top w:type="dxa" w:w="70"/>
+              <w:left w:type="dxa" w:w="110"/>
+              <w:bottom w:type="dxa" w:w="70"/>
+              <w:right w:type="dxa" w:w="110"/>
+            </w:tcMar>
+            <w:vAlign w:val="center"/>
+          </w:tcPr>
+          <w:p>
+            <w:pPr>
+              <w:spacing w:after="0"/>
+            </w:pPr>
+            <w:r>
+              <w:rPr>
+                <w:b w:val="false"/>
+                <w:bCs w:val="false"/>
+                <w:sz w:val="17"/>
+                <w:szCs w:val="17"/>
+              </w:rPr>
+              <w:t xml:space="preserve">10 GB-mês</w:t>
+            </w:r>
+          </w:p>
+        </w:tc>
+        <w:tc>
+          <w:tcPr>
+            <w:tcW w:type="dxa" w:w="3600"/>
+            <w:shd w:fill="FFFFFF" w:val="clear"/>
+            <w:tcMar>
+              <w:top w:type="dxa" w:w="70"/>
+              <w:left w:type="dxa" w:w="110"/>
+              <w:bottom w:type="dxa" w:w="70"/>
+              <w:right w:type="dxa" w:w="110"/>
+            </w:tcMar>
+            <w:vAlign w:val="center"/>
+          </w:tcPr>
+          <w:p>
+            <w:pPr>
+              <w:spacing w:after="0"/>
+            </w:pPr>
+            <w:r>
+              <w:rPr>
+                <w:b w:val="false"/>
+                <w:bCs w:val="false"/>
+                <w:sz w:val="17"/>
+                <w:szCs w:val="17"/>
+              </w:rPr>
+              <w:t xml:space="preserve">1 GB, 50 MB por arquivo</w:t>
+            </w:r>
+          </w:p>
+        </w:tc>
+      </w:tr>
+      <w:tr>
+        <w:trPr>
+          <w:cantSplit/>
+        </w:trPr>
+        <w:tc>
+          <w:tcPr>
+            <w:tcW w:type="dxa" w:w="2400"/>
+            <w:shd w:fill="F2F2F2" w:val="clear"/>
+            <w:tcMar>
+              <w:top w:type="dxa" w:w="70"/>
+              <w:left w:type="dxa" w:w="110"/>
+              <w:bottom w:type="dxa" w:w="70"/>
+              <w:right w:type="dxa" w:w="110"/>
+            </w:tcMar>
+            <w:vAlign w:val="center"/>
+          </w:tcPr>
+          <w:p>
+            <w:pPr>
+              <w:spacing w:after="0"/>
+            </w:pPr>
+            <w:r>
+              <w:rPr>
+                <w:b/>
+                <w:bCs/>
+                <w:sz w:val="17"/>
+                <w:szCs w:val="17"/>
+              </w:rPr>
+              <w:t xml:space="preserve">Saída (quem lê os feeds)</w:t>
+            </w:r>
+          </w:p>
+        </w:tc>
+        <w:tc>
+          <w:tcPr>
+            <w:tcW w:type="dxa" w:w="3600"/>
+            <w:shd w:fill="F2F2F2" w:val="clear"/>
+            <w:tcMar>
+              <w:top w:type="dxa" w:w="70"/>
+              <w:left w:type="dxa" w:w="110"/>
+              <w:bottom w:type="dxa" w:w="70"/>
+              <w:right w:type="dxa" w:w="110"/>
+            </w:tcMar>
+            <w:vAlign w:val="center"/>
+          </w:tcPr>
+          <w:p>
+            <w:pPr>
+              <w:spacing w:after="0"/>
+            </w:pPr>
+            <w:r>
+              <w:rPr>
+                <w:b w:val="false"/>
+                <w:bCs w:val="false"/>
+                <w:sz w:val="17"/>
+                <w:szCs w:val="17"/>
+              </w:rPr>
+              <w:t xml:space="preserve">Grátis, sem limite</w:t>
+            </w:r>
+          </w:p>
+        </w:tc>
+        <w:tc>
+          <w:tcPr>
+            <w:tcW w:type="dxa" w:w="3600"/>
+            <w:shd w:fill="F2F2F2" w:val="clear"/>
+            <w:tcMar>
+              <w:top w:type="dxa" w:w="70"/>
+              <w:left w:type="dxa" w:w="110"/>
+              <w:bottom w:type="dxa" w:w="70"/>
+              <w:right w:type="dxa" w:w="110"/>
+            </w:tcMar>
+            <w:vAlign w:val="center"/>
+          </w:tcPr>
+          <w:p>
+            <w:pPr>
+              <w:spacing w:after="0"/>
+            </w:pPr>
+            <w:r>
+              <w:rPr>
+                <w:b w:val="false"/>
+                <w:bCs w:val="false"/>
+                <w:sz w:val="17"/>
+                <w:szCs w:val="17"/>
+              </w:rPr>
+              <w:t xml:space="preserve">5 GB sem cache e 5 GB com cache por mês, somados a todo o uso da organização; passou, o projeto pode ser restringido até o mês seguinte</w:t>
+            </w:r>
+          </w:p>
+        </w:tc>
+      </w:tr>
+      <w:tr>
+        <w:trPr>
+          <w:cantSplit/>
+        </w:trPr>
+        <w:tc>
+          <w:tcPr>
+            <w:tcW w:type="dxa" w:w="2400"/>
+            <w:shd w:fill="FFFFFF" w:val="clear"/>
+            <w:tcMar>
+              <w:top w:type="dxa" w:w="70"/>
+              <w:left w:type="dxa" w:w="110"/>
+              <w:bottom w:type="dxa" w:w="70"/>
+              <w:right w:type="dxa" w:w="110"/>
+            </w:tcMar>
+            <w:vAlign w:val="center"/>
+          </w:tcPr>
+          <w:p>
+            <w:pPr>
+              <w:spacing w:after="0"/>
+            </w:pPr>
+            <w:r>
+              <w:rPr>
+                <w:b/>
+                <w:bCs/>
+                <w:sz w:val="17"/>
+                <w:szCs w:val="17"/>
+              </w:rPr>
+              <w:t xml:space="preserve">Meio de pagamento</w:t>
+            </w:r>
+          </w:p>
+        </w:tc>
+        <w:tc>
+          <w:tcPr>
+            <w:tcW w:type="dxa" w:w="3600"/>
+            <w:shd w:fill="FFFFFF" w:val="clear"/>
+            <w:tcMar>
+              <w:top w:type="dxa" w:w="70"/>
+              <w:left w:type="dxa" w:w="110"/>
+              <w:bottom w:type="dxa" w:w="70"/>
+              <w:right w:type="dxa" w:w="110"/>
+            </w:tcMar>
+            <w:vAlign w:val="center"/>
+          </w:tcPr>
+          <w:p>
+            <w:pPr>
+              <w:spacing w:after="0"/>
+            </w:pPr>
+            <w:r>
+              <w:rPr>
+                <w:b w:val="false"/>
+                <w:bCs w:val="false"/>
+                <w:sz w:val="17"/>
+                <w:szCs w:val="17"/>
+              </w:rPr>
+              <w:t xml:space="preserve">Pedido na assinatura</w:t>
+            </w:r>
+          </w:p>
+        </w:tc>
+        <w:tc>
+          <w:tcPr>
+            <w:tcW w:type="dxa" w:w="3600"/>
+            <w:shd w:fill="FFFFFF" w:val="clear"/>
+            <w:tcMar>
+              <w:top w:type="dxa" w:w="70"/>
+              <w:left w:type="dxa" w:w="110"/>
+              <w:bottom w:type="dxa" w:w="70"/>
+              <w:right w:type="dxa" w:w="110"/>
+            </w:tcMar>
+            <w:vAlign w:val="center"/>
+          </w:tcPr>
+          <w:p>
+            <w:pPr>
+              <w:spacing w:after="0"/>
+            </w:pPr>
+            <w:r>
+              <w:rPr>
+                <w:b w:val="false"/>
+                <w:bCs w:val="false"/>
+                <w:sz w:val="17"/>
+                <w:szCs w:val="17"/>
+              </w:rPr>
+              <w:t xml:space="preserve">Não</w:t>
+            </w:r>
+          </w:p>
+        </w:tc>
+      </w:tr>
+      <w:tr>
+        <w:trPr>
+          <w:cantSplit/>
+        </w:trPr>
+        <w:tc>
+          <w:tcPr>
+            <w:tcW w:type="dxa" w:w="2400"/>
+            <w:shd w:fill="F2F2F2" w:val="clear"/>
+            <w:tcMar>
+              <w:top w:type="dxa" w:w="70"/>
+              <w:left w:type="dxa" w:w="110"/>
+              <w:bottom w:type="dxa" w:w="70"/>
+              <w:right w:type="dxa" w:w="110"/>
+            </w:tcMar>
+            <w:vAlign w:val="center"/>
+          </w:tcPr>
+          <w:p>
+            <w:pPr>
+              <w:spacing w:after="0"/>
+            </w:pPr>
+            <w:r>
+              <w:rPr>
+                <w:b/>
+                <w:bCs/>
+                <w:sz w:val="17"/>
+                <w:szCs w:val="17"/>
+              </w:rPr>
+              <w:t xml:space="preserve">Eleições</w:t>
+            </w:r>
+          </w:p>
+        </w:tc>
+        <w:tc>
+          <w:tcPr>
+            <w:tcW w:type="dxa" w:w="3600"/>
+            <w:shd w:fill="F2F2F2" w:val="clear"/>
+            <w:tcMar>
+              <w:top w:type="dxa" w:w="70"/>
+              <w:left w:type="dxa" w:w="110"/>
+              <w:bottom w:type="dxa" w:w="70"/>
+              <w:right w:type="dxa" w:w="110"/>
+            </w:tcMar>
+            <w:vAlign w:val="center"/>
+          </w:tcPr>
+          <w:p>
+            <w:pPr>
+              <w:spacing w:after="0"/>
+            </w:pPr>
+            <w:r>
+              <w:rPr>
+                <w:b w:val="false"/>
+                <w:bCs w:val="false"/>
+                <w:sz w:val="17"/>
+                <w:szCs w:val="17"/>
+              </w:rPr>
+              <w:t xml:space="preserve">Todas, de 1933 a 2026</w:t>
+            </w:r>
+          </w:p>
+        </w:tc>
+        <w:tc>
+          <w:tcPr>
+            <w:tcW w:type="dxa" w:w="3600"/>
+            <w:shd w:fill="F2F2F2" w:val="clear"/>
+            <w:tcMar>
+              <w:top w:type="dxa" w:w="70"/>
+              <w:left w:type="dxa" w:w="110"/>
+              <w:bottom w:type="dxa" w:w="70"/>
+              <w:right w:type="dxa" w:w="110"/>
+            </w:tcMar>
+            <w:vAlign w:val="center"/>
+          </w:tcPr>
+          <w:p>
+            <w:pPr>
+              <w:spacing w:after="0"/>
+            </w:pPr>
+            <w:r>
+              <w:rPr>
+                <w:b w:val="false"/>
+                <w:bCs w:val="false"/>
+                <w:sz w:val="17"/>
+                <w:szCs w:val="17"/>
+              </w:rPr>
+              <w:t xml:space="preserve">Só 2026</w:t>
+            </w:r>
+          </w:p>
+        </w:tc>
+      </w:tr>
+      <w:tr>
+        <w:trPr>
+          <w:cantSplit/>
+        </w:trPr>
+        <w:tc>
+          <w:tcPr>
+            <w:tcW w:type="dxa" w:w="2400"/>
+            <w:shd w:fill="FFFFFF" w:val="clear"/>
+            <w:tcMar>
+              <w:top w:type="dxa" w:w="70"/>
+              <w:left w:type="dxa" w:w="110"/>
+              <w:bottom w:type="dxa" w:w="70"/>
+              <w:right w:type="dxa" w:w="110"/>
+            </w:tcMar>
+            <w:vAlign w:val="center"/>
+          </w:tcPr>
+          <w:p>
+            <w:pPr>
+              <w:spacing w:after="0"/>
+            </w:pPr>
+            <w:r>
+              <w:rPr>
+                <w:b/>
+                <w:bCs/>
+                <w:sz w:val="17"/>
+                <w:szCs w:val="17"/>
+              </w:rPr>
+              <w:t xml:space="preserve">CORS</w:t>
+            </w:r>
+          </w:p>
+        </w:tc>
+        <w:tc>
+          <w:tcPr>
+            <w:tcW w:type="dxa" w:w="3600"/>
+            <w:shd w:fill="FFFFFF" w:val="clear"/>
+            <w:tcMar>
+              <w:top w:type="dxa" w:w="70"/>
+              <w:left w:type="dxa" w:w="110"/>
+              <w:bottom w:type="dxa" w:w="70"/>
+              <w:right w:type="dxa" w:w="110"/>
+            </w:tcMar>
+            <w:vAlign w:val="center"/>
+          </w:tcPr>
+          <w:p>
+            <w:pPr>
+              <w:spacing w:after="0"/>
+            </w:pPr>
+            <w:r>
+              <w:rPr>
+                <w:b w:val="false"/>
+                <w:bCs w:val="false"/>
+                <w:sz w:val="17"/>
+                <w:szCs w:val="17"/>
+              </w:rPr>
+              <w:t xml:space="preserve">Política no bucket (seção 9.5)</w:t>
+            </w:r>
+          </w:p>
+        </w:tc>
+        <w:tc>
+          <w:tcPr>
+            <w:tcW w:type="dxa" w:w="3600"/>
+            <w:shd w:fill="FFFFFF" w:val="clear"/>
+            <w:tcMar>
+              <w:top w:type="dxa" w:w="70"/>
+              <w:left w:type="dxa" w:w="110"/>
+              <w:bottom w:type="dxa" w:w="70"/>
+              <w:right w:type="dxa" w:w="110"/>
+            </w:tcMar>
+            <w:vAlign w:val="center"/>
+          </w:tcPr>
+          <w:p>
+            <w:pPr>
+              <w:spacing w:after="0"/>
+            </w:pPr>
+            <w:r>
+              <w:rPr>
+                <w:b w:val="false"/>
+                <w:bCs w:val="false"/>
+                <w:sz w:val="17"/>
+                <w:szCs w:val="17"/>
+              </w:rPr>
+              <w:t xml:space="preserve">Nada a configurar: o Supabase responde a qualquer origem nos buckets públicos</w:t>
+            </w:r>
+          </w:p>
+        </w:tc>
+      </w:tr>
+      <w:tr>
+        <w:trPr>
+          <w:cantSplit/>
+        </w:trPr>
+        <w:tc>
+          <w:tcPr>
+            <w:tcW w:type="dxa" w:w="2400"/>
+            <w:shd w:fill="F2F2F2" w:val="clear"/>
+            <w:tcMar>
+              <w:top w:type="dxa" w:w="70"/>
+              <w:left w:type="dxa" w:w="110"/>
+              <w:bottom w:type="dxa" w:w="70"/>
+              <w:right w:type="dxa" w:w="110"/>
+            </w:tcMar>
+            <w:vAlign w:val="center"/>
+          </w:tcPr>
+          <w:p>
+            <w:pPr>
+              <w:spacing w:after="0"/>
+            </w:pPr>
+            <w:r>
+              <w:rPr>
+                <w:b/>
+                <w:bCs/>
+                <w:sz w:val="17"/>
+                <w:szCs w:val="17"/>
+              </w:rPr>
+              <w:t xml:space="preserve">Pausa</w:t>
+            </w:r>
+          </w:p>
+        </w:tc>
+        <w:tc>
+          <w:tcPr>
+            <w:tcW w:type="dxa" w:w="3600"/>
+            <w:shd w:fill="F2F2F2" w:val="clear"/>
+            <w:tcMar>
+              <w:top w:type="dxa" w:w="70"/>
+              <w:left w:type="dxa" w:w="110"/>
+              <w:bottom w:type="dxa" w:w="70"/>
+              <w:right w:type="dxa" w:w="110"/>
+            </w:tcMar>
+            <w:vAlign w:val="center"/>
+          </w:tcPr>
+          <w:p>
+            <w:pPr>
+              <w:spacing w:after="0"/>
+            </w:pPr>
+            <w:r>
+              <w:rPr>
+                <w:b w:val="false"/>
+                <w:bCs w:val="false"/>
+                <w:sz w:val="17"/>
+                <w:szCs w:val="17"/>
+              </w:rPr>
+              <w:t xml:space="preserve">Não há</w:t>
+            </w:r>
+          </w:p>
+        </w:tc>
+        <w:tc>
+          <w:tcPr>
+            <w:tcW w:type="dxa" w:w="3600"/>
+            <w:shd w:fill="F2F2F2" w:val="clear"/>
+            <w:tcMar>
+              <w:top w:type="dxa" w:w="70"/>
+              <w:left w:type="dxa" w:w="110"/>
+              <w:bottom w:type="dxa" w:w="70"/>
+              <w:right w:type="dxa" w:w="110"/>
+            </w:tcMar>
+            <w:vAlign w:val="center"/>
+          </w:tcPr>
+          <w:p>
+            <w:pPr>
+              <w:spacing w:after="0"/>
+            </w:pPr>
+            <w:r>
+              <w:rPr>
+                <w:b w:val="false"/>
+                <w:bCs w:val="false"/>
+                <w:sz w:val="17"/>
+                <w:szCs w:val="17"/>
+              </w:rPr>
+              <w:t xml:space="preserve">Projeto gratuito pausa após uma semana sem uso; a carga diária o mantém ativo</w:t>
+            </w:r>
+          </w:p>
+        </w:tc>
+      </w:tr>
+      <w:tr>
+        <w:trPr>
+          <w:cantSplit/>
+        </w:trPr>
+        <w:tc>
+          <w:tcPr>
+            <w:tcW w:type="dxa" w:w="2400"/>
+            <w:shd w:fill="FFFFFF" w:val="clear"/>
+            <w:tcMar>
+              <w:top w:type="dxa" w:w="70"/>
+              <w:left w:type="dxa" w:w="110"/>
+              <w:bottom w:type="dxa" w:w="70"/>
+              <w:right w:type="dxa" w:w="110"/>
+            </w:tcMar>
+            <w:vAlign w:val="center"/>
+          </w:tcPr>
+          <w:p>
+            <w:pPr>
+              <w:spacing w:after="0"/>
+            </w:pPr>
+            <w:r>
+              <w:rPr>
+                <w:b/>
+                <w:bCs/>
+                <w:sz w:val="17"/>
+                <w:szCs w:val="17"/>
+              </w:rPr>
+              <w:t xml:space="preserve">Endereço público dos feeds</w:t>
+            </w:r>
+          </w:p>
+        </w:tc>
+        <w:tc>
+          <w:tcPr>
+            <w:tcW w:type="dxa" w:w="3600"/>
+            <w:shd w:fill="FFFFFF" w:val="clear"/>
+            <w:tcMar>
+              <w:top w:type="dxa" w:w="70"/>
+              <w:left w:type="dxa" w:w="110"/>
+              <w:bottom w:type="dxa" w:w="70"/>
+              <w:right w:type="dxa" w:w="110"/>
+            </w:tcMar>
+            <w:vAlign w:val="center"/>
+          </w:tcPr>
+          <w:p>
+            <w:pPr>
+              <w:spacing w:after="0"/>
+            </w:pPr>
+            <w:r>
+              <w:rPr>
+                <w:b w:val="false"/>
+                <w:bCs w:val="false"/>
+                <w:sz w:val="17"/>
+                <w:szCs w:val="17"/>
+              </w:rPr>
+              <w:t xml:space="preserve">https://pub-….r2.dev ou domínio próprio</w:t>
+            </w:r>
+          </w:p>
+        </w:tc>
+        <w:tc>
+          <w:tcPr>
+            <w:tcW w:type="dxa" w:w="3600"/>
+            <w:shd w:fill="FFFFFF" w:val="clear"/>
+            <w:tcMar>
+              <w:top w:type="dxa" w:w="70"/>
+              <w:left w:type="dxa" w:w="110"/>
+              <w:bottom w:type="dxa" w:w="70"/>
+              <w:right w:type="dxa" w:w="110"/>
+            </w:tcMar>
+            <w:vAlign w:val="center"/>
+          </w:tcPr>
+          <w:p>
+            <w:pPr>
+              <w:spacing w:after="0"/>
+            </w:pPr>
+            <w:r>
+              <w:rPr>
+                <w:b w:val="false"/>
+                <w:bCs w:val="false"/>
+                <w:sz w:val="17"/>
+                <w:szCs w:val="17"/>
+              </w:rPr>
+              <w:t xml:space="preserve">https://&lt;ref&gt;.supabase.co/storage/v1/object/public/&lt;bucket&gt;</w:t>
+            </w:r>
+          </w:p>
+        </w:tc>
+      </w:tr>
+    </w:tbl>
+    <w:p>
+      <w:pPr>
+        <w:spacing w:after="80"/>
+      </w:pPr>
+    </w:p>
+    <w:p>
+      <w:pPr>
+        <w:spacing w:after="120"/>
+      </w:pPr>
+      <w:r>
+        <w:t xml:space="preserve">A saída é o ponto a medir antes de escolher. Durante a apuração, o portal relê o feed nacional e a evolução a cada 15 segundos e o índice a cada minuto. O fluxo </w:t>
+      </w:r>
+      <w:r>
+        <w:rPr>
+          <w:rFonts w:ascii="Consolas" w:cs="Consolas" w:eastAsia="Consolas" w:hAnsi="Consolas"/>
+          <w:sz w:val="19"/>
+          <w:szCs w:val="19"/>
+        </w:rPr>
+        <w:t xml:space="preserve">eleicoes-medir.yml</w:t>
+      </w:r>
+      <w:r>
+        <w:t xml:space="preserve"> gera os feeds de 2026 numa máquina do GitHub, sem publicar nada, e roda </w:t>
+      </w:r>
+      <w:r>
+        <w:rPr>
+          <w:rFonts w:ascii="Consolas" w:cs="Consolas" w:eastAsia="Consolas" w:hAnsi="Consolas"/>
+          <w:sz w:val="19"/>
+          <w:szCs w:val="19"/>
+        </w:rPr>
+        <w:t xml:space="preserve">lumen eleicoes medir</w:t>
+      </w:r>
+      <w:r>
+        <w:t xml:space="preserve">: o resumo da execução traz o tamanho total, se cabe em 1 GB, o maior arquivo e o pior caso de saída por visitante e por hora (o feed mudando entre duas leituras). Dividir 5 GB por esse número dá quantas horas-visitante a cota comporta; quando o feed não muda, o navegador recebe só uma resposta 304, e o consumo real fica abaixo do pior caso.</w:t>
+      </w:r>
+    </w:p>
+    <w:p>
+      <w:pPr>
+        <w:pStyle w:val="Heading3"/>
+        <w:keepNext/>
+        <w:keepLines/>
+        <w:spacing w:after="100" w:before="220"/>
+      </w:pPr>
+      <w:r>
+        <w:t xml:space="preserve">Configuração, uma vez</w:t>
+      </w:r>
+    </w:p>
+    <w:p>
+      <w:pPr>
+        <w:pStyle w:val="ListParagraph"/>
+        <w:numPr>
+          <w:ilvl w:val="0"/>
+          <w:numId w:val="9"/>
+        </w:numPr>
+        <w:spacing w:after="70"/>
+      </w:pPr>
+      <w:r>
+        <w:t xml:space="preserve">Num projeto do Supabase da conta do mantenedor (nunca na organização de uma empresa que ele atende), em Storage → Settings, habilitar a conexão S3 e anotar o endpoint e a região (ex.: </w:t>
+      </w:r>
+      <w:r>
+        <w:rPr>
+          <w:rFonts w:ascii="Consolas" w:cs="Consolas" w:eastAsia="Consolas" w:hAnsi="Consolas"/>
+          <w:sz w:val="19"/>
+          <w:szCs w:val="19"/>
+        </w:rPr>
+        <w:t xml:space="preserve">sa-east-1</w:t>
+      </w:r>
+      <w:r>
+        <w:t xml:space="preserve">).</w:t>
+      </w:r>
+    </w:p>
+    <w:p>
+      <w:pPr>
+        <w:pStyle w:val="ListParagraph"/>
+        <w:numPr>
+          <w:ilvl w:val="0"/>
+          <w:numId w:val="9"/>
+        </w:numPr>
+        <w:spacing w:after="70"/>
+      </w:pPr>
+      <w:r>
+        <w:t xml:space="preserve">Em Storage, criar o bucket </w:t>
+      </w:r>
+      <w:r>
+        <w:rPr>
+          <w:rFonts w:ascii="Consolas" w:cs="Consolas" w:eastAsia="Consolas" w:hAnsi="Consolas"/>
+          <w:sz w:val="19"/>
+          <w:szCs w:val="19"/>
+        </w:rPr>
+        <w:t xml:space="preserve">lumen-eleicoes</w:t>
+      </w:r>
+      <w:r>
+        <w:t xml:space="preserve"> com Public bucket ligado e o bucket </w:t>
+      </w:r>
+      <w:r>
+        <w:rPr>
+          <w:rFonts w:ascii="Consolas" w:cs="Consolas" w:eastAsia="Consolas" w:hAnsi="Consolas"/>
+          <w:sz w:val="19"/>
+          <w:szCs w:val="19"/>
+        </w:rPr>
+        <w:t xml:space="preserve">lumen-privado</w:t>
+      </w:r>
+      <w:r>
+        <w:t xml:space="preserve"> desligado.</w:t>
+      </w:r>
+    </w:p>
+    <w:p>
+      <w:pPr>
+        <w:pStyle w:val="ListParagraph"/>
+        <w:numPr>
+          <w:ilvl w:val="0"/>
+          <w:numId w:val="9"/>
+        </w:numPr>
+        <w:spacing w:after="70"/>
+      </w:pPr>
+      <w:r>
+        <w:t xml:space="preserve">Em Storage → Settings → S3 Access Keys, criar um par de chaves. A chave dá acesso a todos os buckets do projeto e ignora as políticas de linha: só em segredo do GitHub.</w:t>
+      </w:r>
+    </w:p>
+    <w:p>
+      <w:pPr>
+        <w:pStyle w:val="ListParagraph"/>
+        <w:numPr>
+          <w:ilvl w:val="0"/>
+          <w:numId w:val="9"/>
+        </w:numPr>
+        <w:spacing w:after="70"/>
+      </w:pPr>
+      <w:r>
+        <w:t xml:space="preserve">No GitHub, os mesmos nomes da seção 9.5, com os valores do Supabase:</w:t>
       </w:r>
     </w:p>
     <w:tbl>
@@ -19061,7 +19958,7 @@
                 <w:sz w:val="19"/>
                 <w:szCs w:val="19"/>
               </w:rPr>
-              <w:t xml:space="preserve">Conjunto</w:t>
+              <w:t xml:space="preserve">Nome no GitHub</w:t>
             </w:r>
           </w:p>
         </w:tc>
@@ -19089,7 +19986,7 @@
                 <w:sz w:val="19"/>
                 <w:szCs w:val="19"/>
               </w:rPr>
-              <w:t xml:space="preserve">Quantidade</w:t>
+              <w:t xml:space="preserve">Tipo</w:t>
             </w:r>
           </w:p>
         </w:tc>
@@ -19117,7 +20014,7 @@
                 <w:sz w:val="19"/>
                 <w:szCs w:val="19"/>
               </w:rPr>
-              <w:t xml:space="preserve">O que cobre</w:t>
+              <w:t xml:space="preserve">Valor no Supabase</w:t>
             </w:r>
           </w:p>
         </w:tc>
@@ -19144,12 +20041,13 @@
             </w:pPr>
             <w:r>
               <w:rPr>
-                <w:b w:val="false"/>
-                <w:bCs w:val="false"/>
-                <w:sz w:val="17"/>
-                <w:szCs w:val="17"/>
-              </w:rPr>
-              <w:t xml:space="preserve">packages/eleicoes/testes</w:t>
+                <w:rFonts w:ascii="Consolas" w:cs="Consolas" w:eastAsia="Consolas" w:hAnsi="Consolas"/>
+                <w:b w:val="false"/>
+                <w:bCs w:val="false"/>
+                <w:sz w:val="17"/>
+                <w:szCs w:val="17"/>
+              </w:rPr>
+              <w:t xml:space="preserve">R2_ENDPOINT</w:t>
             </w:r>
           </w:p>
         </w:tc>
@@ -19176,7 +20074,7 @@
                 <w:sz w:val="17"/>
                 <w:szCs w:val="17"/>
               </w:rPr>
-              <w:t xml:space="preserve">182</w:t>
+              <w:t xml:space="preserve">segredo</w:t>
             </w:r>
           </w:p>
         </w:tc>
@@ -19203,7 +20101,7 @@
                 <w:sz w:val="17"/>
                 <w:szCs w:val="17"/>
               </w:rPr>
-              <w:t xml:space="preserve">Leitores do TSE com arquivos reais, dados abertos com CSV sintético nos cabeçalhos reais dos três layouts, eleições de 1933 a 1990 com linhas reais recortadas de seis anos, download retomável, coletor contra servidor local, feeds (amostra byte a byte), cadastro, malhas e referências embutidas, servidor, preparar de ponta a ponta (com retomada e erro num ano), publicação na nuvem contra um S3 em memória (só o que mudou, índice por último, retomada em outra máquina, prazo, falhas de restauração e de publicação), configuração e CLI</w:t>
+              <w:t xml:space="preserve">https://&lt;ref&gt;.storage.supabase.co/storage/v1/s3</w:t>
             </w:r>
           </w:p>
         </w:tc>
@@ -19230,12 +20128,13 @@
             </w:pPr>
             <w:r>
               <w:rPr>
-                <w:b w:val="false"/>
-                <w:bCs w:val="false"/>
-                <w:sz w:val="17"/>
-                <w:szCs w:val="17"/>
-              </w:rPr>
-              <w:t xml:space="preserve">packages/portal (vitest)</w:t>
+                <w:rFonts w:ascii="Consolas" w:cs="Consolas" w:eastAsia="Consolas" w:hAnsi="Consolas"/>
+                <w:b w:val="false"/>
+                <w:bCs w:val="false"/>
+                <w:sz w:val="17"/>
+                <w:szCs w:val="17"/>
+              </w:rPr>
+              <w:t xml:space="preserve">R2_CHAVE_ACESSO</w:t>
             </w:r>
           </w:p>
         </w:tc>
@@ -19262,7 +20161,7 @@
                 <w:sz w:val="17"/>
                 <w:szCs w:val="17"/>
               </w:rPr>
-              <w:t xml:space="preserve">79</w:t>
+              <w:t xml:space="preserve">segredo</w:t>
             </w:r>
           </w:p>
         </w:tc>
@@ -19289,7 +20188,7 @@
                 <w:sz w:val="17"/>
                 <w:szCs w:val="17"/>
               </w:rPr>
-              <w:t xml:space="preserve">Decodificador TopoJSON, validação dos feeds lendo a amostra do Python (inclusive as eleições antigas), formatação, cores, busca, estado na URL, grupos do seletor, área do mapa ↔ parte e as contas do zoom</w:t>
+              <w:t xml:space="preserve">Access key ID do par criado no passo 3</w:t>
             </w:r>
           </w:p>
         </w:tc>
@@ -19316,6 +20215,969 @@
             </w:pPr>
             <w:r>
               <w:rPr>
+                <w:rFonts w:ascii="Consolas" w:cs="Consolas" w:eastAsia="Consolas" w:hAnsi="Consolas"/>
+                <w:b w:val="false"/>
+                <w:bCs w:val="false"/>
+                <w:sz w:val="17"/>
+                <w:szCs w:val="17"/>
+              </w:rPr>
+              <w:t xml:space="preserve">R2_CHAVE_SECRETA</w:t>
+            </w:r>
+          </w:p>
+        </w:tc>
+        <w:tc>
+          <w:tcPr>
+            <w:tcW w:type="dxa" w:w="1400"/>
+            <w:shd w:fill="FFFFFF" w:val="clear"/>
+            <w:tcMar>
+              <w:top w:type="dxa" w:w="70"/>
+              <w:left w:type="dxa" w:w="110"/>
+              <w:bottom w:type="dxa" w:w="70"/>
+              <w:right w:type="dxa" w:w="110"/>
+            </w:tcMar>
+            <w:vAlign w:val="center"/>
+          </w:tcPr>
+          <w:p>
+            <w:pPr>
+              <w:spacing w:after="0"/>
+            </w:pPr>
+            <w:r>
+              <w:rPr>
+                <w:b w:val="false"/>
+                <w:bCs w:val="false"/>
+                <w:sz w:val="17"/>
+                <w:szCs w:val="17"/>
+              </w:rPr>
+              <w:t xml:space="preserve">segredo</w:t>
+            </w:r>
+          </w:p>
+        </w:tc>
+        <w:tc>
+          <w:tcPr>
+            <w:tcW w:type="dxa" w:w="5200"/>
+            <w:shd w:fill="FFFFFF" w:val="clear"/>
+            <w:tcMar>
+              <w:top w:type="dxa" w:w="70"/>
+              <w:left w:type="dxa" w:w="110"/>
+              <w:bottom w:type="dxa" w:w="70"/>
+              <w:right w:type="dxa" w:w="110"/>
+            </w:tcMar>
+            <w:vAlign w:val="center"/>
+          </w:tcPr>
+          <w:p>
+            <w:pPr>
+              <w:spacing w:after="0"/>
+            </w:pPr>
+            <w:r>
+              <w:rPr>
+                <w:b w:val="false"/>
+                <w:bCs w:val="false"/>
+                <w:sz w:val="17"/>
+                <w:szCs w:val="17"/>
+              </w:rPr>
+              <w:t xml:space="preserve">Secret access key do mesmo par</w:t>
+            </w:r>
+          </w:p>
+        </w:tc>
+      </w:tr>
+      <w:tr>
+        <w:trPr>
+          <w:cantSplit/>
+        </w:trPr>
+        <w:tc>
+          <w:tcPr>
+            <w:tcW w:type="dxa" w:w="3000"/>
+            <w:shd w:fill="F2F2F2" w:val="clear"/>
+            <w:tcMar>
+              <w:top w:type="dxa" w:w="70"/>
+              <w:left w:type="dxa" w:w="110"/>
+              <w:bottom w:type="dxa" w:w="70"/>
+              <w:right w:type="dxa" w:w="110"/>
+            </w:tcMar>
+            <w:vAlign w:val="center"/>
+          </w:tcPr>
+          <w:p>
+            <w:pPr>
+              <w:spacing w:after="0"/>
+            </w:pPr>
+            <w:r>
+              <w:rPr>
+                <w:rFonts w:ascii="Consolas" w:cs="Consolas" w:eastAsia="Consolas" w:hAnsi="Consolas"/>
+                <w:b w:val="false"/>
+                <w:bCs w:val="false"/>
+                <w:sz w:val="17"/>
+                <w:szCs w:val="17"/>
+              </w:rPr>
+              <w:t xml:space="preserve">R2_REGIAO</w:t>
+            </w:r>
+          </w:p>
+        </w:tc>
+        <w:tc>
+          <w:tcPr>
+            <w:tcW w:type="dxa" w:w="1400"/>
+            <w:shd w:fill="F2F2F2" w:val="clear"/>
+            <w:tcMar>
+              <w:top w:type="dxa" w:w="70"/>
+              <w:left w:type="dxa" w:w="110"/>
+              <w:bottom w:type="dxa" w:w="70"/>
+              <w:right w:type="dxa" w:w="110"/>
+            </w:tcMar>
+            <w:vAlign w:val="center"/>
+          </w:tcPr>
+          <w:p>
+            <w:pPr>
+              <w:spacing w:after="0"/>
+            </w:pPr>
+            <w:r>
+              <w:rPr>
+                <w:b w:val="false"/>
+                <w:bCs w:val="false"/>
+                <w:sz w:val="17"/>
+                <w:szCs w:val="17"/>
+              </w:rPr>
+              <w:t xml:space="preserve">variável</w:t>
+            </w:r>
+          </w:p>
+        </w:tc>
+        <w:tc>
+          <w:tcPr>
+            <w:tcW w:type="dxa" w:w="5200"/>
+            <w:shd w:fill="F2F2F2" w:val="clear"/>
+            <w:tcMar>
+              <w:top w:type="dxa" w:w="70"/>
+              <w:left w:type="dxa" w:w="110"/>
+              <w:bottom w:type="dxa" w:w="70"/>
+              <w:right w:type="dxa" w:w="110"/>
+            </w:tcMar>
+            <w:vAlign w:val="center"/>
+          </w:tcPr>
+          <w:p>
+            <w:pPr>
+              <w:spacing w:after="0"/>
+            </w:pPr>
+            <w:r>
+              <w:rPr>
+                <w:b w:val="false"/>
+                <w:bCs w:val="false"/>
+                <w:sz w:val="17"/>
+                <w:szCs w:val="17"/>
+              </w:rPr>
+              <w:t xml:space="preserve">A região do projeto (ex.: sa-east-1); obrigatória no Supabase</w:t>
+            </w:r>
+          </w:p>
+        </w:tc>
+      </w:tr>
+      <w:tr>
+        <w:trPr>
+          <w:cantSplit/>
+        </w:trPr>
+        <w:tc>
+          <w:tcPr>
+            <w:tcW w:type="dxa" w:w="3000"/>
+            <w:shd w:fill="FFFFFF" w:val="clear"/>
+            <w:tcMar>
+              <w:top w:type="dxa" w:w="70"/>
+              <w:left w:type="dxa" w:w="110"/>
+              <w:bottom w:type="dxa" w:w="70"/>
+              <w:right w:type="dxa" w:w="110"/>
+            </w:tcMar>
+            <w:vAlign w:val="center"/>
+          </w:tcPr>
+          <w:p>
+            <w:pPr>
+              <w:spacing w:after="0"/>
+            </w:pPr>
+            <w:r>
+              <w:rPr>
+                <w:rFonts w:ascii="Consolas" w:cs="Consolas" w:eastAsia="Consolas" w:hAnsi="Consolas"/>
+                <w:b w:val="false"/>
+                <w:bCs w:val="false"/>
+                <w:sz w:val="17"/>
+                <w:szCs w:val="17"/>
+              </w:rPr>
+              <w:t xml:space="preserve">R2_BUCKET_FEEDS</w:t>
+            </w:r>
+          </w:p>
+        </w:tc>
+        <w:tc>
+          <w:tcPr>
+            <w:tcW w:type="dxa" w:w="1400"/>
+            <w:shd w:fill="FFFFFF" w:val="clear"/>
+            <w:tcMar>
+              <w:top w:type="dxa" w:w="70"/>
+              <w:left w:type="dxa" w:w="110"/>
+              <w:bottom w:type="dxa" w:w="70"/>
+              <w:right w:type="dxa" w:w="110"/>
+            </w:tcMar>
+            <w:vAlign w:val="center"/>
+          </w:tcPr>
+          <w:p>
+            <w:pPr>
+              <w:spacing w:after="0"/>
+            </w:pPr>
+            <w:r>
+              <w:rPr>
+                <w:b w:val="false"/>
+                <w:bCs w:val="false"/>
+                <w:sz w:val="17"/>
+                <w:szCs w:val="17"/>
+              </w:rPr>
+              <w:t xml:space="preserve">variável</w:t>
+            </w:r>
+          </w:p>
+        </w:tc>
+        <w:tc>
+          <w:tcPr>
+            <w:tcW w:type="dxa" w:w="5200"/>
+            <w:shd w:fill="FFFFFF" w:val="clear"/>
+            <w:tcMar>
+              <w:top w:type="dxa" w:w="70"/>
+              <w:left w:type="dxa" w:w="110"/>
+              <w:bottom w:type="dxa" w:w="70"/>
+              <w:right w:type="dxa" w:w="110"/>
+            </w:tcMar>
+            <w:vAlign w:val="center"/>
+          </w:tcPr>
+          <w:p>
+            <w:pPr>
+              <w:spacing w:after="0"/>
+            </w:pPr>
+            <w:r>
+              <w:rPr>
+                <w:b w:val="false"/>
+                <w:bCs w:val="false"/>
+                <w:sz w:val="17"/>
+                <w:szCs w:val="17"/>
+              </w:rPr>
+              <w:t xml:space="preserve">lumen-eleicoes</w:t>
+            </w:r>
+          </w:p>
+        </w:tc>
+      </w:tr>
+      <w:tr>
+        <w:trPr>
+          <w:cantSplit/>
+        </w:trPr>
+        <w:tc>
+          <w:tcPr>
+            <w:tcW w:type="dxa" w:w="3000"/>
+            <w:shd w:fill="F2F2F2" w:val="clear"/>
+            <w:tcMar>
+              <w:top w:type="dxa" w:w="70"/>
+              <w:left w:type="dxa" w:w="110"/>
+              <w:bottom w:type="dxa" w:w="70"/>
+              <w:right w:type="dxa" w:w="110"/>
+            </w:tcMar>
+            <w:vAlign w:val="center"/>
+          </w:tcPr>
+          <w:p>
+            <w:pPr>
+              <w:spacing w:after="0"/>
+            </w:pPr>
+            <w:r>
+              <w:rPr>
+                <w:rFonts w:ascii="Consolas" w:cs="Consolas" w:eastAsia="Consolas" w:hAnsi="Consolas"/>
+                <w:b w:val="false"/>
+                <w:bCs w:val="false"/>
+                <w:sz w:val="17"/>
+                <w:szCs w:val="17"/>
+              </w:rPr>
+              <w:t xml:space="preserve">R2_BUCKET_ESTADO</w:t>
+            </w:r>
+          </w:p>
+        </w:tc>
+        <w:tc>
+          <w:tcPr>
+            <w:tcW w:type="dxa" w:w="1400"/>
+            <w:shd w:fill="F2F2F2" w:val="clear"/>
+            <w:tcMar>
+              <w:top w:type="dxa" w:w="70"/>
+              <w:left w:type="dxa" w:w="110"/>
+              <w:bottom w:type="dxa" w:w="70"/>
+              <w:right w:type="dxa" w:w="110"/>
+            </w:tcMar>
+            <w:vAlign w:val="center"/>
+          </w:tcPr>
+          <w:p>
+            <w:pPr>
+              <w:spacing w:after="0"/>
+            </w:pPr>
+            <w:r>
+              <w:rPr>
+                <w:b w:val="false"/>
+                <w:bCs w:val="false"/>
+                <w:sz w:val="17"/>
+                <w:szCs w:val="17"/>
+              </w:rPr>
+              <w:t xml:space="preserve">variável</w:t>
+            </w:r>
+          </w:p>
+        </w:tc>
+        <w:tc>
+          <w:tcPr>
+            <w:tcW w:type="dxa" w:w="5200"/>
+            <w:shd w:fill="F2F2F2" w:val="clear"/>
+            <w:tcMar>
+              <w:top w:type="dxa" w:w="70"/>
+              <w:left w:type="dxa" w:w="110"/>
+              <w:bottom w:type="dxa" w:w="70"/>
+              <w:right w:type="dxa" w:w="110"/>
+            </w:tcMar>
+            <w:vAlign w:val="center"/>
+          </w:tcPr>
+          <w:p>
+            <w:pPr>
+              <w:spacing w:after="0"/>
+            </w:pPr>
+            <w:r>
+              <w:rPr>
+                <w:b w:val="false"/>
+                <w:bCs w:val="false"/>
+                <w:sz w:val="17"/>
+                <w:szCs w:val="17"/>
+              </w:rPr>
+              <w:t xml:space="preserve">lumen-privado</w:t>
+            </w:r>
+          </w:p>
+        </w:tc>
+      </w:tr>
+      <w:tr>
+        <w:trPr>
+          <w:cantSplit/>
+        </w:trPr>
+        <w:tc>
+          <w:tcPr>
+            <w:tcW w:type="dxa" w:w="3000"/>
+            <w:shd w:fill="FFFFFF" w:val="clear"/>
+            <w:tcMar>
+              <w:top w:type="dxa" w:w="70"/>
+              <w:left w:type="dxa" w:w="110"/>
+              <w:bottom w:type="dxa" w:w="70"/>
+              <w:right w:type="dxa" w:w="110"/>
+            </w:tcMar>
+            <w:vAlign w:val="center"/>
+          </w:tcPr>
+          <w:p>
+            <w:pPr>
+              <w:spacing w:after="0"/>
+            </w:pPr>
+            <w:r>
+              <w:rPr>
+                <w:rFonts w:ascii="Consolas" w:cs="Consolas" w:eastAsia="Consolas" w:hAnsi="Consolas"/>
+                <w:b w:val="false"/>
+                <w:bCs w:val="false"/>
+                <w:sz w:val="17"/>
+                <w:szCs w:val="17"/>
+              </w:rPr>
+              <w:t xml:space="preserve">ELEICOES_SEM_HISTORICO</w:t>
+            </w:r>
+          </w:p>
+        </w:tc>
+        <w:tc>
+          <w:tcPr>
+            <w:tcW w:type="dxa" w:w="1400"/>
+            <w:shd w:fill="FFFFFF" w:val="clear"/>
+            <w:tcMar>
+              <w:top w:type="dxa" w:w="70"/>
+              <w:left w:type="dxa" w:w="110"/>
+              <w:bottom w:type="dxa" w:w="70"/>
+              <w:right w:type="dxa" w:w="110"/>
+            </w:tcMar>
+            <w:vAlign w:val="center"/>
+          </w:tcPr>
+          <w:p>
+            <w:pPr>
+              <w:spacing w:after="0"/>
+            </w:pPr>
+            <w:r>
+              <w:rPr>
+                <w:b w:val="false"/>
+                <w:bCs w:val="false"/>
+                <w:sz w:val="17"/>
+                <w:szCs w:val="17"/>
+              </w:rPr>
+              <w:t xml:space="preserve">variável</w:t>
+            </w:r>
+          </w:p>
+        </w:tc>
+        <w:tc>
+          <w:tcPr>
+            <w:tcW w:type="dxa" w:w="5200"/>
+            <w:shd w:fill="FFFFFF" w:val="clear"/>
+            <w:tcMar>
+              <w:top w:type="dxa" w:w="70"/>
+              <w:left w:type="dxa" w:w="110"/>
+              <w:bottom w:type="dxa" w:w="70"/>
+              <w:right w:type="dxa" w:w="110"/>
+            </w:tcMar>
+            <w:vAlign w:val="center"/>
+          </w:tcPr>
+          <w:p>
+            <w:pPr>
+              <w:spacing w:after="0"/>
+            </w:pPr>
+            <w:r>
+              <w:rPr>
+                <w:b w:val="false"/>
+                <w:bCs w:val="false"/>
+                <w:sz w:val="17"/>
+                <w:szCs w:val="17"/>
+              </w:rPr>
+              <w:t xml:space="preserve">true: a carga diária não baixa os dados abertos de 1933 a 2024</w:t>
+            </w:r>
+          </w:p>
+        </w:tc>
+      </w:tr>
+      <w:tr>
+        <w:trPr>
+          <w:cantSplit/>
+        </w:trPr>
+        <w:tc>
+          <w:tcPr>
+            <w:tcW w:type="dxa" w:w="3000"/>
+            <w:shd w:fill="F2F2F2" w:val="clear"/>
+            <w:tcMar>
+              <w:top w:type="dxa" w:w="70"/>
+              <w:left w:type="dxa" w:w="110"/>
+              <w:bottom w:type="dxa" w:w="70"/>
+              <w:right w:type="dxa" w:w="110"/>
+            </w:tcMar>
+            <w:vAlign w:val="center"/>
+          </w:tcPr>
+          <w:p>
+            <w:pPr>
+              <w:spacing w:after="0"/>
+            </w:pPr>
+            <w:r>
+              <w:rPr>
+                <w:rFonts w:ascii="Consolas" w:cs="Consolas" w:eastAsia="Consolas" w:hAnsi="Consolas"/>
+                <w:b w:val="false"/>
+                <w:bCs w:val="false"/>
+                <w:sz w:val="17"/>
+                <w:szCs w:val="17"/>
+              </w:rPr>
+              <w:t xml:space="preserve">LUMEN_URL_FEEDS</w:t>
+            </w:r>
+          </w:p>
+        </w:tc>
+        <w:tc>
+          <w:tcPr>
+            <w:tcW w:type="dxa" w:w="1400"/>
+            <w:shd w:fill="F2F2F2" w:val="clear"/>
+            <w:tcMar>
+              <w:top w:type="dxa" w:w="70"/>
+              <w:left w:type="dxa" w:w="110"/>
+              <w:bottom w:type="dxa" w:w="70"/>
+              <w:right w:type="dxa" w:w="110"/>
+            </w:tcMar>
+            <w:vAlign w:val="center"/>
+          </w:tcPr>
+          <w:p>
+            <w:pPr>
+              <w:spacing w:after="0"/>
+            </w:pPr>
+            <w:r>
+              <w:rPr>
+                <w:b w:val="false"/>
+                <w:bCs w:val="false"/>
+                <w:sz w:val="17"/>
+                <w:szCs w:val="17"/>
+              </w:rPr>
+              <w:t xml:space="preserve">variável</w:t>
+            </w:r>
+          </w:p>
+        </w:tc>
+        <w:tc>
+          <w:tcPr>
+            <w:tcW w:type="dxa" w:w="5200"/>
+            <w:shd w:fill="F2F2F2" w:val="clear"/>
+            <w:tcMar>
+              <w:top w:type="dxa" w:w="70"/>
+              <w:left w:type="dxa" w:w="110"/>
+              <w:bottom w:type="dxa" w:w="70"/>
+              <w:right w:type="dxa" w:w="110"/>
+            </w:tcMar>
+            <w:vAlign w:val="center"/>
+          </w:tcPr>
+          <w:p>
+            <w:pPr>
+              <w:spacing w:after="0"/>
+            </w:pPr>
+            <w:r>
+              <w:rPr>
+                <w:b w:val="false"/>
+                <w:bCs w:val="false"/>
+                <w:sz w:val="17"/>
+                <w:szCs w:val="17"/>
+              </w:rPr>
+              <w:t xml:space="preserve">https://&lt;ref&gt;.supabase.co/storage/v1/object/public/lumen-eleicoes</w:t>
+            </w:r>
+          </w:p>
+        </w:tc>
+      </w:tr>
+    </w:tbl>
+    <w:p>
+      <w:pPr>
+        <w:spacing w:after="80"/>
+      </w:pPr>
+    </w:p>
+    <w:p>
+      <w:pPr>
+        <w:pStyle w:val="ListParagraph"/>
+        <w:numPr>
+          <w:ilvl w:val="0"/>
+          <w:numId w:val="9"/>
+        </w:numPr>
+        <w:spacing w:after="70"/>
+      </w:pPr>
+      <w:r>
+        <w:t xml:space="preserve">Actions → </w:t>
+      </w:r>
+      <w:r>
+        <w:rPr>
+          <w:rFonts w:ascii="Consolas" w:cs="Consolas" w:eastAsia="Consolas" w:hAnsi="Consolas"/>
+          <w:sz w:val="19"/>
+          <w:szCs w:val="19"/>
+        </w:rPr>
+        <w:t xml:space="preserve">eleicoes-carga</w:t>
+      </w:r>
+      <w:r>
+        <w:t xml:space="preserve"> → Run workflow (publica o 1º turno), depois </w:t>
+      </w:r>
+      <w:r>
+        <w:rPr>
+          <w:rFonts w:ascii="Consolas" w:cs="Consolas" w:eastAsia="Consolas" w:hAnsi="Consolas"/>
+          <w:sz w:val="19"/>
+          <w:szCs w:val="19"/>
+        </w:rPr>
+        <w:t xml:space="preserve">portal-pages</w:t>
+      </w:r>
+      <w:r>
+        <w:t xml:space="preserve">. Na noite do 2º turno, </w:t>
+      </w:r>
+      <w:r>
+        <w:rPr>
+          <w:rFonts w:ascii="Consolas" w:cs="Consolas" w:eastAsia="Consolas" w:hAnsi="Consolas"/>
+          <w:sz w:val="19"/>
+          <w:szCs w:val="19"/>
+        </w:rPr>
+        <w:t xml:space="preserve">eleicoes-ao-vivo</w:t>
+      </w:r>
+      <w:r>
+        <w:t xml:space="preserve"> com </w:t>
+      </w:r>
+      <w:r>
+        <w:rPr>
+          <w:rFonts w:ascii="Consolas" w:cs="Consolas" w:eastAsia="Consolas" w:hAnsi="Consolas"/>
+          <w:sz w:val="19"/>
+          <w:szCs w:val="19"/>
+        </w:rPr>
+        <w:t xml:space="preserve">2026-2t-geral</w:t>
+      </w:r>
+      <w:r>
+        <w:t xml:space="preserve">, como na seção 9.4.</w:t>
+      </w:r>
+    </w:p>
+    <w:p>
+      <w:pPr>
+        <w:pStyle w:val="ListParagraph"/>
+        <w:numPr>
+          <w:ilvl w:val="0"/>
+          <w:numId w:val="9"/>
+        </w:numPr>
+        <w:spacing w:after="70"/>
+      </w:pPr>
+      <w:r>
+        <w:t xml:space="preserve">Durante a apuração, acompanhar a saída em Organization → Usage do Supabase. Se a cota se aproximar do fim, a saída é passar os feeds para o R2: os mesmos segredos com os valores do R2 e um novo </w:t>
+      </w:r>
+      <w:r>
+        <w:rPr>
+          <w:rFonts w:ascii="Consolas" w:cs="Consolas" w:eastAsia="Consolas" w:hAnsi="Consolas"/>
+          <w:sz w:val="19"/>
+          <w:szCs w:val="19"/>
+        </w:rPr>
+        <w:t xml:space="preserve">portal-pages</w:t>
+      </w:r>
+      <w:r>
+        <w:t xml:space="preserve"> com o endereço do R2.</w:t>
+      </w:r>
+    </w:p>
+    <w:tbl>
+      <w:tblPr>
+        <w:tblW w:type="dxa" w:w="9600"/>
+        <w:tblBorders>
+          <w:top w:val="single" w:color="C00000" w:sz="6"/>
+          <w:left w:val="single" w:color="C00000" w:sz="18"/>
+          <w:bottom w:val="single" w:color="C00000" w:sz="6"/>
+          <w:right w:val="single" w:color="C00000" w:sz="6"/>
+          <w:insideH w:val="none" w:color="FFFFFF" w:sz="0"/>
+          <w:insideV w:val="none" w:color="FFFFFF" w:sz="0"/>
+        </w:tblBorders>
+      </w:tblPr>
+      <w:tblGrid>
+        <w:gridCol w:w="9600"/>
+      </w:tblGrid>
+      <w:tr>
+        <w:trPr>
+          <w:cantSplit/>
+        </w:trPr>
+        <w:tc>
+          <w:tcPr>
+            <w:tcW w:type="dxa" w:w="9600"/>
+            <w:shd w:fill="FDEDED" w:val="clear"/>
+            <w:tcMar>
+              <w:top w:type="dxa" w:w="130"/>
+              <w:left w:type="dxa" w:w="170"/>
+              <w:bottom w:type="dxa" w:w="130"/>
+              <w:right w:type="dxa" w:w="150"/>
+            </w:tcMar>
+          </w:tcPr>
+          <w:p>
+            <w:pPr>
+              <w:spacing w:after="90"/>
+            </w:pPr>
+            <w:r>
+              <w:rPr>
+                <w:b/>
+                <w:bCs/>
+                <w:color w:val="000000"/>
+              </w:rPr>
+              <w:t xml:space="preserve">O que o Supabase não faz</w:t>
+            </w:r>
+          </w:p>
+          <w:p>
+            <w:pPr>
+              <w:spacing w:after="70"/>
+            </w:pPr>
+            <w:r>
+              <w:t xml:space="preserve">O armazenamento do Supabase não tem trava contra apagar e sobrescrever (Object Lock). Serve para os feeds, que são refeitos a partir das fontes; não serve para a prova (bronze), que continua exigindo o R2 com trava (ADR-018 e ADR-026).</w:t>
+            </w:r>
+          </w:p>
+        </w:tc>
+      </w:tr>
+    </w:tbl>
+    <w:p>
+      <w:pPr>
+        <w:pStyle w:val="Heading1"/>
+        <w:keepNext/>
+        <w:keepLines/>
+        <w:spacing w:after="160" w:before="380"/>
+      </w:pPr>
+      <w:r>
+        <w:t xml:space="preserve">10. Verificação</w:t>
+      </w:r>
+    </w:p>
+    <w:p>
+      <w:pPr>
+        <w:pStyle w:val="Heading2"/>
+        <w:keepNext/>
+        <w:keepLines/>
+        <w:spacing w:after="120" w:before="280"/>
+      </w:pPr>
+      <w:r>
+        <w:t xml:space="preserve">10.1 Testes automatizados</w:t>
+      </w:r>
+    </w:p>
+    <w:tbl>
+      <w:tblPr>
+        <w:tblW w:type="dxa" w:w="9600"/>
+        <w:tblBorders>
+          <w:top w:val="single" w:color="BFBFBF" w:sz="4"/>
+          <w:left w:val="single" w:color="BFBFBF" w:sz="4"/>
+          <w:bottom w:val="single" w:color="BFBFBF" w:sz="4"/>
+          <w:right w:val="single" w:color="BFBFBF" w:sz="4"/>
+          <w:insideH w:val="single" w:color="D9D9D9" w:sz="2"/>
+          <w:insideV w:val="single" w:color="D9D9D9" w:sz="2"/>
+        </w:tblBorders>
+      </w:tblPr>
+      <w:tblGrid>
+        <w:gridCol w:w="3000"/>
+        <w:gridCol w:w="1400"/>
+        <w:gridCol w:w="5200"/>
+      </w:tblGrid>
+      <w:tr>
+        <w:trPr>
+          <w:tblHeader/>
+        </w:trPr>
+        <w:tc>
+          <w:tcPr>
+            <w:tcW w:type="dxa" w:w="3000"/>
+            <w:shd w:fill="1F3864" w:val="clear"/>
+            <w:tcMar>
+              <w:top w:type="dxa" w:w="80"/>
+              <w:left w:type="dxa" w:w="110"/>
+              <w:bottom w:type="dxa" w:w="80"/>
+              <w:right w:type="dxa" w:w="110"/>
+            </w:tcMar>
+            <w:vAlign w:val="center"/>
+          </w:tcPr>
+          <w:p>
+            <w:pPr>
+              <w:spacing w:after="0"/>
+            </w:pPr>
+            <w:r>
+              <w:rPr>
+                <w:b/>
+                <w:bCs/>
+                <w:color w:val="FFFFFF"/>
+                <w:sz w:val="19"/>
+                <w:szCs w:val="19"/>
+              </w:rPr>
+              <w:t xml:space="preserve">Conjunto</w:t>
+            </w:r>
+          </w:p>
+        </w:tc>
+        <w:tc>
+          <w:tcPr>
+            <w:tcW w:type="dxa" w:w="1400"/>
+            <w:shd w:fill="1F3864" w:val="clear"/>
+            <w:tcMar>
+              <w:top w:type="dxa" w:w="80"/>
+              <w:left w:type="dxa" w:w="110"/>
+              <w:bottom w:type="dxa" w:w="80"/>
+              <w:right w:type="dxa" w:w="110"/>
+            </w:tcMar>
+            <w:vAlign w:val="center"/>
+          </w:tcPr>
+          <w:p>
+            <w:pPr>
+              <w:spacing w:after="0"/>
+            </w:pPr>
+            <w:r>
+              <w:rPr>
+                <w:b/>
+                <w:bCs/>
+                <w:color w:val="FFFFFF"/>
+                <w:sz w:val="19"/>
+                <w:szCs w:val="19"/>
+              </w:rPr>
+              <w:t xml:space="preserve">Quantidade</w:t>
+            </w:r>
+          </w:p>
+        </w:tc>
+        <w:tc>
+          <w:tcPr>
+            <w:tcW w:type="dxa" w:w="5200"/>
+            <w:shd w:fill="1F3864" w:val="clear"/>
+            <w:tcMar>
+              <w:top w:type="dxa" w:w="80"/>
+              <w:left w:type="dxa" w:w="110"/>
+              <w:bottom w:type="dxa" w:w="80"/>
+              <w:right w:type="dxa" w:w="110"/>
+            </w:tcMar>
+            <w:vAlign w:val="center"/>
+          </w:tcPr>
+          <w:p>
+            <w:pPr>
+              <w:spacing w:after="0"/>
+            </w:pPr>
+            <w:r>
+              <w:rPr>
+                <w:b/>
+                <w:bCs/>
+                <w:color w:val="FFFFFF"/>
+                <w:sz w:val="19"/>
+                <w:szCs w:val="19"/>
+              </w:rPr>
+              <w:t xml:space="preserve">O que cobre</w:t>
+            </w:r>
+          </w:p>
+        </w:tc>
+      </w:tr>
+      <w:tr>
+        <w:trPr>
+          <w:cantSplit/>
+        </w:trPr>
+        <w:tc>
+          <w:tcPr>
+            <w:tcW w:type="dxa" w:w="3000"/>
+            <w:shd w:fill="FFFFFF" w:val="clear"/>
+            <w:tcMar>
+              <w:top w:type="dxa" w:w="70"/>
+              <w:left w:type="dxa" w:w="110"/>
+              <w:bottom w:type="dxa" w:w="70"/>
+              <w:right w:type="dxa" w:w="110"/>
+            </w:tcMar>
+            <w:vAlign w:val="center"/>
+          </w:tcPr>
+          <w:p>
+            <w:pPr>
+              <w:spacing w:after="0"/>
+            </w:pPr>
+            <w:r>
+              <w:rPr>
+                <w:b w:val="false"/>
+                <w:bCs w:val="false"/>
+                <w:sz w:val="17"/>
+                <w:szCs w:val="17"/>
+              </w:rPr>
+              <w:t xml:space="preserve">packages/eleicoes/testes</w:t>
+            </w:r>
+          </w:p>
+        </w:tc>
+        <w:tc>
+          <w:tcPr>
+            <w:tcW w:type="dxa" w:w="1400"/>
+            <w:shd w:fill="FFFFFF" w:val="clear"/>
+            <w:tcMar>
+              <w:top w:type="dxa" w:w="70"/>
+              <w:left w:type="dxa" w:w="110"/>
+              <w:bottom w:type="dxa" w:w="70"/>
+              <w:right w:type="dxa" w:w="110"/>
+            </w:tcMar>
+            <w:vAlign w:val="center"/>
+          </w:tcPr>
+          <w:p>
+            <w:pPr>
+              <w:spacing w:after="0"/>
+            </w:pPr>
+            <w:r>
+              <w:rPr>
+                <w:b w:val="false"/>
+                <w:bCs w:val="false"/>
+                <w:sz w:val="17"/>
+                <w:szCs w:val="17"/>
+              </w:rPr>
+              <w:t xml:space="preserve">190</w:t>
+            </w:r>
+          </w:p>
+        </w:tc>
+        <w:tc>
+          <w:tcPr>
+            <w:tcW w:type="dxa" w:w="5200"/>
+            <w:shd w:fill="FFFFFF" w:val="clear"/>
+            <w:tcMar>
+              <w:top w:type="dxa" w:w="70"/>
+              <w:left w:type="dxa" w:w="110"/>
+              <w:bottom w:type="dxa" w:w="70"/>
+              <w:right w:type="dxa" w:w="110"/>
+            </w:tcMar>
+            <w:vAlign w:val="center"/>
+          </w:tcPr>
+          <w:p>
+            <w:pPr>
+              <w:spacing w:after="0"/>
+            </w:pPr>
+            <w:r>
+              <w:rPr>
+                <w:b w:val="false"/>
+                <w:bCs w:val="false"/>
+                <w:sz w:val="17"/>
+                <w:szCs w:val="17"/>
+              </w:rPr>
+              <w:t xml:space="preserve">Leitores do TSE com arquivos reais, dados abertos com CSV sintético nos cabeçalhos reais dos três layouts, eleições de 1933 a 1990 com linhas reais recortadas de seis anos, download retomável, coletor contra servidor local, feeds (amostra byte a byte), cadastro, malhas e referências embutidas, servidor, preparar de ponta a ponta (com retomada e erro num ano), publicação na nuvem contra um S3 em memória (só o que mudou, índice por último, retomada em outra máquina, prazo, falhas de restauração e de publicação), configuração (inclusive a região exigida pelo Supabase), medição dos feeds contra os limites gratuitos e CLI</w:t>
+            </w:r>
+          </w:p>
+        </w:tc>
+      </w:tr>
+      <w:tr>
+        <w:trPr>
+          <w:cantSplit/>
+        </w:trPr>
+        <w:tc>
+          <w:tcPr>
+            <w:tcW w:type="dxa" w:w="3000"/>
+            <w:shd w:fill="F2F2F2" w:val="clear"/>
+            <w:tcMar>
+              <w:top w:type="dxa" w:w="70"/>
+              <w:left w:type="dxa" w:w="110"/>
+              <w:bottom w:type="dxa" w:w="70"/>
+              <w:right w:type="dxa" w:w="110"/>
+            </w:tcMar>
+            <w:vAlign w:val="center"/>
+          </w:tcPr>
+          <w:p>
+            <w:pPr>
+              <w:spacing w:after="0"/>
+            </w:pPr>
+            <w:r>
+              <w:rPr>
+                <w:b w:val="false"/>
+                <w:bCs w:val="false"/>
+                <w:sz w:val="17"/>
+                <w:szCs w:val="17"/>
+              </w:rPr>
+              <w:t xml:space="preserve">packages/portal (vitest)</w:t>
+            </w:r>
+          </w:p>
+        </w:tc>
+        <w:tc>
+          <w:tcPr>
+            <w:tcW w:type="dxa" w:w="1400"/>
+            <w:shd w:fill="F2F2F2" w:val="clear"/>
+            <w:tcMar>
+              <w:top w:type="dxa" w:w="70"/>
+              <w:left w:type="dxa" w:w="110"/>
+              <w:bottom w:type="dxa" w:w="70"/>
+              <w:right w:type="dxa" w:w="110"/>
+            </w:tcMar>
+            <w:vAlign w:val="center"/>
+          </w:tcPr>
+          <w:p>
+            <w:pPr>
+              <w:spacing w:after="0"/>
+            </w:pPr>
+            <w:r>
+              <w:rPr>
+                <w:b w:val="false"/>
+                <w:bCs w:val="false"/>
+                <w:sz w:val="17"/>
+                <w:szCs w:val="17"/>
+              </w:rPr>
+              <w:t xml:space="preserve">79</w:t>
+            </w:r>
+          </w:p>
+        </w:tc>
+        <w:tc>
+          <w:tcPr>
+            <w:tcW w:type="dxa" w:w="5200"/>
+            <w:shd w:fill="F2F2F2" w:val="clear"/>
+            <w:tcMar>
+              <w:top w:type="dxa" w:w="70"/>
+              <w:left w:type="dxa" w:w="110"/>
+              <w:bottom w:type="dxa" w:w="70"/>
+              <w:right w:type="dxa" w:w="110"/>
+            </w:tcMar>
+            <w:vAlign w:val="center"/>
+          </w:tcPr>
+          <w:p>
+            <w:pPr>
+              <w:spacing w:after="0"/>
+            </w:pPr>
+            <w:r>
+              <w:rPr>
+                <w:b w:val="false"/>
+                <w:bCs w:val="false"/>
+                <w:sz w:val="17"/>
+                <w:szCs w:val="17"/>
+              </w:rPr>
+              <w:t xml:space="preserve">Decodificador TopoJSON, validação dos feeds lendo a amostra do Python (inclusive as eleições antigas), formatação, cores, busca, estado na URL, grupos do seletor, área do mapa ↔ parte e as contas do zoom</w:t>
+            </w:r>
+          </w:p>
+        </w:tc>
+      </w:tr>
+      <w:tr>
+        <w:trPr>
+          <w:cantSplit/>
+        </w:trPr>
+        <w:tc>
+          <w:tcPr>
+            <w:tcW w:type="dxa" w:w="3000"/>
+            <w:shd w:fill="FFFFFF" w:val="clear"/>
+            <w:tcMar>
+              <w:top w:type="dxa" w:w="70"/>
+              <w:left w:type="dxa" w:w="110"/>
+              <w:bottom w:type="dxa" w:w="70"/>
+              <w:right w:type="dxa" w:w="110"/>
+            </w:tcMar>
+            <w:vAlign w:val="center"/>
+          </w:tcPr>
+          <w:p>
+            <w:pPr>
+              <w:spacing w:after="0"/>
+            </w:pPr>
+            <w:r>
+              <w:rPr>
                 <w:b w:val="false"/>
                 <w:bCs w:val="false"/>
                 <w:sz w:val="17"/>
@@ -19348,7 +21210,7 @@
                 <w:sz w:val="17"/>
                 <w:szCs w:val="17"/>
               </w:rPr>
-              <w:t xml:space="preserve">721</w:t>
+              <w:t xml:space="preserve">844</w:t>
             </w:r>
           </w:p>
         </w:tc>
@@ -19375,7 +21237,7 @@
                 <w:sz w:val="17"/>
                 <w:szCs w:val="17"/>
               </w:rPr>
-              <w:t xml:space="preserve">Eleições e o resto do Lumen; cobertura mínima de 80% exigida no CI (96% na data deste documento)</w:t>
+              <w:t xml:space="preserve">Eleições e o resto do Lumen; cobertura mínima de 80% exigida no CI (97% na data deste documento)</w:t>
             </w:r>
           </w:p>
         </w:tc>
@@ -20102,7 +21964,7 @@
                 <w:sz w:val="17"/>
                 <w:szCs w:val="17"/>
               </w:rPr>
-              <w:t xml:space="preserve">Carga completa (1933 a 2024) na nuvem</w:t>
+              <w:t xml:space="preserve">Onde publicar o 2º turno de 2026</w:t>
             </w:r>
           </w:p>
         </w:tc>
@@ -20129,7 +21991,7 @@
                 <w:sz w:val="17"/>
                 <w:szCs w:val="17"/>
               </w:rPr>
-              <w:t xml:space="preserve">Fluxos prontos (seção 9.5); faltam a conta no Cloudflare e os segredos no GitHub</w:t>
+              <w:t xml:space="preserve">R2 com cartão (todas as eleições) ou Supabase Storage sem cartão (só 2026, seção 9.7); eleicoes-medir.yml mede o tamanho e a saída</w:t>
             </w:r>
           </w:p>
         </w:tc>
@@ -20156,7 +22018,7 @@
                 <w:sz w:val="17"/>
                 <w:szCs w:val="17"/>
               </w:rPr>
-              <w:t xml:space="preserve">Antes da publicação</w:t>
+              <w:t xml:space="preserve">Antes de 25/10/2026</w:t>
             </w:r>
           </w:p>
         </w:tc>
@@ -20188,7 +22050,7 @@
                 <w:sz w:val="17"/>
                 <w:szCs w:val="17"/>
               </w:rPr>
-              <w:t xml:space="preserve">Domínio próprio para o portal e os feeds</w:t>
+              <w:t xml:space="preserve">Carga completa (1933 a 2024) na nuvem</w:t>
             </w:r>
           </w:p>
         </w:tc>
@@ -20215,7 +22077,7 @@
                 <w:sz w:val="17"/>
                 <w:szCs w:val="17"/>
               </w:rPr>
-              <w:t xml:space="preserve">O endereço r2.dev tem limite de requisições (seção 9.6)</w:t>
+              <w:t xml:space="preserve">Fluxos prontos (seção 9.5); faltam a conta no Cloudflare e os segredos no GitHub</w:t>
             </w:r>
           </w:p>
         </w:tc>
@@ -20242,7 +22104,7 @@
                 <w:sz w:val="17"/>
                 <w:szCs w:val="17"/>
               </w:rPr>
-              <w:t xml:space="preserve">Antes da divulgação pública</w:t>
+              <w:t xml:space="preserve">Antes da publicação</w:t>
             </w:r>
           </w:p>
         </w:tc>
@@ -20274,7 +22136,7 @@
                 <w:sz w:val="17"/>
                 <w:szCs w:val="17"/>
               </w:rPr>
-              <w:t xml:space="preserve">Malhas históricas para as UFs da época</w:t>
+              <w:t xml:space="preserve">Domínio próprio para o portal e os feeds</w:t>
             </w:r>
           </w:p>
         </w:tc>
@@ -20301,7 +22163,7 @@
                 <w:sz w:val="17"/>
                 <w:szCs w:val="17"/>
               </w:rPr>
-              <w:t xml:space="preserve">Guanabara, o Distrito Federal antigo e os territórios aparecem só como botões; a API de malhas do IBGE não tem as fronteiras antigas</w:t>
+              <w:t xml:space="preserve">O endereço r2.dev tem limite de requisições (seção 9.6)</w:t>
             </w:r>
           </w:p>
         </w:tc>
@@ -20328,7 +22190,7 @@
                 <w:sz w:val="17"/>
                 <w:szCs w:val="17"/>
               </w:rPr>
-              <w:t xml:space="preserve">Quando houver fonte oficial</w:t>
+              <w:t xml:space="preserve">Antes da divulgação pública</w:t>
             </w:r>
           </w:p>
         </w:tc>
@@ -20360,7 +22222,7 @@
                 <w:sz w:val="17"/>
                 <w:szCs w:val="17"/>
               </w:rPr>
-              <w:t xml:space="preserve">Ensaio geral com a simulação em infraestrutura real (CDN)</w:t>
+              <w:t xml:space="preserve">Malhas históricas para as UFs da época</w:t>
             </w:r>
           </w:p>
         </w:tc>
@@ -20387,7 +22249,7 @@
                 <w:sz w:val="17"/>
                 <w:szCs w:val="17"/>
               </w:rPr>
-              <w:t xml:space="preserve">Medir a latência entre a gravação do feed e a tela</w:t>
+              <w:t xml:space="preserve">Guanabara, o Distrito Federal antigo e os territórios aparecem só como botões; a API de malhas do IBGE não tem as fronteiras antigas</w:t>
             </w:r>
           </w:p>
         </w:tc>
@@ -20414,7 +22276,7 @@
                 <w:sz w:val="17"/>
                 <w:szCs w:val="17"/>
               </w:rPr>
-              <w:t xml:space="preserve">Antes do 2º turno de 2026 e de cada pleito</w:t>
+              <w:t xml:space="preserve">Quando houver fonte oficial</w:t>
             </w:r>
           </w:p>
         </w:tc>
@@ -20446,7 +22308,7 @@
                 <w:sz w:val="17"/>
                 <w:szCs w:val="17"/>
               </w:rPr>
-              <w:t xml:space="preserve">Eleições suplementares e consultas</w:t>
+              <w:t xml:space="preserve">Ensaio geral com a simulação em infraestrutura real (CDN)</w:t>
             </w:r>
           </w:p>
         </w:tc>
@@ -20473,7 +22335,7 @@
                 <w:sz w:val="17"/>
                 <w:szCs w:val="17"/>
               </w:rPr>
-              <w:t xml:space="preserve">Aparecem no catálogo, mas não estão nos testes</w:t>
+              <w:t xml:space="preserve">Medir a latência entre a gravação do feed e a tela</w:t>
             </w:r>
           </w:p>
         </w:tc>
@@ -20500,7 +22362,7 @@
                 <w:sz w:val="17"/>
                 <w:szCs w:val="17"/>
               </w:rPr>
-              <w:t xml:space="preserve">Após a carga histórica</w:t>
+              <w:t xml:space="preserve">Antes do 2º turno de 2026 e de cada pleito</w:t>
             </w:r>
           </w:p>
         </w:tc>
@@ -20532,7 +22394,7 @@
                 <w:sz w:val="17"/>
                 <w:szCs w:val="17"/>
               </w:rPr>
-              <w:t xml:space="preserve">Capturas de tela de referência no CI</w:t>
+              <w:t xml:space="preserve">Eleições suplementares e consultas</w:t>
             </w:r>
           </w:p>
         </w:tc>
@@ -20559,7 +22421,7 @@
                 <w:sz w:val="17"/>
                 <w:szCs w:val="17"/>
               </w:rPr>
-              <w:t xml:space="preserve">Hoje a conferência visual é manual (seção 10.2)</w:t>
+              <w:t xml:space="preserve">Aparecem no catálogo, mas não estão nos testes</w:t>
             </w:r>
           </w:p>
         </w:tc>
@@ -20586,7 +22448,7 @@
                 <w:sz w:val="17"/>
                 <w:szCs w:val="17"/>
               </w:rPr>
-              <w:t xml:space="preserve">Fase 1</w:t>
+              <w:t xml:space="preserve">Após a carga histórica</w:t>
             </w:r>
           </w:p>
         </w:tc>
@@ -20618,7 +22480,7 @@
                 <w:sz w:val="17"/>
                 <w:szCs w:val="17"/>
               </w:rPr>
-              <w:t xml:space="preserve">Política de retenção dos ZIPs</w:t>
+              <w:t xml:space="preserve">Capturas de tela de referência no CI</w:t>
             </w:r>
           </w:p>
         </w:tc>
@@ -20645,7 +22507,7 @@
                 <w:sz w:val="17"/>
                 <w:szCs w:val="17"/>
               </w:rPr>
-              <w:t xml:space="preserve">Ocupam espaço fora do armazenamento de objetos (ADR-021)</w:t>
+              <w:t xml:space="preserve">Hoje a conferência visual é manual (seção 10.2)</w:t>
             </w:r>
           </w:p>
         </w:tc>
@@ -20672,7 +22534,7 @@
                 <w:sz w:val="17"/>
                 <w:szCs w:val="17"/>
               </w:rPr>
-              <w:t xml:space="preserve">Junto com a política do bronze</w:t>
+              <w:t xml:space="preserve">Fase 1</w:t>
             </w:r>
           </w:p>
         </w:tc>
@@ -20704,7 +22566,7 @@
                 <w:sz w:val="17"/>
                 <w:szCs w:val="17"/>
               </w:rPr>
-              <w:t xml:space="preserve">Contexto eleitoral nas telas de contratação (família K)</w:t>
+              <w:t xml:space="preserve">Política de retenção dos ZIPs</w:t>
             </w:r>
           </w:p>
         </w:tc>
@@ -20731,7 +22593,7 @@
                 <w:sz w:val="17"/>
                 <w:szCs w:val="17"/>
               </w:rPr>
-              <w:t xml:space="preserve">ADR-024</w:t>
+              <w:t xml:space="preserve">Ocupam espaço fora do armazenamento de objetos (ADR-021)</w:t>
             </w:r>
           </w:p>
         </w:tc>
@@ -20758,7 +22620,7 @@
                 <w:sz w:val="17"/>
                 <w:szCs w:val="17"/>
               </w:rPr>
-              <w:t xml:space="preserve">Fase 2</w:t>
+              <w:t xml:space="preserve">Junto com a política do bronze</w:t>
             </w:r>
           </w:p>
         </w:tc>
@@ -20790,6 +22652,92 @@
                 <w:sz w:val="17"/>
                 <w:szCs w:val="17"/>
               </w:rPr>
+              <w:t xml:space="preserve">Contexto eleitoral nas telas de contratação (família K)</w:t>
+            </w:r>
+          </w:p>
+        </w:tc>
+        <w:tc>
+          <w:tcPr>
+            <w:tcW w:type="dxa" w:w="4300"/>
+            <w:shd w:fill="FFFFFF" w:val="clear"/>
+            <w:tcMar>
+              <w:top w:type="dxa" w:w="70"/>
+              <w:left w:type="dxa" w:w="110"/>
+              <w:bottom w:type="dxa" w:w="70"/>
+              <w:right w:type="dxa" w:w="110"/>
+            </w:tcMar>
+            <w:vAlign w:val="center"/>
+          </w:tcPr>
+          <w:p>
+            <w:pPr>
+              <w:spacing w:after="0"/>
+            </w:pPr>
+            <w:r>
+              <w:rPr>
+                <w:b w:val="false"/>
+                <w:bCs w:val="false"/>
+                <w:sz w:val="17"/>
+                <w:szCs w:val="17"/>
+              </w:rPr>
+              <w:t xml:space="preserve">ADR-024</w:t>
+            </w:r>
+          </w:p>
+        </w:tc>
+        <w:tc>
+          <w:tcPr>
+            <w:tcW w:type="dxa" w:w="1700"/>
+            <w:shd w:fill="FFFFFF" w:val="clear"/>
+            <w:tcMar>
+              <w:top w:type="dxa" w:w="70"/>
+              <w:left w:type="dxa" w:w="110"/>
+              <w:bottom w:type="dxa" w:w="70"/>
+              <w:right w:type="dxa" w:w="110"/>
+            </w:tcMar>
+            <w:vAlign w:val="center"/>
+          </w:tcPr>
+          <w:p>
+            <w:pPr>
+              <w:spacing w:after="0"/>
+            </w:pPr>
+            <w:r>
+              <w:rPr>
+                <w:b w:val="false"/>
+                <w:bCs w:val="false"/>
+                <w:sz w:val="17"/>
+                <w:szCs w:val="17"/>
+              </w:rPr>
+              <w:t xml:space="preserve">Fase 2</w:t>
+            </w:r>
+          </w:p>
+        </w:tc>
+      </w:tr>
+      <w:tr>
+        <w:trPr>
+          <w:cantSplit/>
+        </w:trPr>
+        <w:tc>
+          <w:tcPr>
+            <w:tcW w:type="dxa" w:w="3600"/>
+            <w:shd w:fill="F2F2F2" w:val="clear"/>
+            <w:tcMar>
+              <w:top w:type="dxa" w:w="70"/>
+              <w:left w:type="dxa" w:w="110"/>
+              <w:bottom w:type="dxa" w:w="70"/>
+              <w:right w:type="dxa" w:w="110"/>
+            </w:tcMar>
+            <w:vAlign w:val="center"/>
+          </w:tcPr>
+          <w:p>
+            <w:pPr>
+              <w:spacing w:after="0"/>
+            </w:pPr>
+            <w:r>
+              <w:rPr>
+                <w:b w:val="false"/>
+                <w:bCs w:val="false"/>
+                <w:sz w:val="17"/>
+                <w:szCs w:val="17"/>
+              </w:rPr>
               <w:t xml:space="preserve">Prestação de contas de campanha (conector)</w:t>
             </w:r>
           </w:p>
@@ -20797,7 +22745,7 @@
         <w:tc>
           <w:tcPr>
             <w:tcW w:type="dxa" w:w="4300"/>
-            <w:shd w:fill="FFFFFF" w:val="clear"/>
+            <w:shd w:fill="F2F2F2" w:val="clear"/>
             <w:tcMar>
               <w:top w:type="dxa" w:w="70"/>
               <w:left w:type="dxa" w:w="110"/>
@@ -20824,7 +22772,7 @@
         <w:tc>
           <w:tcPr>
             <w:tcW w:type="dxa" w:w="1700"/>
-            <w:shd w:fill="FFFFFF" w:val="clear"/>
+            <w:shd w:fill="F2F2F2" w:val="clear"/>
             <w:tcMar>
               <w:top w:type="dxa" w:w="70"/>
               <w:left w:type="dxa" w:w="110"/>
@@ -21682,7 +23630,7 @@
                 <w:sz w:val="17"/>
                 <w:szCs w:val="17"/>
               </w:rPr>
-              <w:t xml:space="preserve">Chave do R2 vazada</w:t>
+              <w:t xml:space="preserve">Cota de saída do Supabase gratuito esgotada na noite da eleição (seção 9.7)</w:t>
             </w:r>
           </w:p>
         </w:tc>
@@ -21709,7 +23657,7 @@
                 <w:sz w:val="17"/>
                 <w:szCs w:val="17"/>
               </w:rPr>
-              <w:t xml:space="preserve">Escrita indevida nos feeds publicados</w:t>
+              <w:t xml:space="preserve">Feeds restringidos até o mês seguinte</w:t>
             </w:r>
           </w:p>
         </w:tc>
@@ -21736,7 +23684,7 @@
                 <w:sz w:val="17"/>
                 <w:szCs w:val="17"/>
               </w:rPr>
-              <w:t xml:space="preserve">Token restrito aos dois buckets, guardado só em segredos do GitHub; revogar e trocar</w:t>
+              <w:t xml:space="preserve">Medir antes com eleicoes-medir.yml; acompanhar o uso durante a apuração; passar para o R2 trocando segredos e o endereço do portal</w:t>
             </w:r>
           </w:p>
         </w:tc>
@@ -21768,7 +23716,7 @@
                 <w:sz w:val="17"/>
                 <w:szCs w:val="17"/>
               </w:rPr>
-              <w:t xml:space="preserve">Leitura indevida do mapa como mensagem partidária</w:t>
+              <w:t xml:space="preserve">Chave do R2 vazada</w:t>
             </w:r>
           </w:p>
         </w:tc>
@@ -21795,7 +23743,7 @@
                 <w:sz w:val="17"/>
                 <w:szCs w:val="17"/>
               </w:rPr>
-              <w:t xml:space="preserve">Dano à neutralidade do projeto</w:t>
+              <w:t xml:space="preserve">Escrita indevida nos feeds publicados</w:t>
             </w:r>
           </w:p>
         </w:tc>
@@ -21822,7 +23770,7 @@
                 <w:sz w:val="17"/>
                 <w:szCs w:val="17"/>
               </w:rPr>
-              <w:t xml:space="preserve">Cor por posição, nunca por partido; tabela sempre ao lado</w:t>
+              <w:t xml:space="preserve">Token restrito aos dois buckets, guardado só em segredos do GitHub; revogar e trocar</w:t>
             </w:r>
           </w:p>
         </w:tc>
@@ -21854,6 +23802,92 @@
                 <w:sz w:val="17"/>
                 <w:szCs w:val="17"/>
               </w:rPr>
+              <w:t xml:space="preserve">Leitura indevida do mapa como mensagem partidária</w:t>
+            </w:r>
+          </w:p>
+        </w:tc>
+        <w:tc>
+          <w:tcPr>
+            <w:tcW w:type="dxa" w:w="3200"/>
+            <w:shd w:fill="FFFFFF" w:val="clear"/>
+            <w:tcMar>
+              <w:top w:type="dxa" w:w="70"/>
+              <w:left w:type="dxa" w:w="110"/>
+              <w:bottom w:type="dxa" w:w="70"/>
+              <w:right w:type="dxa" w:w="110"/>
+            </w:tcMar>
+            <w:vAlign w:val="center"/>
+          </w:tcPr>
+          <w:p>
+            <w:pPr>
+              <w:spacing w:after="0"/>
+            </w:pPr>
+            <w:r>
+              <w:rPr>
+                <w:b w:val="false"/>
+                <w:bCs w:val="false"/>
+                <w:sz w:val="17"/>
+                <w:szCs w:val="17"/>
+              </w:rPr>
+              <w:t xml:space="preserve">Dano à neutralidade do projeto</w:t>
+            </w:r>
+          </w:p>
+        </w:tc>
+        <w:tc>
+          <w:tcPr>
+            <w:tcW w:type="dxa" w:w="3500"/>
+            <w:shd w:fill="FFFFFF" w:val="clear"/>
+            <w:tcMar>
+              <w:top w:type="dxa" w:w="70"/>
+              <w:left w:type="dxa" w:w="110"/>
+              <w:bottom w:type="dxa" w:w="70"/>
+              <w:right w:type="dxa" w:w="110"/>
+            </w:tcMar>
+            <w:vAlign w:val="center"/>
+          </w:tcPr>
+          <w:p>
+            <w:pPr>
+              <w:spacing w:after="0"/>
+            </w:pPr>
+            <w:r>
+              <w:rPr>
+                <w:b w:val="false"/>
+                <w:bCs w:val="false"/>
+                <w:sz w:val="17"/>
+                <w:szCs w:val="17"/>
+              </w:rPr>
+              <w:t xml:space="preserve">Cor por posição, nunca por partido; tabela sempre ao lado</w:t>
+            </w:r>
+          </w:p>
+        </w:tc>
+      </w:tr>
+      <w:tr>
+        <w:trPr>
+          <w:cantSplit/>
+        </w:trPr>
+        <w:tc>
+          <w:tcPr>
+            <w:tcW w:type="dxa" w:w="2900"/>
+            <w:shd w:fill="F2F2F2" w:val="clear"/>
+            <w:tcMar>
+              <w:top w:type="dxa" w:w="70"/>
+              <w:left w:type="dxa" w:w="110"/>
+              <w:bottom w:type="dxa" w:w="70"/>
+              <w:right w:type="dxa" w:w="110"/>
+            </w:tcMar>
+            <w:vAlign w:val="center"/>
+          </w:tcPr>
+          <w:p>
+            <w:pPr>
+              <w:spacing w:after="0"/>
+            </w:pPr>
+            <w:r>
+              <w:rPr>
+                <w:b w:val="false"/>
+                <w:bCs w:val="false"/>
+                <w:sz w:val="17"/>
+                <w:szCs w:val="17"/>
+              </w:rPr>
               <w:t xml:space="preserve">Aproximação indevida entre eleição e contratação</w:t>
             </w:r>
           </w:p>
@@ -21861,7 +23895,7 @@
         <w:tc>
           <w:tcPr>
             <w:tcW w:type="dxa" w:w="3200"/>
-            <w:shd w:fill="FFFFFF" w:val="clear"/>
+            <w:shd w:fill="F2F2F2" w:val="clear"/>
             <w:tcMar>
               <w:top w:type="dxa" w:w="70"/>
               <w:left w:type="dxa" w:w="110"/>
@@ -21888,7 +23922,7 @@
         <w:tc>
           <w:tcPr>
             <w:tcW w:type="dxa" w:w="3500"/>
-            <w:shd w:fill="FFFFFF" w:val="clear"/>
+            <w:shd w:fill="F2F2F2" w:val="clear"/>
             <w:tcMar>
               <w:top w:type="dxa" w:w="70"/>
               <w:left w:type="dxa" w:w="110"/>
@@ -22927,6 +24961,12 @@
     </w:lvlOverride>
   </w:num>
   <w:num w:numId="8">
+    <w:abstractNumId w:val="3"/>
+    <w:lvlOverride w:ilvl="0">
+      <w:startOverride w:val="1"/>
+    </w:lvlOverride>
+  </w:num>
+  <w:num w:numId="9">
     <w:abstractNumId w:val="3"/>
     <w:lvlOverride w:ilvl="0">
       <w:startOverride w:val="1"/>

</xml_diff>

<commit_message>
DOC-12 regerado (medição dos feeds de 2026)
</commit_message>
<xml_diff>
--- a/docs/DOC-12_Eleicoes.docx
+++ b/docs/DOC-12_Eleicoes.docx
@@ -19819,6 +19819,411 @@
     </w:p>
     <w:p>
       <w:pPr>
+        <w:spacing w:after="120"/>
+      </w:pPr>
+      <w:r>
+        <w:t xml:space="preserve">A primeira medição (13 de outubro de 2026, 1h06 de execução) deu o tamanho do 1º turno de 2026 completo:</w:t>
+      </w:r>
+    </w:p>
+    <w:tbl>
+      <w:tblPr>
+        <w:tblW w:type="dxa" w:w="9600"/>
+        <w:tblBorders>
+          <w:top w:val="single" w:color="BFBFBF" w:sz="4"/>
+          <w:left w:val="single" w:color="BFBFBF" w:sz="4"/>
+          <w:bottom w:val="single" w:color="BFBFBF" w:sz="4"/>
+          <w:right w:val="single" w:color="BFBFBF" w:sz="4"/>
+          <w:insideH w:val="single" w:color="D9D9D9" w:sz="2"/>
+          <w:insideV w:val="single" w:color="D9D9D9" w:sz="2"/>
+        </w:tblBorders>
+      </w:tblPr>
+      <w:tblGrid>
+        <w:gridCol w:w="4800"/>
+        <w:gridCol w:w="4800"/>
+      </w:tblGrid>
+      <w:tr>
+        <w:trPr>
+          <w:tblHeader/>
+        </w:trPr>
+        <w:tc>
+          <w:tcPr>
+            <w:tcW w:type="dxa" w:w="4800"/>
+            <w:shd w:fill="1F3864" w:val="clear"/>
+            <w:tcMar>
+              <w:top w:type="dxa" w:w="80"/>
+              <w:left w:type="dxa" w:w="110"/>
+              <w:bottom w:type="dxa" w:w="80"/>
+              <w:right w:type="dxa" w:w="110"/>
+            </w:tcMar>
+            <w:vAlign w:val="center"/>
+          </w:tcPr>
+          <w:p>
+            <w:pPr>
+              <w:spacing w:after="0"/>
+            </w:pPr>
+            <w:r>
+              <w:rPr>
+                <w:b/>
+                <w:bCs/>
+                <w:color w:val="FFFFFF"/>
+                <w:sz w:val="19"/>
+                <w:szCs w:val="19"/>
+              </w:rPr>
+              <w:t xml:space="preserve">Medida</w:t>
+            </w:r>
+          </w:p>
+        </w:tc>
+        <w:tc>
+          <w:tcPr>
+            <w:tcW w:type="dxa" w:w="4800"/>
+            <w:shd w:fill="1F3864" w:val="clear"/>
+            <w:tcMar>
+              <w:top w:type="dxa" w:w="80"/>
+              <w:left w:type="dxa" w:w="110"/>
+              <w:bottom w:type="dxa" w:w="80"/>
+              <w:right w:type="dxa" w:w="110"/>
+            </w:tcMar>
+            <w:vAlign w:val="center"/>
+          </w:tcPr>
+          <w:p>
+            <w:pPr>
+              <w:spacing w:after="0"/>
+            </w:pPr>
+            <w:r>
+              <w:rPr>
+                <w:b/>
+                <w:bCs/>
+                <w:color w:val="FFFFFF"/>
+                <w:sz w:val="19"/>
+                <w:szCs w:val="19"/>
+              </w:rPr>
+              <w:t xml:space="preserve">Valor</w:t>
+            </w:r>
+          </w:p>
+        </w:tc>
+      </w:tr>
+      <w:tr>
+        <w:trPr>
+          <w:cantSplit/>
+        </w:trPr>
+        <w:tc>
+          <w:tcPr>
+            <w:tcW w:type="dxa" w:w="4800"/>
+            <w:shd w:fill="FFFFFF" w:val="clear"/>
+            <w:tcMar>
+              <w:top w:type="dxa" w:w="70"/>
+              <w:left w:type="dxa" w:w="110"/>
+              <w:bottom w:type="dxa" w:w="70"/>
+              <w:right w:type="dxa" w:w="110"/>
+            </w:tcMar>
+            <w:vAlign w:val="center"/>
+          </w:tcPr>
+          <w:p>
+            <w:pPr>
+              <w:spacing w:after="0"/>
+            </w:pPr>
+            <w:r>
+              <w:rPr>
+                <w:b/>
+                <w:bCs/>
+                <w:sz w:val="17"/>
+                <w:szCs w:val="17"/>
+              </w:rPr>
+              <w:t xml:space="preserve">Arquivos</w:t>
+            </w:r>
+          </w:p>
+        </w:tc>
+        <w:tc>
+          <w:tcPr>
+            <w:tcW w:type="dxa" w:w="4800"/>
+            <w:shd w:fill="FFFFFF" w:val="clear"/>
+            <w:tcMar>
+              <w:top w:type="dxa" w:w="70"/>
+              <w:left w:type="dxa" w:w="110"/>
+              <w:bottom w:type="dxa" w:w="70"/>
+              <w:right w:type="dxa" w:w="110"/>
+            </w:tcMar>
+            <w:vAlign w:val="center"/>
+          </w:tcPr>
+          <w:p>
+            <w:pPr>
+              <w:spacing w:after="0"/>
+            </w:pPr>
+            <w:r>
+              <w:rPr>
+                <w:b w:val="false"/>
+                <w:bCs w:val="false"/>
+                <w:sz w:val="17"/>
+                <w:szCs w:val="17"/>
+              </w:rPr>
+              <w:t xml:space="preserve">17.653 (17.127 feeds do 1º turno, 496 fotos, 28 malhas, índice e cadastro)</w:t>
+            </w:r>
+          </w:p>
+        </w:tc>
+      </w:tr>
+      <w:tr>
+        <w:trPr>
+          <w:cantSplit/>
+        </w:trPr>
+        <w:tc>
+          <w:tcPr>
+            <w:tcW w:type="dxa" w:w="4800"/>
+            <w:shd w:fill="F2F2F2" w:val="clear"/>
+            <w:tcMar>
+              <w:top w:type="dxa" w:w="70"/>
+              <w:left w:type="dxa" w:w="110"/>
+              <w:bottom w:type="dxa" w:w="70"/>
+              <w:right w:type="dxa" w:w="110"/>
+            </w:tcMar>
+            <w:vAlign w:val="center"/>
+          </w:tcPr>
+          <w:p>
+            <w:pPr>
+              <w:spacing w:after="0"/>
+            </w:pPr>
+            <w:r>
+              <w:rPr>
+                <w:b/>
+                <w:bCs/>
+                <w:sz w:val="17"/>
+                <w:szCs w:val="17"/>
+              </w:rPr>
+              <w:t xml:space="preserve">Tamanho</w:t>
+            </w:r>
+          </w:p>
+        </w:tc>
+        <w:tc>
+          <w:tcPr>
+            <w:tcW w:type="dxa" w:w="4800"/>
+            <w:shd w:fill="F2F2F2" w:val="clear"/>
+            <w:tcMar>
+              <w:top w:type="dxa" w:w="70"/>
+              <w:left w:type="dxa" w:w="110"/>
+              <w:bottom w:type="dxa" w:w="70"/>
+              <w:right w:type="dxa" w:w="110"/>
+            </w:tcMar>
+            <w:vAlign w:val="center"/>
+          </w:tcPr>
+          <w:p>
+            <w:pPr>
+              <w:spacing w:after="0"/>
+            </w:pPr>
+            <w:r>
+              <w:rPr>
+                <w:b w:val="false"/>
+                <w:bCs w:val="false"/>
+                <w:sz w:val="17"/>
+                <w:szCs w:val="17"/>
+              </w:rPr>
+              <w:t xml:space="preserve">112,9 MB (35,4 MB com gzip): 11% do 1 GB gratuito</w:t>
+            </w:r>
+          </w:p>
+        </w:tc>
+      </w:tr>
+      <w:tr>
+        <w:trPr>
+          <w:cantSplit/>
+        </w:trPr>
+        <w:tc>
+          <w:tcPr>
+            <w:tcW w:type="dxa" w:w="4800"/>
+            <w:shd w:fill="FFFFFF" w:val="clear"/>
+            <w:tcMar>
+              <w:top w:type="dxa" w:w="70"/>
+              <w:left w:type="dxa" w:w="110"/>
+              <w:bottom w:type="dxa" w:w="70"/>
+              <w:right w:type="dxa" w:w="110"/>
+            </w:tcMar>
+            <w:vAlign w:val="center"/>
+          </w:tcPr>
+          <w:p>
+            <w:pPr>
+              <w:spacing w:after="0"/>
+            </w:pPr>
+            <w:r>
+              <w:rPr>
+                <w:b/>
+                <w:bCs/>
+                <w:sz w:val="17"/>
+                <w:szCs w:val="17"/>
+              </w:rPr>
+              <w:t xml:space="preserve">Maior arquivo</w:t>
+            </w:r>
+          </w:p>
+        </w:tc>
+        <w:tc>
+          <w:tcPr>
+            <w:tcW w:type="dxa" w:w="4800"/>
+            <w:shd w:fill="FFFFFF" w:val="clear"/>
+            <w:tcMar>
+              <w:top w:type="dxa" w:w="70"/>
+              <w:left w:type="dxa" w:w="110"/>
+              <w:bottom w:type="dxa" w:w="70"/>
+              <w:right w:type="dxa" w:w="110"/>
+            </w:tcMar>
+            <w:vAlign w:val="center"/>
+          </w:tcPr>
+          <w:p>
+            <w:pPr>
+              <w:spacing w:after="0"/>
+            </w:pPr>
+            <w:r>
+              <w:rPr>
+                <w:b w:val="false"/>
+                <w:bCs w:val="false"/>
+                <w:sz w:val="17"/>
+                <w:szCs w:val="17"/>
+              </w:rPr>
+              <w:t xml:space="preserve">municipios.json, 615 kB (125 kB com gzip), abaixo do limite de 50 MB</w:t>
+            </w:r>
+          </w:p>
+        </w:tc>
+      </w:tr>
+      <w:tr>
+        <w:trPr>
+          <w:cantSplit/>
+        </w:trPr>
+        <w:tc>
+          <w:tcPr>
+            <w:tcW w:type="dxa" w:w="4800"/>
+            <w:shd w:fill="F2F2F2" w:val="clear"/>
+            <w:tcMar>
+              <w:top w:type="dxa" w:w="70"/>
+              <w:left w:type="dxa" w:w="110"/>
+              <w:bottom w:type="dxa" w:w="70"/>
+              <w:right w:type="dxa" w:w="110"/>
+            </w:tcMar>
+            <w:vAlign w:val="center"/>
+          </w:tcPr>
+          <w:p>
+            <w:pPr>
+              <w:spacing w:after="0"/>
+            </w:pPr>
+            <w:r>
+              <w:rPr>
+                <w:b/>
+                <w:bCs/>
+                <w:sz w:val="17"/>
+                <w:szCs w:val="17"/>
+              </w:rPr>
+              <w:t xml:space="preserve">Visão Brasil, pior caso</w:t>
+            </w:r>
+          </w:p>
+        </w:tc>
+        <w:tc>
+          <w:tcPr>
+            <w:tcW w:type="dxa" w:w="4800"/>
+            <w:shd w:fill="F2F2F2" w:val="clear"/>
+            <w:tcMar>
+              <w:top w:type="dxa" w:w="70"/>
+              <w:left w:type="dxa" w:w="110"/>
+              <w:bottom w:type="dxa" w:w="70"/>
+              <w:right w:type="dxa" w:w="110"/>
+            </w:tcMar>
+            <w:vAlign w:val="center"/>
+          </w:tcPr>
+          <w:p>
+            <w:pPr>
+              <w:spacing w:after="0"/>
+            </w:pPr>
+            <w:r>
+              <w:rPr>
+                <w:b w:val="false"/>
+                <w:bCs w:val="false"/>
+                <w:sz w:val="17"/>
+                <w:szCs w:val="17"/>
+              </w:rPr>
+              <w:t xml:space="preserve">Feed de presidente de 3,3 kB com gzip: cerca de 1 MB por visitante e hora, perto de 5.000 horas-visitante na cota</w:t>
+            </w:r>
+          </w:p>
+        </w:tc>
+      </w:tr>
+      <w:tr>
+        <w:trPr>
+          <w:cantSplit/>
+        </w:trPr>
+        <w:tc>
+          <w:tcPr>
+            <w:tcW w:type="dxa" w:w="4800"/>
+            <w:shd w:fill="FFFFFF" w:val="clear"/>
+            <w:tcMar>
+              <w:top w:type="dxa" w:w="70"/>
+              <w:left w:type="dxa" w:w="110"/>
+              <w:bottom w:type="dxa" w:w="70"/>
+              <w:right w:type="dxa" w:w="110"/>
+            </w:tcMar>
+            <w:vAlign w:val="center"/>
+          </w:tcPr>
+          <w:p>
+            <w:pPr>
+              <w:spacing w:after="0"/>
+            </w:pPr>
+            <w:r>
+              <w:rPr>
+                <w:b/>
+                <w:bCs/>
+                <w:sz w:val="17"/>
+                <w:szCs w:val="17"/>
+              </w:rPr>
+              <w:t xml:space="preserve">Visão de um estado grande, pior caso</w:t>
+            </w:r>
+          </w:p>
+        </w:tc>
+        <w:tc>
+          <w:tcPr>
+            <w:tcW w:type="dxa" w:w="4800"/>
+            <w:shd w:fill="FFFFFF" w:val="clear"/>
+            <w:tcMar>
+              <w:top w:type="dxa" w:w="70"/>
+              <w:left w:type="dxa" w:w="110"/>
+              <w:bottom w:type="dxa" w:w="70"/>
+              <w:right w:type="dxa" w:w="110"/>
+            </w:tcMar>
+            <w:vAlign w:val="center"/>
+          </w:tcPr>
+          <w:p>
+            <w:pPr>
+              <w:spacing w:after="0"/>
+            </w:pPr>
+            <w:r>
+              <w:rPr>
+                <w:b w:val="false"/>
+                <w:bCs w:val="false"/>
+                <w:sz w:val="17"/>
+                <w:szCs w:val="17"/>
+              </w:rPr>
+              <w:t xml:space="preserve">Feed de presidente em MG de 34 kB com gzip: cerca de 9 MB por visitante e hora, perto de 550 horas-visitante</w:t>
+            </w:r>
+          </w:p>
+        </w:tc>
+      </w:tr>
+    </w:tbl>
+    <w:p>
+      <w:pPr>
+        <w:spacing w:after="80"/>
+      </w:pPr>
+    </w:p>
+    <w:p>
+      <w:pPr>
+        <w:spacing w:after="120"/>
+      </w:pPr>
+      <w:r>
+        <w:t xml:space="preserve">Recomendação para o 2º turno de 2026: o Supabase, gratuito sem meio de pagamento, que ao fim da cota para de servir em vez de cobrar. O R2 fica para quando o portal for divulgado ou precisar das eleições antigas. </w:t>
+      </w:r>
+      <w:r>
+        <w:rPr>
+          <w:rFonts w:ascii="Consolas" w:cs="Consolas" w:eastAsia="Consolas" w:hAnsi="Consolas"/>
+          <w:sz w:val="19"/>
+          <w:szCs w:val="19"/>
+        </w:rPr>
+        <w:t xml:space="preserve">lumen eleicoes medir</w:t>
+      </w:r>
+      <w:r>
+        <w:t xml:space="preserve"> passou a estimar também a visão do estado mais pesado.</w:t>
+      </w:r>
+    </w:p>
+    <w:p>
+      <w:pPr>
         <w:pStyle w:val="Heading3"/>
         <w:keepNext/>
         <w:keepLines/>
@@ -21038,7 +21443,7 @@
                 <w:sz w:val="17"/>
                 <w:szCs w:val="17"/>
               </w:rPr>
-              <w:t xml:space="preserve">190</w:t>
+              <w:t xml:space="preserve">192</w:t>
             </w:r>
           </w:p>
         </w:tc>
@@ -21210,7 +21615,7 @@
                 <w:sz w:val="17"/>
                 <w:szCs w:val="17"/>
               </w:rPr>
-              <w:t xml:space="preserve">844</w:t>
+              <w:t xml:space="preserve">846</w:t>
             </w:r>
           </w:p>
         </w:tc>

</xml_diff>

<commit_message>
DOC-11 e DOC-12 regerados
</commit_message>
<xml_diff>
--- a/docs/DOC-12_Eleicoes.docx
+++ b/docs/DOC-12_Eleicoes.docx
@@ -16447,7 +16447,7 @@
                 <w:sz w:val="17"/>
                 <w:szCs w:val="17"/>
               </w:rPr>
-              <w:t xml:space="preserve">Cloudflare Pages: portal-pages.yml</w:t>
+              <w:t xml:space="preserve">Vercel (Hobby) ou Cloudflare Pages: portal-pages.yml</w:t>
             </w:r>
           </w:p>
         </w:tc>
@@ -16474,7 +16474,7 @@
                 <w:sz w:val="17"/>
                 <w:szCs w:val="17"/>
               </w:rPr>
-              <w:t xml:space="preserve">A cada mudança em packages/portal na main, ou à mão; cria o projeto no Pages na primeira vez</w:t>
+              <w:t xml:space="preserve">Vercel: importa o repositório com Root Directory packages/portal e gera a cada mudança do portal (vercel.json), sem token no GitHub. Pages: a cada mudança em packages/portal na main, ou à mão; cria o projeto na primeira vez</w:t>
             </w:r>
           </w:p>
         </w:tc>
@@ -19604,7 +19604,7 @@
                 <w:sz w:val="17"/>
                 <w:szCs w:val="17"/>
               </w:rPr>
-              <w:t xml:space="preserve">Nada a configurar: o Supabase responde a qualquer origem nos buckets públicos</w:t>
+              <w:t xml:space="preserve">Nada a configurar: o Supabase responde a qualquer origem nos buckets públicos (conferido em 14/10/2026)</w:t>
             </w:r>
           </w:p>
         </w:tc>
@@ -19636,7 +19636,7 @@
                 <w:sz w:val="17"/>
                 <w:szCs w:val="17"/>
               </w:rPr>
-              <w:t xml:space="preserve">Pausa</w:t>
+              <w:t xml:space="preserve">Arquivo inexistente</w:t>
             </w:r>
           </w:p>
         </w:tc>
@@ -19663,7 +19663,7 @@
                 <w:sz w:val="17"/>
                 <w:szCs w:val="17"/>
               </w:rPr>
-              <w:t xml:space="preserve">Não há</w:t>
+              <w:t xml:space="preserve">404</w:t>
             </w:r>
           </w:p>
         </w:tc>
@@ -19690,7 +19690,7 @@
                 <w:sz w:val="17"/>
                 <w:szCs w:val="17"/>
               </w:rPr>
-              <w:t xml:space="preserve">Projeto gratuito pausa após uma semana sem uso; a carga diária o mantém ativo</w:t>
+              <w:t xml:space="preserve">400 com not_found no corpo; o cliente S3 e o portal tratam como 404</w:t>
             </w:r>
           </w:p>
         </w:tc>
@@ -19722,6 +19722,92 @@
                 <w:sz w:val="17"/>
                 <w:szCs w:val="17"/>
               </w:rPr>
+              <w:t xml:space="preserve">Pausa</w:t>
+            </w:r>
+          </w:p>
+        </w:tc>
+        <w:tc>
+          <w:tcPr>
+            <w:tcW w:type="dxa" w:w="3600"/>
+            <w:shd w:fill="FFFFFF" w:val="clear"/>
+            <w:tcMar>
+              <w:top w:type="dxa" w:w="70"/>
+              <w:left w:type="dxa" w:w="110"/>
+              <w:bottom w:type="dxa" w:w="70"/>
+              <w:right w:type="dxa" w:w="110"/>
+            </w:tcMar>
+            <w:vAlign w:val="center"/>
+          </w:tcPr>
+          <w:p>
+            <w:pPr>
+              <w:spacing w:after="0"/>
+            </w:pPr>
+            <w:r>
+              <w:rPr>
+                <w:b w:val="false"/>
+                <w:bCs w:val="false"/>
+                <w:sz w:val="17"/>
+                <w:szCs w:val="17"/>
+              </w:rPr>
+              <w:t xml:space="preserve">Não há</w:t>
+            </w:r>
+          </w:p>
+        </w:tc>
+        <w:tc>
+          <w:tcPr>
+            <w:tcW w:type="dxa" w:w="3600"/>
+            <w:shd w:fill="FFFFFF" w:val="clear"/>
+            <w:tcMar>
+              <w:top w:type="dxa" w:w="70"/>
+              <w:left w:type="dxa" w:w="110"/>
+              <w:bottom w:type="dxa" w:w="70"/>
+              <w:right w:type="dxa" w:w="110"/>
+            </w:tcMar>
+            <w:vAlign w:val="center"/>
+          </w:tcPr>
+          <w:p>
+            <w:pPr>
+              <w:spacing w:after="0"/>
+            </w:pPr>
+            <w:r>
+              <w:rPr>
+                <w:b w:val="false"/>
+                <w:bCs w:val="false"/>
+                <w:sz w:val="17"/>
+                <w:szCs w:val="17"/>
+              </w:rPr>
+              <w:t xml:space="preserve">Projeto gratuito pausa após uma semana sem uso; a carga diária o mantém ativo</w:t>
+            </w:r>
+          </w:p>
+        </w:tc>
+      </w:tr>
+      <w:tr>
+        <w:trPr>
+          <w:cantSplit/>
+        </w:trPr>
+        <w:tc>
+          <w:tcPr>
+            <w:tcW w:type="dxa" w:w="2400"/>
+            <w:shd w:fill="F2F2F2" w:val="clear"/>
+            <w:tcMar>
+              <w:top w:type="dxa" w:w="70"/>
+              <w:left w:type="dxa" w:w="110"/>
+              <w:bottom w:type="dxa" w:w="70"/>
+              <w:right w:type="dxa" w:w="110"/>
+            </w:tcMar>
+            <w:vAlign w:val="center"/>
+          </w:tcPr>
+          <w:p>
+            <w:pPr>
+              <w:spacing w:after="0"/>
+            </w:pPr>
+            <w:r>
+              <w:rPr>
+                <w:b/>
+                <w:bCs/>
+                <w:sz w:val="17"/>
+                <w:szCs w:val="17"/>
+              </w:rPr>
               <w:t xml:space="preserve">Endereço público dos feeds</w:t>
             </w:r>
           </w:p>
@@ -19729,7 +19815,7 @@
         <w:tc>
           <w:tcPr>
             <w:tcW w:type="dxa" w:w="3600"/>
-            <w:shd w:fill="FFFFFF" w:val="clear"/>
+            <w:shd w:fill="F2F2F2" w:val="clear"/>
             <w:tcMar>
               <w:top w:type="dxa" w:w="70"/>
               <w:left w:type="dxa" w:w="110"/>
@@ -19756,7 +19842,7 @@
         <w:tc>
           <w:tcPr>
             <w:tcW w:type="dxa" w:w="3600"/>
-            <w:shd w:fill="FFFFFF" w:val="clear"/>
+            <w:shd w:fill="F2F2F2" w:val="clear"/>
             <w:tcMar>
               <w:top w:type="dxa" w:w="70"/>
               <w:left w:type="dxa" w:w="110"/>
@@ -21136,6 +21222,74 @@
         <w:spacing w:after="70"/>
       </w:pPr>
       <w:r>
+        <w:t xml:space="preserve">Portal na Vercel (plano Hobby): Add New → Project → importar o repositório, Root Directory </w:t>
+      </w:r>
+      <w:r>
+        <w:rPr>
+          <w:rFonts w:ascii="Consolas" w:cs="Consolas" w:eastAsia="Consolas" w:hAnsi="Consolas"/>
+          <w:sz w:val="19"/>
+          <w:szCs w:val="19"/>
+        </w:rPr>
+        <w:t xml:space="preserve">packages/portal</w:t>
+      </w:r>
+      <w:r>
+        <w:t xml:space="preserve">, variável </w:t>
+      </w:r>
+      <w:r>
+        <w:rPr>
+          <w:rFonts w:ascii="Consolas" w:cs="Consolas" w:eastAsia="Consolas" w:hAnsi="Consolas"/>
+          <w:sz w:val="19"/>
+          <w:szCs w:val="19"/>
+        </w:rPr>
+        <w:t xml:space="preserve">NEXT_PUBLIC_DADOS_ELEICOES</w:t>
+      </w:r>
+      <w:r>
+        <w:t xml:space="preserve"> com o mesmo valor de </w:t>
+      </w:r>
+      <w:r>
+        <w:rPr>
+          <w:rFonts w:ascii="Consolas" w:cs="Consolas" w:eastAsia="Consolas" w:hAnsi="Consolas"/>
+          <w:sz w:val="19"/>
+          <w:szCs w:val="19"/>
+        </w:rPr>
+        <w:t xml:space="preserve">LUMEN_URL_FEEDS</w:t>
+      </w:r>
+      <w:r>
+        <w:t xml:space="preserve">. O </w:t>
+      </w:r>
+      <w:r>
+        <w:rPr>
+          <w:rFonts w:ascii="Consolas" w:cs="Consolas" w:eastAsia="Consolas" w:hAnsi="Consolas"/>
+          <w:sz w:val="19"/>
+          <w:szCs w:val="19"/>
+        </w:rPr>
+        <w:t xml:space="preserve">vercel.json</w:t>
+      </w:r>
+      <w:r>
+        <w:t xml:space="preserve"> do portal faz a Vercel gerar o site só quando </w:t>
+      </w:r>
+      <w:r>
+        <w:rPr>
+          <w:rFonts w:ascii="Consolas" w:cs="Consolas" w:eastAsia="Consolas" w:hAnsi="Consolas"/>
+          <w:sz w:val="19"/>
+          <w:szCs w:val="19"/>
+        </w:rPr>
+        <w:t xml:space="preserve">packages/portal</w:t>
+      </w:r>
+      <w:r>
+        <w:t xml:space="preserve"> muda. Sem token no GitHub.</w:t>
+      </w:r>
+    </w:p>
+    <w:p>
+      <w:pPr>
+        <w:pStyle w:val="ListParagraph"/>
+        <w:numPr>
+          <w:ilvl w:val="0"/>
+          <w:numId w:val="9"/>
+        </w:numPr>
+        <w:spacing w:after="70"/>
+      </w:pPr>
+      <w:r>
         <w:t xml:space="preserve">Actions → </w:t>
       </w:r>
       <w:r>
@@ -21147,18 +21301,7 @@
         <w:t xml:space="preserve">eleicoes-carga</w:t>
       </w:r>
       <w:r>
-        <w:t xml:space="preserve"> → Run workflow (publica o 1º turno), depois </w:t>
-      </w:r>
-      <w:r>
-        <w:rPr>
-          <w:rFonts w:ascii="Consolas" w:cs="Consolas" w:eastAsia="Consolas" w:hAnsi="Consolas"/>
-          <w:sz w:val="19"/>
-          <w:szCs w:val="19"/>
-        </w:rPr>
-        <w:t xml:space="preserve">portal-pages</w:t>
-      </w:r>
-      <w:r>
-        <w:t xml:space="preserve">. Na noite do 2º turno, </w:t>
+        <w:t xml:space="preserve"> → Run workflow (publica o 1º turno). Na noite do 2º turno, </w:t>
       </w:r>
       <w:r>
         <w:rPr>
@@ -21529,7 +21672,7 @@
                 <w:sz w:val="17"/>
                 <w:szCs w:val="17"/>
               </w:rPr>
-              <w:t xml:space="preserve">79</w:t>
+              <w:t xml:space="preserve">84</w:t>
             </w:r>
           </w:p>
         </w:tc>
@@ -21556,7 +21699,7 @@
                 <w:sz w:val="17"/>
                 <w:szCs w:val="17"/>
               </w:rPr>
-              <w:t xml:space="preserve">Decodificador TopoJSON, validação dos feeds lendo a amostra do Python (inclusive as eleições antigas), formatação, cores, busca, estado na URL, grupos do seletor, área do mapa ↔ parte e as contas do zoom</w:t>
+              <w:t xml:space="preserve">Leitura dos feeds (404 e o 400 de inexistente do Supabase), decodificador TopoJSON, validação dos feeds lendo a amostra do Python (inclusive as eleições antigas), formatação, cores, busca, estado na URL, grupos do seletor, área do mapa ↔ parte e as contas do zoom</w:t>
             </w:r>
           </w:p>
         </w:tc>
@@ -21615,7 +21758,7 @@
                 <w:sz w:val="17"/>
                 <w:szCs w:val="17"/>
               </w:rPr>
-              <w:t xml:space="preserve">846</w:t>
+              <w:t xml:space="preserve">850</w:t>
             </w:r>
           </w:p>
         </w:tc>

</xml_diff>

<commit_message>
Documentação: DOC-11 e DOC-12 regerados (tentativas nas gravações da publicação)
</commit_message>
<xml_diff>
--- a/docs/DOC-12_Eleicoes.docx
+++ b/docs/DOC-12_Eleicoes.docx
@@ -16831,7 +16831,7 @@
         <w:spacing w:after="70"/>
       </w:pPr>
       <w:r>
-        <w:t xml:space="preserve">Falha passageira de um envio (408, 429, 5xx, rede ou tempo esgotado) é tentada de novo depois de 2 e de 8 segundos; outra falha, ou a terceira seguida, vira erro do lote.</w:t>
+        <w:t xml:space="preserve">Falha passageira de uma gravação (408, 429, 5xx, os 520 a 524 do Cloudflare na frente do Supabase, rede ou tempo esgotado) é tentada de novo depois de 2 e de 8 segundos, nos feeds, no manifesto e no estado; outra falha, ou a terceira seguida, vira erro do lote.</w:t>
       </w:r>
     </w:p>
     <w:p>
@@ -23250,7 +23250,7 @@
                 <w:sz w:val="17"/>
                 <w:szCs w:val="17"/>
               </w:rPr>
-              <w:t xml:space="preserve">203</w:t>
+              <w:t xml:space="preserve">204</w:t>
             </w:r>
           </w:p>
         </w:tc>
@@ -23422,7 +23422,7 @@
                 <w:sz w:val="17"/>
                 <w:szCs w:val="17"/>
               </w:rPr>
-              <w:t xml:space="preserve">862</w:t>
+              <w:t xml:space="preserve">891</w:t>
             </w:r>
           </w:p>
         </w:tc>

</xml_diff>

<commit_message>
Documentação: DOC-12 1.5 e DOC-11 com as zonas eleitorais
</commit_message>
<xml_diff>
--- a/docs/DOC-12_Eleicoes.docx
+++ b/docs/DOC-12_Eleicoes.docx
@@ -267,7 +267,7 @@
                 <w:sz w:val="19"/>
                 <w:szCs w:val="19"/>
               </w:rPr>
-              <w:t xml:space="preserve">1.4</w:t>
+              <w:t xml:space="preserve">1.5</w:t>
             </w:r>
           </w:p>
         </w:tc>
@@ -326,7 +326,7 @@
                 <w:sz w:val="19"/>
                 <w:szCs w:val="19"/>
               </w:rPr>
-              <w:t xml:space="preserve">14 de outubro de 2026</w:t>
+              <w:t xml:space="preserve">15 de outubro de 2026</w:t>
             </w:r>
           </w:p>
         </w:tc>
@@ -385,7 +385,7 @@
                 <w:sz w:val="19"/>
                 <w:szCs w:val="19"/>
               </w:rPr>
-              <w:t xml:space="preserve">Proposta — acompanha o ADR-019 a ADR-026</w:t>
+              <w:t xml:space="preserve">Proposta — acompanha o ADR-019 a ADR-026 e o ADR-029</w:t>
             </w:r>
           </w:p>
         </w:tc>
@@ -8614,6 +8614,76 @@
     </w:p>
     <w:p>
       <w:pPr>
+        <w:spacing w:after="120"/>
+      </w:pPr>
+      <w:r>
+        <w:rPr>
+          <w:b/>
+          <w:bCs/>
+        </w:rPr>
+        <w:t xml:space="preserve">Zonas eleitorais (ADR-029).</w:t>
+      </w:r>
+      <w:r>
+        <w:t xml:space="preserve"> Os arquivos já vêm por município e zona; até a versão 0.7 as zonas eram só somadas no município. O detalhe da apuração diz quais municípios têm duas zonas ou mais (190 em 2026) e, só neles, a votação também é somada por zona. O feed </w:t>
+      </w:r>
+      <w:r>
+        <w:rPr>
+          <w:rFonts w:ascii="Consolas" w:cs="Consolas" w:eastAsia="Consolas" w:hAnsi="Consolas"/>
+          <w:sz w:val="19"/>
+          <w:szCs w:val="19"/>
+        </w:rPr>
+        <w:t xml:space="preserve">mu-*</w:t>
+      </w:r>
+      <w:r>
+        <w:t xml:space="preserve"> desses municípios leva as zonas em </w:t>
+      </w:r>
+      <w:r>
+        <w:rPr>
+          <w:rFonts w:ascii="Consolas" w:cs="Consolas" w:eastAsia="Consolas" w:hAnsi="Consolas"/>
+          <w:sz w:val="19"/>
+          <w:szCs w:val="19"/>
+        </w:rPr>
+        <w:t xml:space="preserve">partes</w:t>
+      </w:r>
+      <w:r>
+        <w:t xml:space="preserve">, como o da UF leva os municípios: o número da zona como código, quem lidera, percentual, vantagem e eleitorado, com as cores do próprio feed. Nos cargos proporcionais a zona não traz </w:t>
+      </w:r>
+      <w:r>
+        <w:rPr>
+          <w:rFonts w:ascii="Consolas" w:cs="Consolas" w:eastAsia="Consolas" w:hAnsi="Consolas"/>
+          <w:sz w:val="19"/>
+          <w:szCs w:val="19"/>
+        </w:rPr>
+        <w:t xml:space="preserve">bancada</w:t>
+      </w:r>
+      <w:r>
+        <w:t xml:space="preserve">: os eleitos são do município ou da UF. </w:t>
+      </w:r>
+      <w:r>
+        <w:rPr>
+          <w:rFonts w:ascii="Consolas" w:cs="Consolas" w:eastAsia="Consolas" w:hAnsi="Consolas"/>
+          <w:sz w:val="19"/>
+          <w:szCs w:val="19"/>
+        </w:rPr>
+        <w:t xml:space="preserve">preparar</w:t>
+      </w:r>
+      <w:r>
+        <w:t xml:space="preserve"> refaz uma vez os anos processados pela versão anterior (</w:t>
+      </w:r>
+      <w:r>
+        <w:rPr>
+          <w:rFonts w:ascii="Consolas" w:cs="Consolas" w:eastAsia="Consolas" w:hAnsi="Consolas"/>
+          <w:sz w:val="19"/>
+          <w:szCs w:val="19"/>
+        </w:rPr>
+        <w:t xml:space="preserve">VERSAO_PROCESSAMENTO</w:t>
+      </w:r>
+      <w:r>
+        <w:t xml:space="preserve">).</w:t>
+      </w:r>
+    </w:p>
+    <w:p>
+      <w:pPr>
         <w:pStyle w:val="Heading2"/>
         <w:keepNext/>
         <w:keepLines/>
@@ -8882,6 +8952,1278 @@
       </w:r>
       <w:r>
         <w:t xml:space="preserve">.</w:t>
+      </w:r>
+    </w:p>
+    <w:p>
+      <w:pPr>
+        <w:pStyle w:val="Heading2"/>
+        <w:keepNext/>
+        <w:keepLines/>
+        <w:spacing w:after="120" w:before="280"/>
+      </w:pPr>
+      <w:r>
+        <w:t xml:space="preserve">6.4 Locais de votação e o mapa das zonas</w:t>
+      </w:r>
+    </w:p>
+    <w:p>
+      <w:pPr>
+        <w:spacing w:after="120"/>
+      </w:pPr>
+      <w:r>
+        <w:t xml:space="preserve">A Justiça Eleitoral não publica os limites das zonas eleitorais. Publica, por seção, o local de votação, a zona e as coordenadas do local (</w:t>
+      </w:r>
+      <w:r>
+        <w:rPr>
+          <w:rFonts w:ascii="Consolas" w:cs="Consolas" w:eastAsia="Consolas" w:hAnsi="Consolas"/>
+          <w:sz w:val="19"/>
+          <w:szCs w:val="19"/>
+        </w:rPr>
+        <w:t xml:space="preserve">eleitorado_local_votacao_&lt;ano&gt;.zip</w:t>
+      </w:r>
+      <w:r>
+        <w:t xml:space="preserve">, de 2018 em diante; em 2026, um CSV por UF e coordenadas com vírgula decimal). </w:t>
+      </w:r>
+      <w:r>
+        <w:rPr>
+          <w:rFonts w:ascii="Consolas" w:cs="Consolas" w:eastAsia="Consolas" w:hAnsi="Consolas"/>
+          <w:sz w:val="19"/>
+          <w:szCs w:val="19"/>
+        </w:rPr>
+        <w:t xml:space="preserve">lumen eleicoes zonas</w:t>
+      </w:r>
+      <w:r>
+        <w:t xml:space="preserve"> (e a etapa das zonas do </w:t>
+      </w:r>
+      <w:r>
+        <w:rPr>
+          <w:rFonts w:ascii="Consolas" w:cs="Consolas" w:eastAsia="Consolas" w:hAnsi="Consolas"/>
+          <w:sz w:val="19"/>
+          <w:szCs w:val="19"/>
+        </w:rPr>
+        <w:t xml:space="preserve">preparar</w:t>
+      </w:r>
+      <w:r>
+        <w:t xml:space="preserve">) baixa esse arquivo, soma o eleitorado das seções de cada local e grava, para cada município com duas zonas ou mais, as zonas e os locais com coordenada. O portal desenha cada zona como a área mais perto dos seus locais (seção 8.3).</w:t>
+      </w:r>
+    </w:p>
+    <w:tbl>
+      <w:tblPr>
+        <w:tblW w:type="dxa" w:w="9600"/>
+        <w:tblBorders>
+          <w:top w:val="single" w:color="BFBFBF" w:sz="4"/>
+          <w:left w:val="single" w:color="BFBFBF" w:sz="4"/>
+          <w:bottom w:val="single" w:color="BFBFBF" w:sz="4"/>
+          <w:right w:val="single" w:color="BFBFBF" w:sz="4"/>
+          <w:insideH w:val="single" w:color="D9D9D9" w:sz="2"/>
+          <w:insideV w:val="single" w:color="D9D9D9" w:sz="2"/>
+        </w:tblBorders>
+      </w:tblPr>
+      <w:tblGrid>
+        <w:gridCol w:w="1100"/>
+        <w:gridCol w:w="1500"/>
+        <w:gridCol w:w="1200"/>
+        <w:gridCol w:w="1900"/>
+        <w:gridCol w:w="1900"/>
+        <w:gridCol w:w="2000"/>
+      </w:tblGrid>
+      <w:tr>
+        <w:trPr>
+          <w:tblHeader/>
+        </w:trPr>
+        <w:tc>
+          <w:tcPr>
+            <w:tcW w:type="dxa" w:w="1100"/>
+            <w:shd w:fill="1F3864" w:val="clear"/>
+            <w:tcMar>
+              <w:top w:type="dxa" w:w="80"/>
+              <w:left w:type="dxa" w:w="110"/>
+              <w:bottom w:type="dxa" w:w="80"/>
+              <w:right w:type="dxa" w:w="110"/>
+            </w:tcMar>
+            <w:vAlign w:val="center"/>
+          </w:tcPr>
+          <w:p>
+            <w:pPr>
+              <w:spacing w:after="0"/>
+            </w:pPr>
+            <w:r>
+              <w:rPr>
+                <w:b/>
+                <w:bCs/>
+                <w:color w:val="FFFFFF"/>
+                <w:sz w:val="19"/>
+                <w:szCs w:val="19"/>
+              </w:rPr>
+              <w:t xml:space="preserve">Ano</w:t>
+            </w:r>
+          </w:p>
+        </w:tc>
+        <w:tc>
+          <w:tcPr>
+            <w:tcW w:type="dxa" w:w="1500"/>
+            <w:shd w:fill="1F3864" w:val="clear"/>
+            <w:tcMar>
+              <w:top w:type="dxa" w:w="80"/>
+              <w:left w:type="dxa" w:w="110"/>
+              <w:bottom w:type="dxa" w:w="80"/>
+              <w:right w:type="dxa" w:w="110"/>
+            </w:tcMar>
+            <w:vAlign w:val="center"/>
+          </w:tcPr>
+          <w:p>
+            <w:pPr>
+              <w:spacing w:after="0"/>
+            </w:pPr>
+            <w:r>
+              <w:rPr>
+                <w:b/>
+                <w:bCs/>
+                <w:color w:val="FFFFFF"/>
+                <w:sz w:val="19"/>
+                <w:szCs w:val="19"/>
+              </w:rPr>
+              <w:t xml:space="preserve">Municípios</w:t>
+            </w:r>
+          </w:p>
+        </w:tc>
+        <w:tc>
+          <w:tcPr>
+            <w:tcW w:type="dxa" w:w="1200"/>
+            <w:shd w:fill="1F3864" w:val="clear"/>
+            <w:tcMar>
+              <w:top w:type="dxa" w:w="80"/>
+              <w:left w:type="dxa" w:w="110"/>
+              <w:bottom w:type="dxa" w:w="80"/>
+              <w:right w:type="dxa" w:w="110"/>
+            </w:tcMar>
+            <w:vAlign w:val="center"/>
+          </w:tcPr>
+          <w:p>
+            <w:pPr>
+              <w:spacing w:after="0"/>
+            </w:pPr>
+            <w:r>
+              <w:rPr>
+                <w:b/>
+                <w:bCs/>
+                <w:color w:val="FFFFFF"/>
+                <w:sz w:val="19"/>
+                <w:szCs w:val="19"/>
+              </w:rPr>
+              <w:t xml:space="preserve">Zonas</w:t>
+            </w:r>
+          </w:p>
+        </w:tc>
+        <w:tc>
+          <w:tcPr>
+            <w:tcW w:type="dxa" w:w="1900"/>
+            <w:shd w:fill="1F3864" w:val="clear"/>
+            <w:tcMar>
+              <w:top w:type="dxa" w:w="80"/>
+              <w:left w:type="dxa" w:w="110"/>
+              <w:bottom w:type="dxa" w:w="80"/>
+              <w:right w:type="dxa" w:w="110"/>
+            </w:tcMar>
+            <w:vAlign w:val="center"/>
+          </w:tcPr>
+          <w:p>
+            <w:pPr>
+              <w:spacing w:after="0"/>
+            </w:pPr>
+            <w:r>
+              <w:rPr>
+                <w:b/>
+                <w:bCs/>
+                <w:color w:val="FFFFFF"/>
+                <w:sz w:val="19"/>
+                <w:szCs w:val="19"/>
+              </w:rPr>
+              <w:t xml:space="preserve">Locais no mapa</w:t>
+            </w:r>
+          </w:p>
+        </w:tc>
+        <w:tc>
+          <w:tcPr>
+            <w:tcW w:type="dxa" w:w="1900"/>
+            <w:shd w:fill="1F3864" w:val="clear"/>
+            <w:tcMar>
+              <w:top w:type="dxa" w:w="80"/>
+              <w:left w:type="dxa" w:w="110"/>
+              <w:bottom w:type="dxa" w:w="80"/>
+              <w:right w:type="dxa" w:w="110"/>
+            </w:tcMar>
+            <w:vAlign w:val="center"/>
+          </w:tcPr>
+          <w:p>
+            <w:pPr>
+              <w:spacing w:after="0"/>
+            </w:pPr>
+            <w:r>
+              <w:rPr>
+                <w:b/>
+                <w:bCs/>
+                <w:color w:val="FFFFFF"/>
+                <w:sz w:val="19"/>
+                <w:szCs w:val="19"/>
+              </w:rPr>
+              <w:t xml:space="preserve">Sem coordenada</w:t>
+            </w:r>
+          </w:p>
+        </w:tc>
+        <w:tc>
+          <w:tcPr>
+            <w:tcW w:type="dxa" w:w="2000"/>
+            <w:shd w:fill="1F3864" w:val="clear"/>
+            <w:tcMar>
+              <w:top w:type="dxa" w:w="80"/>
+              <w:left w:type="dxa" w:w="110"/>
+              <w:bottom w:type="dxa" w:w="80"/>
+              <w:right w:type="dxa" w:w="110"/>
+            </w:tcMar>
+            <w:vAlign w:val="center"/>
+          </w:tcPr>
+          <w:p>
+            <w:pPr>
+              <w:spacing w:after="0"/>
+            </w:pPr>
+            <w:r>
+              <w:rPr>
+                <w:b/>
+                <w:bCs/>
+                <w:color w:val="FFFFFF"/>
+                <w:sz w:val="19"/>
+                <w:szCs w:val="19"/>
+              </w:rPr>
+              <w:t xml:space="preserve">Fora do município</w:t>
+            </w:r>
+          </w:p>
+        </w:tc>
+      </w:tr>
+      <w:tr>
+        <w:trPr>
+          <w:cantSplit/>
+        </w:trPr>
+        <w:tc>
+          <w:tcPr>
+            <w:tcW w:type="dxa" w:w="1100"/>
+            <w:shd w:fill="FFFFFF" w:val="clear"/>
+            <w:tcMar>
+              <w:top w:type="dxa" w:w="70"/>
+              <w:left w:type="dxa" w:w="110"/>
+              <w:bottom w:type="dxa" w:w="70"/>
+              <w:right w:type="dxa" w:w="110"/>
+            </w:tcMar>
+            <w:vAlign w:val="center"/>
+          </w:tcPr>
+          <w:p>
+            <w:pPr>
+              <w:spacing w:after="0"/>
+            </w:pPr>
+            <w:r>
+              <w:rPr>
+                <w:b w:val="false"/>
+                <w:bCs w:val="false"/>
+                <w:sz w:val="17"/>
+                <w:szCs w:val="17"/>
+              </w:rPr>
+              <w:t xml:space="preserve">2026</w:t>
+            </w:r>
+          </w:p>
+        </w:tc>
+        <w:tc>
+          <w:tcPr>
+            <w:tcW w:type="dxa" w:w="1500"/>
+            <w:shd w:fill="FFFFFF" w:val="clear"/>
+            <w:tcMar>
+              <w:top w:type="dxa" w:w="70"/>
+              <w:left w:type="dxa" w:w="110"/>
+              <w:bottom w:type="dxa" w:w="70"/>
+              <w:right w:type="dxa" w:w="110"/>
+            </w:tcMar>
+            <w:vAlign w:val="center"/>
+          </w:tcPr>
+          <w:p>
+            <w:pPr>
+              <w:spacing w:after="0"/>
+            </w:pPr>
+            <w:r>
+              <w:rPr>
+                <w:b w:val="false"/>
+                <w:bCs w:val="false"/>
+                <w:sz w:val="17"/>
+                <w:szCs w:val="17"/>
+              </w:rPr>
+              <w:t xml:space="preserve">190</w:t>
+            </w:r>
+          </w:p>
+        </w:tc>
+        <w:tc>
+          <w:tcPr>
+            <w:tcW w:type="dxa" w:w="1200"/>
+            <w:shd w:fill="FFFFFF" w:val="clear"/>
+            <w:tcMar>
+              <w:top w:type="dxa" w:w="70"/>
+              <w:left w:type="dxa" w:w="110"/>
+              <w:bottom w:type="dxa" w:w="70"/>
+              <w:right w:type="dxa" w:w="110"/>
+            </w:tcMar>
+            <w:vAlign w:val="center"/>
+          </w:tcPr>
+          <w:p>
+            <w:pPr>
+              <w:spacing w:after="0"/>
+            </w:pPr>
+            <w:r>
+              <w:rPr>
+                <w:b w:val="false"/>
+                <w:bCs w:val="false"/>
+                <w:sz w:val="17"/>
+                <w:szCs w:val="17"/>
+              </w:rPr>
+              <w:t xml:space="preserve">725</w:t>
+            </w:r>
+          </w:p>
+        </w:tc>
+        <w:tc>
+          <w:tcPr>
+            <w:tcW w:type="dxa" w:w="1900"/>
+            <w:shd w:fill="FFFFFF" w:val="clear"/>
+            <w:tcMar>
+              <w:top w:type="dxa" w:w="70"/>
+              <w:left w:type="dxa" w:w="110"/>
+              <w:bottom w:type="dxa" w:w="70"/>
+              <w:right w:type="dxa" w:w="110"/>
+            </w:tcMar>
+            <w:vAlign w:val="center"/>
+          </w:tcPr>
+          <w:p>
+            <w:pPr>
+              <w:spacing w:after="0"/>
+            </w:pPr>
+            <w:r>
+              <w:rPr>
+                <w:b w:val="false"/>
+                <w:bCs w:val="false"/>
+                <w:sz w:val="17"/>
+                <w:szCs w:val="17"/>
+              </w:rPr>
+              <w:t xml:space="preserve">25.508</w:t>
+            </w:r>
+          </w:p>
+        </w:tc>
+        <w:tc>
+          <w:tcPr>
+            <w:tcW w:type="dxa" w:w="1900"/>
+            <w:shd w:fill="FFFFFF" w:val="clear"/>
+            <w:tcMar>
+              <w:top w:type="dxa" w:w="70"/>
+              <w:left w:type="dxa" w:w="110"/>
+              <w:bottom w:type="dxa" w:w="70"/>
+              <w:right w:type="dxa" w:w="110"/>
+            </w:tcMar>
+            <w:vAlign w:val="center"/>
+          </w:tcPr>
+          <w:p>
+            <w:pPr>
+              <w:spacing w:after="0"/>
+            </w:pPr>
+            <w:r>
+              <w:rPr>
+                <w:b w:val="false"/>
+                <w:bCs w:val="false"/>
+                <w:sz w:val="17"/>
+                <w:szCs w:val="17"/>
+              </w:rPr>
+              <w:t xml:space="preserve">118</w:t>
+            </w:r>
+          </w:p>
+        </w:tc>
+        <w:tc>
+          <w:tcPr>
+            <w:tcW w:type="dxa" w:w="2000"/>
+            <w:shd w:fill="FFFFFF" w:val="clear"/>
+            <w:tcMar>
+              <w:top w:type="dxa" w:w="70"/>
+              <w:left w:type="dxa" w:w="110"/>
+              <w:bottom w:type="dxa" w:w="70"/>
+              <w:right w:type="dxa" w:w="110"/>
+            </w:tcMar>
+            <w:vAlign w:val="center"/>
+          </w:tcPr>
+          <w:p>
+            <w:pPr>
+              <w:spacing w:after="0"/>
+            </w:pPr>
+            <w:r>
+              <w:rPr>
+                <w:b w:val="false"/>
+                <w:bCs w:val="false"/>
+                <w:sz w:val="17"/>
+                <w:szCs w:val="17"/>
+              </w:rPr>
+              <w:t xml:space="preserve">47</w:t>
+            </w:r>
+          </w:p>
+        </w:tc>
+      </w:tr>
+      <w:tr>
+        <w:trPr>
+          <w:cantSplit/>
+        </w:trPr>
+        <w:tc>
+          <w:tcPr>
+            <w:tcW w:type="dxa" w:w="1100"/>
+            <w:shd w:fill="F2F2F2" w:val="clear"/>
+            <w:tcMar>
+              <w:top w:type="dxa" w:w="70"/>
+              <w:left w:type="dxa" w:w="110"/>
+              <w:bottom w:type="dxa" w:w="70"/>
+              <w:right w:type="dxa" w:w="110"/>
+            </w:tcMar>
+            <w:vAlign w:val="center"/>
+          </w:tcPr>
+          <w:p>
+            <w:pPr>
+              <w:spacing w:after="0"/>
+            </w:pPr>
+            <w:r>
+              <w:rPr>
+                <w:b w:val="false"/>
+                <w:bCs w:val="false"/>
+                <w:sz w:val="17"/>
+                <w:szCs w:val="17"/>
+              </w:rPr>
+              <w:t xml:space="preserve">2024</w:t>
+            </w:r>
+          </w:p>
+        </w:tc>
+        <w:tc>
+          <w:tcPr>
+            <w:tcW w:type="dxa" w:w="1500"/>
+            <w:shd w:fill="F2F2F2" w:val="clear"/>
+            <w:tcMar>
+              <w:top w:type="dxa" w:w="70"/>
+              <w:left w:type="dxa" w:w="110"/>
+              <w:bottom w:type="dxa" w:w="70"/>
+              <w:right w:type="dxa" w:w="110"/>
+            </w:tcMar>
+            <w:vAlign w:val="center"/>
+          </w:tcPr>
+          <w:p>
+            <w:pPr>
+              <w:spacing w:after="0"/>
+            </w:pPr>
+            <w:r>
+              <w:rPr>
+                <w:b w:val="false"/>
+                <w:bCs w:val="false"/>
+                <w:sz w:val="17"/>
+                <w:szCs w:val="17"/>
+              </w:rPr>
+              <w:t xml:space="preserve">189</w:t>
+            </w:r>
+          </w:p>
+        </w:tc>
+        <w:tc>
+          <w:tcPr>
+            <w:tcW w:type="dxa" w:w="1200"/>
+            <w:shd w:fill="F2F2F2" w:val="clear"/>
+            <w:tcMar>
+              <w:top w:type="dxa" w:w="70"/>
+              <w:left w:type="dxa" w:w="110"/>
+              <w:bottom w:type="dxa" w:w="70"/>
+              <w:right w:type="dxa" w:w="110"/>
+            </w:tcMar>
+            <w:vAlign w:val="center"/>
+          </w:tcPr>
+          <w:p>
+            <w:pPr>
+              <w:spacing w:after="0"/>
+            </w:pPr>
+            <w:r>
+              <w:rPr>
+                <w:b w:val="false"/>
+                <w:bCs w:val="false"/>
+                <w:sz w:val="17"/>
+                <w:szCs w:val="17"/>
+              </w:rPr>
+              <w:t xml:space="preserve">705</w:t>
+            </w:r>
+          </w:p>
+        </w:tc>
+        <w:tc>
+          <w:tcPr>
+            <w:tcW w:type="dxa" w:w="1900"/>
+            <w:shd w:fill="F2F2F2" w:val="clear"/>
+            <w:tcMar>
+              <w:top w:type="dxa" w:w="70"/>
+              <w:left w:type="dxa" w:w="110"/>
+              <w:bottom w:type="dxa" w:w="70"/>
+              <w:right w:type="dxa" w:w="110"/>
+            </w:tcMar>
+            <w:vAlign w:val="center"/>
+          </w:tcPr>
+          <w:p>
+            <w:pPr>
+              <w:spacing w:after="0"/>
+            </w:pPr>
+            <w:r>
+              <w:rPr>
+                <w:b w:val="false"/>
+                <w:bCs w:val="false"/>
+                <w:sz w:val="17"/>
+                <w:szCs w:val="17"/>
+              </w:rPr>
+              <w:t xml:space="preserve">23.824</w:t>
+            </w:r>
+          </w:p>
+        </w:tc>
+        <w:tc>
+          <w:tcPr>
+            <w:tcW w:type="dxa" w:w="1900"/>
+            <w:shd w:fill="F2F2F2" w:val="clear"/>
+            <w:tcMar>
+              <w:top w:type="dxa" w:w="70"/>
+              <w:left w:type="dxa" w:w="110"/>
+              <w:bottom w:type="dxa" w:w="70"/>
+              <w:right w:type="dxa" w:w="110"/>
+            </w:tcMar>
+            <w:vAlign w:val="center"/>
+          </w:tcPr>
+          <w:p>
+            <w:pPr>
+              <w:spacing w:after="0"/>
+            </w:pPr>
+            <w:r>
+              <w:rPr>
+                <w:b w:val="false"/>
+                <w:bCs w:val="false"/>
+                <w:sz w:val="17"/>
+                <w:szCs w:val="17"/>
+              </w:rPr>
+              <w:t xml:space="preserve">827</w:t>
+            </w:r>
+          </w:p>
+        </w:tc>
+        <w:tc>
+          <w:tcPr>
+            <w:tcW w:type="dxa" w:w="2000"/>
+            <w:shd w:fill="F2F2F2" w:val="clear"/>
+            <w:tcMar>
+              <w:top w:type="dxa" w:w="70"/>
+              <w:left w:type="dxa" w:w="110"/>
+              <w:bottom w:type="dxa" w:w="70"/>
+              <w:right w:type="dxa" w:w="110"/>
+            </w:tcMar>
+            <w:vAlign w:val="center"/>
+          </w:tcPr>
+          <w:p>
+            <w:pPr>
+              <w:spacing w:after="0"/>
+            </w:pPr>
+            <w:r>
+              <w:rPr>
+                <w:b w:val="false"/>
+                <w:bCs w:val="false"/>
+                <w:sz w:val="17"/>
+                <w:szCs w:val="17"/>
+              </w:rPr>
+              <w:t xml:space="preserve">29</w:t>
+            </w:r>
+          </w:p>
+        </w:tc>
+      </w:tr>
+      <w:tr>
+        <w:trPr>
+          <w:cantSplit/>
+        </w:trPr>
+        <w:tc>
+          <w:tcPr>
+            <w:tcW w:type="dxa" w:w="1100"/>
+            <w:shd w:fill="FFFFFF" w:val="clear"/>
+            <w:tcMar>
+              <w:top w:type="dxa" w:w="70"/>
+              <w:left w:type="dxa" w:w="110"/>
+              <w:bottom w:type="dxa" w:w="70"/>
+              <w:right w:type="dxa" w:w="110"/>
+            </w:tcMar>
+            <w:vAlign w:val="center"/>
+          </w:tcPr>
+          <w:p>
+            <w:pPr>
+              <w:spacing w:after="0"/>
+            </w:pPr>
+            <w:r>
+              <w:rPr>
+                <w:b w:val="false"/>
+                <w:bCs w:val="false"/>
+                <w:sz w:val="17"/>
+                <w:szCs w:val="17"/>
+              </w:rPr>
+              <w:t xml:space="preserve">2022</w:t>
+            </w:r>
+          </w:p>
+        </w:tc>
+        <w:tc>
+          <w:tcPr>
+            <w:tcW w:type="dxa" w:w="1500"/>
+            <w:shd w:fill="FFFFFF" w:val="clear"/>
+            <w:tcMar>
+              <w:top w:type="dxa" w:w="70"/>
+              <w:left w:type="dxa" w:w="110"/>
+              <w:bottom w:type="dxa" w:w="70"/>
+              <w:right w:type="dxa" w:w="110"/>
+            </w:tcMar>
+            <w:vAlign w:val="center"/>
+          </w:tcPr>
+          <w:p>
+            <w:pPr>
+              <w:spacing w:after="0"/>
+            </w:pPr>
+            <w:r>
+              <w:rPr>
+                <w:b w:val="false"/>
+                <w:bCs w:val="false"/>
+                <w:sz w:val="17"/>
+                <w:szCs w:val="17"/>
+              </w:rPr>
+              <w:t xml:space="preserve">189</w:t>
+            </w:r>
+          </w:p>
+        </w:tc>
+        <w:tc>
+          <w:tcPr>
+            <w:tcW w:type="dxa" w:w="1200"/>
+            <w:shd w:fill="FFFFFF" w:val="clear"/>
+            <w:tcMar>
+              <w:top w:type="dxa" w:w="70"/>
+              <w:left w:type="dxa" w:w="110"/>
+              <w:bottom w:type="dxa" w:w="70"/>
+              <w:right w:type="dxa" w:w="110"/>
+            </w:tcMar>
+            <w:vAlign w:val="center"/>
+          </w:tcPr>
+          <w:p>
+            <w:pPr>
+              <w:spacing w:after="0"/>
+            </w:pPr>
+            <w:r>
+              <w:rPr>
+                <w:b w:val="false"/>
+                <w:bCs w:val="false"/>
+                <w:sz w:val="17"/>
+                <w:szCs w:val="17"/>
+              </w:rPr>
+              <w:t xml:space="preserve">721</w:t>
+            </w:r>
+          </w:p>
+        </w:tc>
+        <w:tc>
+          <w:tcPr>
+            <w:tcW w:type="dxa" w:w="1900"/>
+            <w:shd w:fill="FFFFFF" w:val="clear"/>
+            <w:tcMar>
+              <w:top w:type="dxa" w:w="70"/>
+              <w:left w:type="dxa" w:w="110"/>
+              <w:bottom w:type="dxa" w:w="70"/>
+              <w:right w:type="dxa" w:w="110"/>
+            </w:tcMar>
+            <w:vAlign w:val="center"/>
+          </w:tcPr>
+          <w:p>
+            <w:pPr>
+              <w:spacing w:after="0"/>
+            </w:pPr>
+            <w:r>
+              <w:rPr>
+                <w:b w:val="false"/>
+                <w:bCs w:val="false"/>
+                <w:sz w:val="17"/>
+                <w:szCs w:val="17"/>
+              </w:rPr>
+              <w:t xml:space="preserve">23.678</w:t>
+            </w:r>
+          </w:p>
+        </w:tc>
+        <w:tc>
+          <w:tcPr>
+            <w:tcW w:type="dxa" w:w="1900"/>
+            <w:shd w:fill="FFFFFF" w:val="clear"/>
+            <w:tcMar>
+              <w:top w:type="dxa" w:w="70"/>
+              <w:left w:type="dxa" w:w="110"/>
+              <w:bottom w:type="dxa" w:w="70"/>
+              <w:right w:type="dxa" w:w="110"/>
+            </w:tcMar>
+            <w:vAlign w:val="center"/>
+          </w:tcPr>
+          <w:p>
+            <w:pPr>
+              <w:spacing w:after="0"/>
+            </w:pPr>
+            <w:r>
+              <w:rPr>
+                <w:b w:val="false"/>
+                <w:bCs w:val="false"/>
+                <w:sz w:val="17"/>
+                <w:szCs w:val="17"/>
+              </w:rPr>
+              <w:t xml:space="preserve">962</w:t>
+            </w:r>
+          </w:p>
+        </w:tc>
+        <w:tc>
+          <w:tcPr>
+            <w:tcW w:type="dxa" w:w="2000"/>
+            <w:shd w:fill="FFFFFF" w:val="clear"/>
+            <w:tcMar>
+              <w:top w:type="dxa" w:w="70"/>
+              <w:left w:type="dxa" w:w="110"/>
+              <w:bottom w:type="dxa" w:w="70"/>
+              <w:right w:type="dxa" w:w="110"/>
+            </w:tcMar>
+            <w:vAlign w:val="center"/>
+          </w:tcPr>
+          <w:p>
+            <w:pPr>
+              <w:spacing w:after="0"/>
+            </w:pPr>
+            <w:r>
+              <w:rPr>
+                <w:b w:val="false"/>
+                <w:bCs w:val="false"/>
+                <w:sz w:val="17"/>
+                <w:szCs w:val="17"/>
+              </w:rPr>
+              <w:t xml:space="preserve">59</w:t>
+            </w:r>
+          </w:p>
+        </w:tc>
+      </w:tr>
+      <w:tr>
+        <w:trPr>
+          <w:cantSplit/>
+        </w:trPr>
+        <w:tc>
+          <w:tcPr>
+            <w:tcW w:type="dxa" w:w="1100"/>
+            <w:shd w:fill="F2F2F2" w:val="clear"/>
+            <w:tcMar>
+              <w:top w:type="dxa" w:w="70"/>
+              <w:left w:type="dxa" w:w="110"/>
+              <w:bottom w:type="dxa" w:w="70"/>
+              <w:right w:type="dxa" w:w="110"/>
+            </w:tcMar>
+            <w:vAlign w:val="center"/>
+          </w:tcPr>
+          <w:p>
+            <w:pPr>
+              <w:spacing w:after="0"/>
+            </w:pPr>
+            <w:r>
+              <w:rPr>
+                <w:b w:val="false"/>
+                <w:bCs w:val="false"/>
+                <w:sz w:val="17"/>
+                <w:szCs w:val="17"/>
+              </w:rPr>
+              <w:t xml:space="preserve">2020</w:t>
+            </w:r>
+          </w:p>
+        </w:tc>
+        <w:tc>
+          <w:tcPr>
+            <w:tcW w:type="dxa" w:w="1500"/>
+            <w:shd w:fill="F2F2F2" w:val="clear"/>
+            <w:tcMar>
+              <w:top w:type="dxa" w:w="70"/>
+              <w:left w:type="dxa" w:w="110"/>
+              <w:bottom w:type="dxa" w:w="70"/>
+              <w:right w:type="dxa" w:w="110"/>
+            </w:tcMar>
+            <w:vAlign w:val="center"/>
+          </w:tcPr>
+          <w:p>
+            <w:pPr>
+              <w:spacing w:after="0"/>
+            </w:pPr>
+            <w:r>
+              <w:rPr>
+                <w:b w:val="false"/>
+                <w:bCs w:val="false"/>
+                <w:sz w:val="17"/>
+                <w:szCs w:val="17"/>
+              </w:rPr>
+              <w:t xml:space="preserve">189</w:t>
+            </w:r>
+          </w:p>
+        </w:tc>
+        <w:tc>
+          <w:tcPr>
+            <w:tcW w:type="dxa" w:w="1200"/>
+            <w:shd w:fill="F2F2F2" w:val="clear"/>
+            <w:tcMar>
+              <w:top w:type="dxa" w:w="70"/>
+              <w:left w:type="dxa" w:w="110"/>
+              <w:bottom w:type="dxa" w:w="70"/>
+              <w:right w:type="dxa" w:w="110"/>
+            </w:tcMar>
+            <w:vAlign w:val="center"/>
+          </w:tcPr>
+          <w:p>
+            <w:pPr>
+              <w:spacing w:after="0"/>
+            </w:pPr>
+            <w:r>
+              <w:rPr>
+                <w:b w:val="false"/>
+                <w:bCs w:val="false"/>
+                <w:sz w:val="17"/>
+                <w:szCs w:val="17"/>
+              </w:rPr>
+              <w:t xml:space="preserve">704</w:t>
+            </w:r>
+          </w:p>
+        </w:tc>
+        <w:tc>
+          <w:tcPr>
+            <w:tcW w:type="dxa" w:w="1900"/>
+            <w:shd w:fill="F2F2F2" w:val="clear"/>
+            <w:tcMar>
+              <w:top w:type="dxa" w:w="70"/>
+              <w:left w:type="dxa" w:w="110"/>
+              <w:bottom w:type="dxa" w:w="70"/>
+              <w:right w:type="dxa" w:w="110"/>
+            </w:tcMar>
+            <w:vAlign w:val="center"/>
+          </w:tcPr>
+          <w:p>
+            <w:pPr>
+              <w:spacing w:after="0"/>
+            </w:pPr>
+            <w:r>
+              <w:rPr>
+                <w:b w:val="false"/>
+                <w:bCs w:val="false"/>
+                <w:sz w:val="17"/>
+                <w:szCs w:val="17"/>
+              </w:rPr>
+              <w:t xml:space="preserve">22.731</w:t>
+            </w:r>
+          </w:p>
+        </w:tc>
+        <w:tc>
+          <w:tcPr>
+            <w:tcW w:type="dxa" w:w="1900"/>
+            <w:shd w:fill="F2F2F2" w:val="clear"/>
+            <w:tcMar>
+              <w:top w:type="dxa" w:w="70"/>
+              <w:left w:type="dxa" w:w="110"/>
+              <w:bottom w:type="dxa" w:w="70"/>
+              <w:right w:type="dxa" w:w="110"/>
+            </w:tcMar>
+            <w:vAlign w:val="center"/>
+          </w:tcPr>
+          <w:p>
+            <w:pPr>
+              <w:spacing w:after="0"/>
+            </w:pPr>
+            <w:r>
+              <w:rPr>
+                <w:b w:val="false"/>
+                <w:bCs w:val="false"/>
+                <w:sz w:val="17"/>
+                <w:szCs w:val="17"/>
+              </w:rPr>
+              <w:t xml:space="preserve">1.539</w:t>
+            </w:r>
+          </w:p>
+        </w:tc>
+        <w:tc>
+          <w:tcPr>
+            <w:tcW w:type="dxa" w:w="2000"/>
+            <w:shd w:fill="F2F2F2" w:val="clear"/>
+            <w:tcMar>
+              <w:top w:type="dxa" w:w="70"/>
+              <w:left w:type="dxa" w:w="110"/>
+              <w:bottom w:type="dxa" w:w="70"/>
+              <w:right w:type="dxa" w:w="110"/>
+            </w:tcMar>
+            <w:vAlign w:val="center"/>
+          </w:tcPr>
+          <w:p>
+            <w:pPr>
+              <w:spacing w:after="0"/>
+            </w:pPr>
+            <w:r>
+              <w:rPr>
+                <w:b w:val="false"/>
+                <w:bCs w:val="false"/>
+                <w:sz w:val="17"/>
+                <w:szCs w:val="17"/>
+              </w:rPr>
+              <w:t xml:space="preserve">58</w:t>
+            </w:r>
+          </w:p>
+        </w:tc>
+      </w:tr>
+      <w:tr>
+        <w:trPr>
+          <w:cantSplit/>
+        </w:trPr>
+        <w:tc>
+          <w:tcPr>
+            <w:tcW w:type="dxa" w:w="1100"/>
+            <w:shd w:fill="FFFFFF" w:val="clear"/>
+            <w:tcMar>
+              <w:top w:type="dxa" w:w="70"/>
+              <w:left w:type="dxa" w:w="110"/>
+              <w:bottom w:type="dxa" w:w="70"/>
+              <w:right w:type="dxa" w:w="110"/>
+            </w:tcMar>
+            <w:vAlign w:val="center"/>
+          </w:tcPr>
+          <w:p>
+            <w:pPr>
+              <w:spacing w:after="0"/>
+            </w:pPr>
+            <w:r>
+              <w:rPr>
+                <w:b w:val="false"/>
+                <w:bCs w:val="false"/>
+                <w:sz w:val="17"/>
+                <w:szCs w:val="17"/>
+              </w:rPr>
+              <w:t xml:space="preserve">2018</w:t>
+            </w:r>
+          </w:p>
+        </w:tc>
+        <w:tc>
+          <w:tcPr>
+            <w:tcW w:type="dxa" w:w="1500"/>
+            <w:shd w:fill="FFFFFF" w:val="clear"/>
+            <w:tcMar>
+              <w:top w:type="dxa" w:w="70"/>
+              <w:left w:type="dxa" w:w="110"/>
+              <w:bottom w:type="dxa" w:w="70"/>
+              <w:right w:type="dxa" w:w="110"/>
+            </w:tcMar>
+            <w:vAlign w:val="center"/>
+          </w:tcPr>
+          <w:p>
+            <w:pPr>
+              <w:spacing w:after="0"/>
+            </w:pPr>
+            <w:r>
+              <w:rPr>
+                <w:b w:val="false"/>
+                <w:bCs w:val="false"/>
+                <w:sz w:val="17"/>
+                <w:szCs w:val="17"/>
+              </w:rPr>
+              <w:t xml:space="preserve">189</w:t>
+            </w:r>
+          </w:p>
+        </w:tc>
+        <w:tc>
+          <w:tcPr>
+            <w:tcW w:type="dxa" w:w="1200"/>
+            <w:shd w:fill="FFFFFF" w:val="clear"/>
+            <w:tcMar>
+              <w:top w:type="dxa" w:w="70"/>
+              <w:left w:type="dxa" w:w="110"/>
+              <w:bottom w:type="dxa" w:w="70"/>
+              <w:right w:type="dxa" w:w="110"/>
+            </w:tcMar>
+            <w:vAlign w:val="center"/>
+          </w:tcPr>
+          <w:p>
+            <w:pPr>
+              <w:spacing w:after="0"/>
+            </w:pPr>
+            <w:r>
+              <w:rPr>
+                <w:b w:val="false"/>
+                <w:bCs w:val="false"/>
+                <w:sz w:val="17"/>
+                <w:szCs w:val="17"/>
+              </w:rPr>
+              <w:t xml:space="preserve">721</w:t>
+            </w:r>
+          </w:p>
+        </w:tc>
+        <w:tc>
+          <w:tcPr>
+            <w:tcW w:type="dxa" w:w="1900"/>
+            <w:shd w:fill="FFFFFF" w:val="clear"/>
+            <w:tcMar>
+              <w:top w:type="dxa" w:w="70"/>
+              <w:left w:type="dxa" w:w="110"/>
+              <w:bottom w:type="dxa" w:w="70"/>
+              <w:right w:type="dxa" w:w="110"/>
+            </w:tcMar>
+            <w:vAlign w:val="center"/>
+          </w:tcPr>
+          <w:p>
+            <w:pPr>
+              <w:spacing w:after="0"/>
+            </w:pPr>
+            <w:r>
+              <w:rPr>
+                <w:b w:val="false"/>
+                <w:bCs w:val="false"/>
+                <w:sz w:val="17"/>
+                <w:szCs w:val="17"/>
+              </w:rPr>
+              <w:t xml:space="preserve">21.358</w:t>
+            </w:r>
+          </w:p>
+        </w:tc>
+        <w:tc>
+          <w:tcPr>
+            <w:tcW w:type="dxa" w:w="1900"/>
+            <w:shd w:fill="FFFFFF" w:val="clear"/>
+            <w:tcMar>
+              <w:top w:type="dxa" w:w="70"/>
+              <w:left w:type="dxa" w:w="110"/>
+              <w:bottom w:type="dxa" w:w="70"/>
+              <w:right w:type="dxa" w:w="110"/>
+            </w:tcMar>
+            <w:vAlign w:val="center"/>
+          </w:tcPr>
+          <w:p>
+            <w:pPr>
+              <w:spacing w:after="0"/>
+            </w:pPr>
+            <w:r>
+              <w:rPr>
+                <w:b w:val="false"/>
+                <w:bCs w:val="false"/>
+                <w:sz w:val="17"/>
+                <w:szCs w:val="17"/>
+              </w:rPr>
+              <w:t xml:space="preserve">3.477</w:t>
+            </w:r>
+          </w:p>
+        </w:tc>
+        <w:tc>
+          <w:tcPr>
+            <w:tcW w:type="dxa" w:w="2000"/>
+            <w:shd w:fill="FFFFFF" w:val="clear"/>
+            <w:tcMar>
+              <w:top w:type="dxa" w:w="70"/>
+              <w:left w:type="dxa" w:w="110"/>
+              <w:bottom w:type="dxa" w:w="70"/>
+              <w:right w:type="dxa" w:w="110"/>
+            </w:tcMar>
+            <w:vAlign w:val="center"/>
+          </w:tcPr>
+          <w:p>
+            <w:pPr>
+              <w:spacing w:after="0"/>
+            </w:pPr>
+            <w:r>
+              <w:rPr>
+                <w:b w:val="false"/>
+                <w:bCs w:val="false"/>
+                <w:sz w:val="17"/>
+                <w:szCs w:val="17"/>
+              </w:rPr>
+              <w:t xml:space="preserve">29</w:t>
+            </w:r>
+          </w:p>
+        </w:tc>
+      </w:tr>
+    </w:tbl>
+    <w:p>
+      <w:pPr>
+        <w:spacing w:after="80"/>
+      </w:pPr>
+    </w:p>
+    <w:p>
+      <w:pPr>
+        <w:spacing w:after="120"/>
+      </w:pPr>
+      <w:r>
+        <w:t xml:space="preserve">Um local fica fora do desenho sem coordenada, ou com coordenada a mais de 300 m do contorno do município. O contorno é o da qualidade </w:t>
+      </w:r>
+      <w:r>
+        <w:rPr>
+          <w:rFonts w:ascii="Consolas" w:cs="Consolas" w:eastAsia="Consolas" w:hAnsi="Consolas"/>
+          <w:sz w:val="19"/>
+          <w:szCs w:val="19"/>
+        </w:rPr>
+        <w:t xml:space="preserve">maxima</w:t>
+      </w:r>
+      <w:r>
+        <w:t xml:space="preserve"> do IBGE (191 municípios, 1,5 MB, em </w:t>
+      </w:r>
+      <w:r>
+        <w:rPr>
+          <w:rFonts w:ascii="Consolas" w:cs="Consolas" w:eastAsia="Consolas" w:hAnsi="Consolas"/>
+          <w:sz w:val="19"/>
+          <w:szCs w:val="19"/>
+        </w:rPr>
+        <w:t xml:space="preserve">lumen_eleicoes/dados/geo/mu/</w:t>
+      </w:r>
+      <w:r>
+        <w:t xml:space="preserve">): na qualidade </w:t>
+      </w:r>
+      <w:r>
+        <w:rPr>
+          <w:rFonts w:ascii="Consolas" w:cs="Consolas" w:eastAsia="Consolas" w:hAnsi="Consolas"/>
+          <w:sz w:val="19"/>
+          <w:szCs w:val="19"/>
+        </w:rPr>
+        <w:t xml:space="preserve">minima</w:t>
+      </w:r>
+      <w:r>
+        <w:t xml:space="preserve"> do mapa da UF, Taboão da Serra (SP) tem 4 pontos e Olinda (PE), 6, e um terço dos locais de Olinda caía no vizinho. Os eleitores dos locais fora do desenho continuam na tabela das zonas.</w:t>
+      </w:r>
+    </w:p>
+    <w:tbl>
+      <w:tblPr>
+        <w:tblW w:type="dxa" w:w="9600"/>
+        <w:tblBorders>
+          <w:top w:val="single" w:color="D0D0D0" w:sz="4"/>
+          <w:left w:val="single" w:color="2E75B6" w:sz="12"/>
+          <w:bottom w:val="single" w:color="D0D0D0" w:sz="4"/>
+          <w:right w:val="single" w:color="D0D0D0" w:sz="4"/>
+          <w:insideH w:val="none" w:color="FFFFFF" w:sz="0"/>
+          <w:insideV w:val="none" w:color="FFFFFF" w:sz="0"/>
+        </w:tblBorders>
+      </w:tblPr>
+      <w:tblGrid>
+        <w:gridCol w:w="9600"/>
+      </w:tblGrid>
+      <w:tr>
+        <w:tc>
+          <w:tcPr>
+            <w:tcW w:type="dxa" w:w="9600"/>
+            <w:tcBorders>
+              <w:top w:val="none" w:color="FFFFFF" w:sz="0"/>
+              <w:left w:val="none" w:color="FFFFFF" w:sz="0"/>
+              <w:bottom w:val="none" w:color="FFFFFF" w:sz="0"/>
+              <w:right w:val="none" w:color="FFFFFF" w:sz="0"/>
+            </w:tcBorders>
+            <w:shd w:fill="F5F5F5" w:val="clear"/>
+            <w:tcMar>
+              <w:top w:type="dxa" w:w="20"/>
+              <w:left w:type="dxa" w:w="120"/>
+              <w:bottom w:type="dxa" w:w="20"/>
+              <w:right w:type="dxa" w:w="100"/>
+            </w:tcMar>
+          </w:tcPr>
+          <w:p>
+            <w:pPr>
+              <w:spacing w:after="0"/>
+            </w:pPr>
+            <w:r>
+              <w:rPr>
+                <w:rFonts w:ascii="Consolas" w:cs="Consolas" w:eastAsia="Consolas" w:hAnsi="Consolas"/>
+                <w:sz w:val="18"/>
+                <w:szCs w:val="18"/>
+              </w:rPr>
+              <w:t xml:space="preserve">geo/zonas-&lt;ano&gt;/indice.json        código IBGE → número de zonas, dos municípios com mais de uma</w:t>
+            </w:r>
+          </w:p>
+        </w:tc>
+      </w:tr>
+      <w:tr>
+        <w:tc>
+          <w:tcPr>
+            <w:tcW w:type="dxa" w:w="9600"/>
+            <w:tcBorders>
+              <w:top w:val="none" w:color="FFFFFF" w:sz="0"/>
+              <w:left w:val="none" w:color="FFFFFF" w:sz="0"/>
+              <w:bottom w:val="none" w:color="FFFFFF" w:sz="0"/>
+              <w:right w:val="none" w:color="FFFFFF" w:sz="0"/>
+            </w:tcBorders>
+            <w:shd w:fill="F5F5F5" w:val="clear"/>
+            <w:tcMar>
+              <w:top w:type="dxa" w:w="20"/>
+              <w:left w:type="dxa" w:w="120"/>
+              <w:bottom w:type="dxa" w:w="20"/>
+              <w:right w:type="dxa" w:w="100"/>
+            </w:tcMar>
+          </w:tcPr>
+          <w:p>
+            <w:pPr>
+              <w:spacing w:after="0"/>
+            </w:pPr>
+            <w:r>
+              <w:rPr>
+                <w:rFonts w:ascii="Consolas" w:cs="Consolas" w:eastAsia="Consolas" w:hAnsi="Consolas"/>
+                <w:sz w:val="18"/>
+                <w:szCs w:val="18"/>
+              </w:rPr>
+              <w:t xml:space="preserve">geo/zonas-&lt;ano&gt;/mu-&lt;ibge&gt;.json     zonas (eleitores, locais) e locais [longitude, latitude, zona, eleitores, nome]</w:t>
+            </w:r>
+          </w:p>
+        </w:tc>
+      </w:tr>
+      <w:tr>
+        <w:tc>
+          <w:tcPr>
+            <w:tcW w:type="dxa" w:w="9600"/>
+            <w:tcBorders>
+              <w:top w:val="none" w:color="FFFFFF" w:sz="0"/>
+              <w:left w:val="none" w:color="FFFFFF" w:sz="0"/>
+              <w:bottom w:val="none" w:color="FFFFFF" w:sz="0"/>
+              <w:right w:val="none" w:color="FFFFFF" w:sz="0"/>
+            </w:tcBorders>
+            <w:shd w:fill="F5F5F5" w:val="clear"/>
+            <w:tcMar>
+              <w:top w:type="dxa" w:w="20"/>
+              <w:left w:type="dxa" w:w="120"/>
+              <w:bottom w:type="dxa" w:w="20"/>
+              <w:right w:type="dxa" w:w="100"/>
+            </w:tcMar>
+          </w:tcPr>
+          <w:p>
+            <w:pPr>
+              <w:spacing w:after="0"/>
+            </w:pPr>
+            <w:r>
+              <w:rPr>
+                <w:rFonts w:ascii="Consolas" w:cs="Consolas" w:eastAsia="Consolas" w:hAnsi="Consolas"/>
+                <w:sz w:val="18"/>
+                <w:szCs w:val="18"/>
+              </w:rPr>
+              <w:t xml:space="preserve">geo/mu/&lt;ibge&gt;.json                 contorno do município na qualidade maxima do IBGE</w:t>
+            </w:r>
+          </w:p>
+        </w:tc>
+      </w:tr>
+    </w:tbl>
+    <w:p>
+      <w:pPr>
+        <w:spacing w:after="120"/>
+      </w:pPr>
+      <w:r>
+        <w:t xml:space="preserve">O servidor de malhas do IBGE envia só o certificado final, sem o intermediário (Sectigo Public Server Authentication CA DV R36). O navegador completa a cadeia; o Python não, e </w:t>
+      </w:r>
+      <w:r>
+        <w:rPr>
+          <w:rFonts w:ascii="Consolas" w:cs="Consolas" w:eastAsia="Consolas" w:hAnsi="Consolas"/>
+          <w:sz w:val="19"/>
+          <w:szCs w:val="19"/>
+        </w:rPr>
+        <w:t xml:space="preserve">lumen eleicoes mapas</w:t>
+      </w:r>
+      <w:r>
+        <w:t xml:space="preserve"> falha com </w:t>
+      </w:r>
+      <w:r>
+        <w:rPr>
+          <w:rFonts w:ascii="Consolas" w:cs="Consolas" w:eastAsia="Consolas" w:hAnsi="Consolas"/>
+          <w:sz w:val="19"/>
+          <w:szCs w:val="19"/>
+        </w:rPr>
+        <w:t xml:space="preserve">unable to get local issuer certificate</w:t>
+      </w:r>
+      <w:r>
+        <w:t xml:space="preserve"> numa máquina sem o intermediário instalado. Os contornos embutidos foram baixados em 15/10/2026 com a cadeia completada pelo intermediário publicado no crt.sh.</w:t>
       </w:r>
     </w:p>
     <w:p>
@@ -9858,6 +11200,180 @@
                 <w:szCs w:val="17"/>
               </w:rPr>
               <w:t xml:space="preserve">candidatos (número, nome, partido, cor) e pontos (instante, % de seções, votos por número)</w:t>
+            </w:r>
+          </w:p>
+        </w:tc>
+      </w:tr>
+      <w:tr>
+        <w:trPr>
+          <w:cantSplit/>
+        </w:trPr>
+        <w:tc>
+          <w:tcPr>
+            <w:tcW w:type="dxa" w:w="1500"/>
+            <w:shd w:fill="F2F2F2" w:val="clear"/>
+            <w:tcMar>
+              <w:top w:type="dxa" w:w="70"/>
+              <w:left w:type="dxa" w:w="110"/>
+              <w:bottom w:type="dxa" w:w="70"/>
+              <w:right w:type="dxa" w:w="110"/>
+            </w:tcMar>
+            <w:vAlign w:val="center"/>
+          </w:tcPr>
+          <w:p>
+            <w:pPr>
+              <w:spacing w:after="0"/>
+            </w:pPr>
+            <w:r>
+              <w:rPr>
+                <w:rFonts w:ascii="Consolas" w:cs="Consolas" w:eastAsia="Consolas" w:hAnsi="Consolas"/>
+                <w:b w:val="false"/>
+                <w:bCs w:val="false"/>
+                <w:sz w:val="17"/>
+                <w:szCs w:val="17"/>
+              </w:rPr>
+              <w:t xml:space="preserve">zonas</w:t>
+            </w:r>
+          </w:p>
+        </w:tc>
+        <w:tc>
+          <w:tcPr>
+            <w:tcW w:type="dxa" w:w="3300"/>
+            <w:shd w:fill="F2F2F2" w:val="clear"/>
+            <w:tcMar>
+              <w:top w:type="dxa" w:w="70"/>
+              <w:left w:type="dxa" w:w="110"/>
+              <w:bottom w:type="dxa" w:w="70"/>
+              <w:right w:type="dxa" w:w="110"/>
+            </w:tcMar>
+            <w:vAlign w:val="center"/>
+          </w:tcPr>
+          <w:p>
+            <w:pPr>
+              <w:spacing w:after="0"/>
+            </w:pPr>
+            <w:r>
+              <w:rPr>
+                <w:b w:val="false"/>
+                <w:bCs w:val="false"/>
+                <w:sz w:val="17"/>
+                <w:szCs w:val="17"/>
+              </w:rPr>
+              <w:t xml:space="preserve">Município com mais de uma zona eleitoral (geo/zonas-&lt;ano&gt;/)</w:t>
+            </w:r>
+          </w:p>
+        </w:tc>
+        <w:tc>
+          <w:tcPr>
+            <w:tcW w:type="dxa" w:w="4800"/>
+            <w:shd w:fill="F2F2F2" w:val="clear"/>
+            <w:tcMar>
+              <w:top w:type="dxa" w:w="70"/>
+              <w:left w:type="dxa" w:w="110"/>
+              <w:bottom w:type="dxa" w:w="70"/>
+              <w:right w:type="dxa" w:w="110"/>
+            </w:tcMar>
+            <w:vAlign w:val="center"/>
+          </w:tcPr>
+          <w:p>
+            <w:pPr>
+              <w:spacing w:after="0"/>
+            </w:pPr>
+            <w:r>
+              <w:rPr>
+                <w:b w:val="false"/>
+                <w:bCs w:val="false"/>
+                <w:sz w:val="17"/>
+                <w:szCs w:val="17"/>
+              </w:rPr>
+              <w:t xml:space="preserve">municipio, zonas (zona, locais, eleitores), locais [longitude, latitude, zona, eleitores, nome], descartados, origem</w:t>
+            </w:r>
+          </w:p>
+        </w:tc>
+      </w:tr>
+      <w:tr>
+        <w:trPr>
+          <w:cantSplit/>
+        </w:trPr>
+        <w:tc>
+          <w:tcPr>
+            <w:tcW w:type="dxa" w:w="1500"/>
+            <w:shd w:fill="FFFFFF" w:val="clear"/>
+            <w:tcMar>
+              <w:top w:type="dxa" w:w="70"/>
+              <w:left w:type="dxa" w:w="110"/>
+              <w:bottom w:type="dxa" w:w="70"/>
+              <w:right w:type="dxa" w:w="110"/>
+            </w:tcMar>
+            <w:vAlign w:val="center"/>
+          </w:tcPr>
+          <w:p>
+            <w:pPr>
+              <w:spacing w:after="0"/>
+            </w:pPr>
+            <w:r>
+              <w:rPr>
+                <w:rFonts w:ascii="Consolas" w:cs="Consolas" w:eastAsia="Consolas" w:hAnsi="Consolas"/>
+                <w:b w:val="false"/>
+                <w:bCs w:val="false"/>
+                <w:sz w:val="17"/>
+                <w:szCs w:val="17"/>
+              </w:rPr>
+              <w:t xml:space="preserve">zonas-indice</w:t>
+            </w:r>
+          </w:p>
+        </w:tc>
+        <w:tc>
+          <w:tcPr>
+            <w:tcW w:type="dxa" w:w="3300"/>
+            <w:shd w:fill="FFFFFF" w:val="clear"/>
+            <w:tcMar>
+              <w:top w:type="dxa" w:w="70"/>
+              <w:left w:type="dxa" w:w="110"/>
+              <w:bottom w:type="dxa" w:w="70"/>
+              <w:right w:type="dxa" w:w="110"/>
+            </w:tcMar>
+            <w:vAlign w:val="center"/>
+          </w:tcPr>
+          <w:p>
+            <w:pPr>
+              <w:spacing w:after="0"/>
+            </w:pPr>
+            <w:r>
+              <w:rPr>
+                <w:b w:val="false"/>
+                <w:bCs w:val="false"/>
+                <w:sz w:val="17"/>
+                <w:szCs w:val="17"/>
+              </w:rPr>
+              <w:t xml:space="preserve">Índice do mapa das zonas de um ano</w:t>
+            </w:r>
+          </w:p>
+        </w:tc>
+        <w:tc>
+          <w:tcPr>
+            <w:tcW w:type="dxa" w:w="4800"/>
+            <w:shd w:fill="FFFFFF" w:val="clear"/>
+            <w:tcMar>
+              <w:top w:type="dxa" w:w="70"/>
+              <w:left w:type="dxa" w:w="110"/>
+              <w:bottom w:type="dxa" w:w="70"/>
+              <w:right w:type="dxa" w:w="110"/>
+            </w:tcMar>
+            <w:vAlign w:val="center"/>
+          </w:tcPr>
+          <w:p>
+            <w:pPr>
+              <w:spacing w:after="0"/>
+            </w:pPr>
+            <w:r>
+              <w:rPr>
+                <w:b w:val="false"/>
+                <w:bCs w:val="false"/>
+                <w:sz w:val="17"/>
+                <w:szCs w:val="17"/>
+              </w:rPr>
+              <w:t xml:space="preserve">municipios (código IBGE → número de zonas), origem</w:t>
             </w:r>
           </w:p>
         </w:tc>
@@ -11491,7 +13007,7 @@
                 <w:sz w:val="17"/>
                 <w:szCs w:val="17"/>
               </w:rPr>
-              <w:t xml:space="preserve">Pinta quem lidera cada parte; dica com líder, percentual, margem e seções totalizadas; contorno em destaque na área sob o cursor; clique desce de nível (o clique que termina um arrasto não desce). Aproxima até 16 vezes (seção 1.2). Partes sem área no mapa atual viram botões abaixo dele (no Brasil) ou uma nota (na UF).</w:t>
+              <w:t xml:space="preserve">Pinta quem lidera cada parte; dica com líder, percentual, margem e seções totalizadas; contorno em destaque na área sob o cursor; clique desce de nível (o clique que termina um arrasto não desce). Aproxima até 16 vezes (seção 1.2), e mais com um município aberto. Partes sem área no mapa atual viram botões abaixo dele (no Brasil) ou uma nota (na UF).</w:t>
             </w:r>
           </w:p>
         </w:tc>
@@ -11523,7 +13039,7 @@
                 <w:sz w:val="17"/>
                 <w:szCs w:val="17"/>
               </w:rPr>
-              <w:t xml:space="preserve">Eleições de 1933 a 1990</w:t>
+              <w:t xml:space="preserve">Município aberto</w:t>
             </w:r>
           </w:p>
         </w:tc>
@@ -11550,7 +13066,7 @@
                 <w:sz w:val="17"/>
                 <w:szCs w:val="17"/>
               </w:rPr>
-              <w:t xml:space="preserve">Grupo próprio no seletor; sem mapa de municípios nem evolução da apuração; número de urna oculto quando não existia; a busca por município leva ao estado.</w:t>
+              <w:t xml:space="preserve">O mapa da UF voa até o município (cerca de meio segundo; sem animação para quem pede menos movimento) e apaga os vizinhos, que continuam clicáveis. Com mais de uma zona, mostra as zonas (seção 8.3). Esc solta a zona escolhida e, de novo, volta para a UF.</w:t>
             </w:r>
           </w:p>
         </w:tc>
@@ -11582,7 +13098,7 @@
                 <w:sz w:val="17"/>
                 <w:szCs w:val="17"/>
               </w:rPr>
-              <w:t xml:space="preserve">Panorama</w:t>
+              <w:t xml:space="preserve">Tabela das zonas</w:t>
             </w:r>
           </w:p>
         </w:tc>
@@ -11609,7 +13125,7 @@
                 <w:sz w:val="17"/>
                 <w:szCs w:val="17"/>
               </w:rPr>
-              <w:t xml:space="preserve">Placar por partido com eleitos e partes lideradas; nos proporcionais, a bancada de cada partido na parte.</w:t>
+              <w:t xml:space="preserve">Zona, quem lidera, percentual, eleitores e locais; o cursor numa linha destaca a zona no mapa e o clique fixa o destaque. Ao vivo, só eleitores e locais.</w:t>
             </w:r>
           </w:p>
         </w:tc>
@@ -11641,7 +13157,7 @@
                 <w:sz w:val="17"/>
                 <w:szCs w:val="17"/>
               </w:rPr>
-              <w:t xml:space="preserve">Evolução</w:t>
+              <w:t xml:space="preserve">Navegação</w:t>
             </w:r>
           </w:p>
         </w:tc>
@@ -11668,7 +13184,7 @@
                 <w:sz w:val="17"/>
                 <w:szCs w:val="17"/>
               </w:rPr>
-              <w:t xml:space="preserve">Eixo horizontal em % de seções totalizadas (não o relógio): mostra como a vantagem mudou conforme as urnas chegaram. Um só eixo vertical, em % dos válidos; quatro séries.</w:t>
+              <w:t xml:space="preserve">A tela anterior fica, esmaecida, até o feed novo chegar; feeds de eleições encerradas ficam em memória e o cursor parado numa área já pré-carrega o que o clique abre.</w:t>
             </w:r>
           </w:p>
         </w:tc>
@@ -11700,7 +13216,7 @@
                 <w:sz w:val="17"/>
                 <w:szCs w:val="17"/>
               </w:rPr>
-              <w:t xml:space="preserve">Faixas</w:t>
+              <w:t xml:space="preserve">Eleições de 1933 a 1990</w:t>
             </w:r>
           </w:p>
         </w:tc>
@@ -11727,7 +13243,7 @@
                 <w:sz w:val="17"/>
                 <w:szCs w:val="17"/>
               </w:rPr>
-              <w:t xml:space="preserve">Simulação, amostra e ressalvas da fonte aparecem antes dos números.</w:t>
+              <w:t xml:space="preserve">Grupo próprio no seletor; sem mapa de municípios nem evolução da apuração; número de urna oculto quando não existia; a busca por município leva ao estado.</w:t>
             </w:r>
           </w:p>
         </w:tc>
@@ -11759,7 +13275,7 @@
                 <w:sz w:val="17"/>
                 <w:szCs w:val="17"/>
               </w:rPr>
-              <w:t xml:space="preserve">Rodapé</w:t>
+              <w:t xml:space="preserve">Panorama</w:t>
             </w:r>
           </w:p>
         </w:tc>
@@ -11786,7 +13302,7 @@
                 <w:sz w:val="17"/>
                 <w:szCs w:val="17"/>
               </w:rPr>
-              <w:t xml:space="preserve">Fonte, link para o arquivo original e SHA-256 da cópia guardada.</w:t>
+              <w:t xml:space="preserve">Placar por partido com eleitos e partes lideradas; nos proporcionais, a bancada de cada partido na parte.</w:t>
             </w:r>
           </w:p>
         </w:tc>
@@ -11818,7 +13334,7 @@
                 <w:sz w:val="17"/>
                 <w:szCs w:val="17"/>
               </w:rPr>
-              <w:t xml:space="preserve">Atualização</w:t>
+              <w:t xml:space="preserve">Evolução</w:t>
             </w:r>
           </w:p>
         </w:tc>
@@ -11845,7 +13361,7 @@
                 <w:sz w:val="17"/>
                 <w:szCs w:val="17"/>
               </w:rPr>
-              <w:t xml:space="preserve">Ao vivo, o portal relê o feed a cada 15 s com no-cache; o servidor responde 304 quando nada mudou. Eleição passada não se atualiza sozinha.</w:t>
+              <w:t xml:space="preserve">Eixo horizontal em % de seções totalizadas (não o relógio): mostra como a vantagem mudou conforme as urnas chegaram. Um só eixo vertical, em % dos válidos; quatro séries.</w:t>
             </w:r>
           </w:p>
         </w:tc>
@@ -11877,7 +13393,7 @@
                 <w:sz w:val="17"/>
                 <w:szCs w:val="17"/>
               </w:rPr>
-              <w:t xml:space="preserve">URL</w:t>
+              <w:t xml:space="preserve">Faixas</w:t>
             </w:r>
           </w:p>
         </w:tc>
@@ -11904,7 +13420,7 @@
                 <w:sz w:val="17"/>
                 <w:szCs w:val="17"/>
               </w:rPr>
-              <w:t xml:space="preserve">?e=&lt;eleição&gt;&amp;c=&lt;cargo&gt;&amp;a=&lt;abrangência&gt;&amp;tv=1 — todo recorte é um link.</w:t>
+              <w:t xml:space="preserve">Simulação, amostra e ressalvas da fonte aparecem antes dos números.</w:t>
             </w:r>
           </w:p>
         </w:tc>
@@ -11936,7 +13452,7 @@
                 <w:sz w:val="17"/>
                 <w:szCs w:val="17"/>
               </w:rPr>
-              <w:t xml:space="preserve">Busca</w:t>
+              <w:t xml:space="preserve">Rodapé</w:t>
             </w:r>
           </w:p>
         </w:tc>
@@ -11963,7 +13479,7 @@
                 <w:sz w:val="17"/>
                 <w:szCs w:val="17"/>
               </w:rPr>
-              <w:t xml:space="preserve">Ctrl+K: UFs e municípios pelo nome, sem acento e sem caixa.</w:t>
+              <w:t xml:space="preserve">Fonte, link para o arquivo original e SHA-256 da cópia guardada.</w:t>
             </w:r>
           </w:p>
         </w:tc>
@@ -11995,7 +13511,7 @@
                 <w:sz w:val="17"/>
                 <w:szCs w:val="17"/>
               </w:rPr>
-              <w:t xml:space="preserve">Celular</w:t>
+              <w:t xml:space="preserve">Atualização</w:t>
             </w:r>
           </w:p>
         </w:tc>
@@ -12022,7 +13538,7 @@
                 <w:sz w:val="17"/>
                 <w:szCs w:val="17"/>
               </w:rPr>
-              <w:t xml:space="preserve">Lista de candidatos antes do mapa; cabeçalho compacto.</w:t>
+              <w:t xml:space="preserve">Ao vivo, o portal relê o feed a cada 15 s com no-cache; o servidor responde 304 quando nada mudou. Eleição passada não se atualiza sozinha.</w:t>
             </w:r>
           </w:p>
         </w:tc>
@@ -12054,7 +13570,7 @@
                 <w:sz w:val="17"/>
                 <w:szCs w:val="17"/>
               </w:rPr>
-              <w:t xml:space="preserve">Modo TV</w:t>
+              <w:t xml:space="preserve">URL</w:t>
             </w:r>
           </w:p>
         </w:tc>
@@ -12081,12 +13597,289 @@
                 <w:sz w:val="17"/>
                 <w:szCs w:val="17"/>
               </w:rPr>
+              <w:t xml:space="preserve">?e=&lt;eleição&gt;&amp;c=&lt;cargo&gt;&amp;a=&lt;abrangência&gt;&amp;tv=1 — todo recorte é um link.</w:t>
+            </w:r>
+          </w:p>
+        </w:tc>
+      </w:tr>
+      <w:tr>
+        <w:trPr>
+          <w:cantSplit/>
+        </w:trPr>
+        <w:tc>
+          <w:tcPr>
+            <w:tcW w:type="dxa" w:w="2600"/>
+            <w:shd w:fill="FFFFFF" w:val="clear"/>
+            <w:tcMar>
+              <w:top w:type="dxa" w:w="70"/>
+              <w:left w:type="dxa" w:w="110"/>
+              <w:bottom w:type="dxa" w:w="70"/>
+              <w:right w:type="dxa" w:w="110"/>
+            </w:tcMar>
+            <w:vAlign w:val="center"/>
+          </w:tcPr>
+          <w:p>
+            <w:pPr>
+              <w:spacing w:after="0"/>
+            </w:pPr>
+            <w:r>
+              <w:rPr>
+                <w:b/>
+                <w:bCs/>
+                <w:sz w:val="17"/>
+                <w:szCs w:val="17"/>
+              </w:rPr>
+              <w:t xml:space="preserve">Busca</w:t>
+            </w:r>
+          </w:p>
+        </w:tc>
+        <w:tc>
+          <w:tcPr>
+            <w:tcW w:type="dxa" w:w="7000"/>
+            <w:shd w:fill="FFFFFF" w:val="clear"/>
+            <w:tcMar>
+              <w:top w:type="dxa" w:w="70"/>
+              <w:left w:type="dxa" w:w="110"/>
+              <w:bottom w:type="dxa" w:w="70"/>
+              <w:right w:type="dxa" w:w="110"/>
+            </w:tcMar>
+            <w:vAlign w:val="center"/>
+          </w:tcPr>
+          <w:p>
+            <w:pPr>
+              <w:spacing w:after="0"/>
+            </w:pPr>
+            <w:r>
+              <w:rPr>
+                <w:b w:val="false"/>
+                <w:bCs w:val="false"/>
+                <w:sz w:val="17"/>
+                <w:szCs w:val="17"/>
+              </w:rPr>
+              <w:t xml:space="preserve">Ctrl+K: UFs e municípios pelo nome, sem acento e sem caixa.</w:t>
+            </w:r>
+          </w:p>
+        </w:tc>
+      </w:tr>
+      <w:tr>
+        <w:trPr>
+          <w:cantSplit/>
+        </w:trPr>
+        <w:tc>
+          <w:tcPr>
+            <w:tcW w:type="dxa" w:w="2600"/>
+            <w:shd w:fill="F2F2F2" w:val="clear"/>
+            <w:tcMar>
+              <w:top w:type="dxa" w:w="70"/>
+              <w:left w:type="dxa" w:w="110"/>
+              <w:bottom w:type="dxa" w:w="70"/>
+              <w:right w:type="dxa" w:w="110"/>
+            </w:tcMar>
+            <w:vAlign w:val="center"/>
+          </w:tcPr>
+          <w:p>
+            <w:pPr>
+              <w:spacing w:after="0"/>
+            </w:pPr>
+            <w:r>
+              <w:rPr>
+                <w:b/>
+                <w:bCs/>
+                <w:sz w:val="17"/>
+                <w:szCs w:val="17"/>
+              </w:rPr>
+              <w:t xml:space="preserve">Celular</w:t>
+            </w:r>
+          </w:p>
+        </w:tc>
+        <w:tc>
+          <w:tcPr>
+            <w:tcW w:type="dxa" w:w="7000"/>
+            <w:shd w:fill="F2F2F2" w:val="clear"/>
+            <w:tcMar>
+              <w:top w:type="dxa" w:w="70"/>
+              <w:left w:type="dxa" w:w="110"/>
+              <w:bottom w:type="dxa" w:w="70"/>
+              <w:right w:type="dxa" w:w="110"/>
+            </w:tcMar>
+            <w:vAlign w:val="center"/>
+          </w:tcPr>
+          <w:p>
+            <w:pPr>
+              <w:spacing w:after="0"/>
+            </w:pPr>
+            <w:r>
+              <w:rPr>
+                <w:b w:val="false"/>
+                <w:bCs w:val="false"/>
+                <w:sz w:val="17"/>
+                <w:szCs w:val="17"/>
+              </w:rPr>
+              <w:t xml:space="preserve">Lista de candidatos antes do mapa; cabeçalho compacto.</w:t>
+            </w:r>
+          </w:p>
+        </w:tc>
+      </w:tr>
+      <w:tr>
+        <w:trPr>
+          <w:cantSplit/>
+        </w:trPr>
+        <w:tc>
+          <w:tcPr>
+            <w:tcW w:type="dxa" w:w="2600"/>
+            <w:shd w:fill="FFFFFF" w:val="clear"/>
+            <w:tcMar>
+              <w:top w:type="dxa" w:w="70"/>
+              <w:left w:type="dxa" w:w="110"/>
+              <w:bottom w:type="dxa" w:w="70"/>
+              <w:right w:type="dxa" w:w="110"/>
+            </w:tcMar>
+            <w:vAlign w:val="center"/>
+          </w:tcPr>
+          <w:p>
+            <w:pPr>
+              <w:spacing w:after="0"/>
+            </w:pPr>
+            <w:r>
+              <w:rPr>
+                <w:b/>
+                <w:bCs/>
+                <w:sz w:val="17"/>
+                <w:szCs w:val="17"/>
+              </w:rPr>
+              <w:t xml:space="preserve">Modo TV</w:t>
+            </w:r>
+          </w:p>
+        </w:tc>
+        <w:tc>
+          <w:tcPr>
+            <w:tcW w:type="dxa" w:w="7000"/>
+            <w:shd w:fill="FFFFFF" w:val="clear"/>
+            <w:tcMar>
+              <w:top w:type="dxa" w:w="70"/>
+              <w:left w:type="dxa" w:w="110"/>
+              <w:bottom w:type="dxa" w:w="70"/>
+              <w:right w:type="dxa" w:w="110"/>
+            </w:tcMar>
+            <w:vAlign w:val="center"/>
+          </w:tcPr>
+          <w:p>
+            <w:pPr>
+              <w:spacing w:after="0"/>
+            </w:pPr>
+            <w:r>
+              <w:rPr>
+                <w:b w:val="false"/>
+                <w:bCs w:val="false"/>
+                <w:sz w:val="17"/>
+                <w:szCs w:val="17"/>
+              </w:rPr>
               <w:t xml:space="preserve">Fundo escuro, tipografia grande, seis candidatos, sem controles.</w:t>
             </w:r>
           </w:p>
         </w:tc>
       </w:tr>
     </w:tbl>
+    <w:p>
+      <w:pPr>
+        <w:pStyle w:val="Heading2"/>
+        <w:keepNext/>
+        <w:keepLines/>
+        <w:spacing w:after="120" w:before="280"/>
+      </w:pPr>
+      <w:r>
+        <w:t xml:space="preserve">8.3 Zonas eleitorais no mapa do município (ADR-029)</w:t>
+      </w:r>
+    </w:p>
+    <w:p>
+      <w:pPr>
+        <w:spacing w:after="120"/>
+      </w:pPr>
+      <w:r>
+        <w:t xml:space="preserve">Cada local de votação fica com a área mais perto dele (diagrama de Voronoi, calculado no portal, </w:t>
+      </w:r>
+      <w:r>
+        <w:rPr>
+          <w:rFonts w:ascii="Consolas" w:cs="Consolas" w:eastAsia="Consolas" w:hAnsi="Consolas"/>
+          <w:sz w:val="19"/>
+          <w:szCs w:val="19"/>
+        </w:rPr>
+        <w:t xml:space="preserve">src/lib/voronoi.ts</w:t>
+      </w:r>
+      <w:r>
+        <w:t xml:space="preserve">), e a zona é a soma das áreas dos seus locais, recortada pelo contorno do município. Quando o mesmo prédio é local de duas zonas, o ponto fica com a que tem mais eleitores ali. A cor da zona é a de quem lidera nela, com a regra da seção 8.1; ao vivo, as zonas ficam sem cor de resultado, separadas pelas fronteiras. Os locais aparecem como pontos e os números das zonas, por cima; onde não cabem todos, ficam os das zonas com mais eleitores, e aproximar mostra o resto. Com os 2 mil locais da capital paulista, o cálculo leva perto de 30 ms.</w:t>
+      </w:r>
+    </w:p>
+    <w:p>
+      <w:pPr>
+        <w:spacing w:after="120"/>
+      </w:pPr>
+      <w:r>
+        <w:t xml:space="preserve">Embaixo do mapa, sempre, a nota de método: o contorno é aproximado, vem dos locais de votação do ano da eleição, a Justiça Eleitoral não publica os limites das zonas, e quantos locais ficaram fora do desenho. De 1994 a 2016 não há locais com coordenada: o resultado por zona aparece só na tabela.</w:t>
+      </w:r>
+    </w:p>
+    <w:p>
+      <w:pPr>
+        <w:spacing w:after="70" w:before="140" w:line="240" w:lineRule="auto"/>
+        <w:jc w:val="center"/>
+      </w:pPr>
+      <w:r>
+        <w:drawing>
+          <wp:inline distT="0" distB="0" distL="0" distR="0">
+            <wp:extent cx="5334000" cy="4705350"/>
+            <wp:effectExtent t="0" r="0" b="0" l="0"/>
+            <wp:docPr id="8" name="" descr="" title=""/>
+            <wp:cNvGraphicFramePr>
+              <a:graphicFrameLocks xmlns:a="http://schemas.openxmlformats.org/drawingml/2006/main" noChangeAspect="1"/>
+            </wp:cNvGraphicFramePr>
+            <a:graphic xmlns:a="http://schemas.openxmlformats.org/drawingml/2006/main">
+              <a:graphicData uri="http://schemas.openxmlformats.org/drawingml/2006/picture">
+                <pic:pic xmlns:pic="http://schemas.openxmlformats.org/drawingml/2006/picture">
+                  <pic:nvPicPr>
+                    <pic:cNvPr id="0" name="" descr=""/>
+                    <pic:cNvPicPr>
+                      <a:picLocks noChangeAspect="1" noChangeArrowheads="1"/>
+                    </pic:cNvPicPr>
+                  </pic:nvPicPr>
+                  <pic:blipFill>
+                    <a:blip r:embed="rId16" cstate="none"/>
+                    <a:srcRect/>
+                    <a:stretch>
+                      <a:fillRect/>
+                    </a:stretch>
+                  </pic:blipFill>
+                  <pic:spPr bwMode="auto">
+                    <a:xfrm>
+                      <a:off x="0" y="0"/>
+                      <a:ext cx="5334000" cy="4705350"/>
+                    </a:xfrm>
+                    <a:prstGeom prst="rect">
+                      <a:avLst/>
+                    </a:prstGeom>
+                  </pic:spPr>
+                </pic:pic>
+              </a:graphicData>
+            </a:graphic>
+          </wp:inline>
+        </w:drawing>
+      </w:r>
+    </w:p>
+    <w:p>
+      <w:pPr>
+        <w:spacing w:after="200"/>
+        <w:jc w:val="center"/>
+      </w:pPr>
+      <w:r>
+        <w:rPr>
+          <w:i/>
+          <w:iCs/>
+          <w:color w:val="000000"/>
+          <w:sz w:val="17"/>
+          <w:szCs w:val="17"/>
+        </w:rPr>
+        <w:t xml:space="preserve">Figura 8. Presidente, 1º turno de 2026, município de São Paulo: as 57 zonas eleitorais, os locais de votação e a dica da zona 5.</w:t>
+      </w:r>
+    </w:p>
     <w:p>
       <w:pPr>
         <w:pStyle w:val="Heading1"/>
@@ -12617,7 +14410,7 @@
                 <w:sz w:val="17"/>
                 <w:szCs w:val="17"/>
               </w:rPr>
-              <w:t xml:space="preserve">--sem-ao-vivo / --sem-historico / --sem-portal</w:t>
+              <w:t xml:space="preserve">--sem-ao-vivo / --sem-historico / --sem-portal / --sem-zonas</w:t>
             </w:r>
           </w:p>
         </w:tc>
@@ -12644,7 +14437,7 @@
                 <w:sz w:val="17"/>
                 <w:szCs w:val="17"/>
               </w:rPr>
-              <w:t xml:space="preserve">Pula a etapa correspondente</w:t>
+              <w:t xml:space="preserve">Pula a etapa correspondente (sem o histórico, as zonas também ficam de fora)</w:t>
             </w:r>
           </w:p>
         </w:tc>
@@ -15250,7 +17043,7 @@
                 <w:sz w:val="17"/>
                 <w:szCs w:val="17"/>
               </w:rPr>
-              <w:t xml:space="preserve">lumen eleicoes ao-vivo --eleicao &lt;id&gt; [--nuvem]</w:t>
+              <w:t xml:space="preserve">lumen eleicoes zonas [--anos]</w:t>
             </w:r>
           </w:p>
         </w:tc>
@@ -15277,7 +17070,7 @@
                 <w:sz w:val="17"/>
                 <w:szCs w:val="17"/>
               </w:rPr>
-              <w:t xml:space="preserve">Coleta a apuração em andamento (seção 5); com --nuvem, publica a cada passada</w:t>
+              <w:t xml:space="preserve">Baixa os locais de votação (2018 a 2026) e grava o mapa das zonas (seção 6.4)</w:t>
             </w:r>
           </w:p>
         </w:tc>
@@ -15310,7 +17103,7 @@
                 <w:sz w:val="17"/>
                 <w:szCs w:val="17"/>
               </w:rPr>
-              <w:t xml:space="preserve">lumen eleicoes historico baixar --anos</w:t>
+              <w:t xml:space="preserve">lumen eleicoes ao-vivo --eleicao &lt;id&gt; [--nuvem]</w:t>
             </w:r>
           </w:p>
         </w:tc>
@@ -15337,7 +17130,7 @@
                 <w:sz w:val="17"/>
                 <w:szCs w:val="17"/>
               </w:rPr>
-              <w:t xml:space="preserve">Baixa os ZIPs dos dados abertos (1933 a 2024)</w:t>
+              <w:t xml:space="preserve">Coleta a apuração em andamento (seção 5); com --nuvem, publica a cada passada</w:t>
             </w:r>
           </w:p>
         </w:tc>
@@ -15370,7 +17163,7 @@
                 <w:sz w:val="17"/>
                 <w:szCs w:val="17"/>
               </w:rPr>
-              <w:t xml:space="preserve">lumen eleicoes historico processar --anos</w:t>
+              <w:t xml:space="preserve">lumen eleicoes historico baixar --anos</w:t>
             </w:r>
           </w:p>
         </w:tc>
@@ -15397,7 +17190,7 @@
                 <w:sz w:val="17"/>
                 <w:szCs w:val="17"/>
               </w:rPr>
-              <w:t xml:space="preserve">Gera os feeds das eleições passadas</w:t>
+              <w:t xml:space="preserve">Baixa os ZIPs dos dados abertos (1933 a 2024)</w:t>
             </w:r>
           </w:p>
         </w:tc>
@@ -15430,7 +17223,7 @@
                 <w:sz w:val="17"/>
                 <w:szCs w:val="17"/>
               </w:rPr>
-              <w:t xml:space="preserve">lumen eleicoes simular</w:t>
+              <w:t xml:space="preserve">lumen eleicoes historico processar --anos</w:t>
             </w:r>
           </w:p>
         </w:tc>
@@ -15457,7 +17250,7 @@
                 <w:sz w:val="17"/>
                 <w:szCs w:val="17"/>
               </w:rPr>
-              <w:t xml:space="preserve">Apuração fictícia a partir de arquivos finais reais</w:t>
+              <w:t xml:space="preserve">Gera os feeds das eleições passadas</w:t>
             </w:r>
           </w:p>
         </w:tc>
@@ -15490,7 +17283,7 @@
                 <w:sz w:val="17"/>
                 <w:szCs w:val="17"/>
               </w:rPr>
-              <w:t xml:space="preserve">lumen eleicoes amostra [--sem-referencias]</w:t>
+              <w:t xml:space="preserve">lumen eleicoes simular</w:t>
             </w:r>
           </w:p>
         </w:tc>
@@ -15517,7 +17310,7 @@
                 <w:sz w:val="17"/>
                 <w:szCs w:val="17"/>
               </w:rPr>
-              <w:t xml:space="preserve">Feeds de exemplo a partir das fixtures, sem rede, com o mapa e o cadastro</w:t>
+              <w:t xml:space="preserve">Apuração fictícia a partir de arquivos finais reais</w:t>
             </w:r>
           </w:p>
         </w:tc>
@@ -15550,7 +17343,7 @@
                 <w:sz w:val="17"/>
                 <w:szCs w:val="17"/>
               </w:rPr>
-              <w:t xml:space="preserve">lumen eleicoes servir [--porta 8080]</w:t>
+              <w:t xml:space="preserve">lumen eleicoes amostra [--sem-referencias]</w:t>
             </w:r>
           </w:p>
         </w:tc>
@@ -15577,7 +17370,7 @@
                 <w:sz w:val="17"/>
                 <w:szCs w:val="17"/>
               </w:rPr>
-              <w:t xml:space="preserve">Serve o portal exportado e os feeds localmente</w:t>
+              <w:t xml:space="preserve">Feeds de exemplo a partir das fixtures, sem rede, com o mapa e o cadastro</w:t>
             </w:r>
           </w:p>
         </w:tc>
@@ -15610,7 +17403,7 @@
                 <w:sz w:val="17"/>
                 <w:szCs w:val="17"/>
               </w:rPr>
-              <w:t xml:space="preserve">lumen eleicoes verificar</w:t>
+              <w:t xml:space="preserve">lumen eleicoes servir [--porta 8080]</w:t>
             </w:r>
           </w:p>
         </w:tc>
@@ -15618,6 +17411,66 @@
           <w:tcPr>
             <w:tcW w:type="dxa" w:w="5200"/>
             <w:shd w:fill="F2F2F2" w:val="clear"/>
+            <w:tcMar>
+              <w:top w:type="dxa" w:w="70"/>
+              <w:left w:type="dxa" w:w="110"/>
+              <w:bottom w:type="dxa" w:w="70"/>
+              <w:right w:type="dxa" w:w="110"/>
+            </w:tcMar>
+            <w:vAlign w:val="center"/>
+          </w:tcPr>
+          <w:p>
+            <w:pPr>
+              <w:spacing w:after="0"/>
+            </w:pPr>
+            <w:r>
+              <w:rPr>
+                <w:b w:val="false"/>
+                <w:bCs w:val="false"/>
+                <w:sz w:val="17"/>
+                <w:szCs w:val="17"/>
+              </w:rPr>
+              <w:t xml:space="preserve">Serve o portal exportado e os feeds localmente</w:t>
+            </w:r>
+          </w:p>
+        </w:tc>
+      </w:tr>
+      <w:tr>
+        <w:trPr>
+          <w:cantSplit/>
+        </w:trPr>
+        <w:tc>
+          <w:tcPr>
+            <w:tcW w:type="dxa" w:w="4400"/>
+            <w:shd w:fill="FFFFFF" w:val="clear"/>
+            <w:tcMar>
+              <w:top w:type="dxa" w:w="70"/>
+              <w:left w:type="dxa" w:w="110"/>
+              <w:bottom w:type="dxa" w:w="70"/>
+              <w:right w:type="dxa" w:w="110"/>
+            </w:tcMar>
+            <w:vAlign w:val="center"/>
+          </w:tcPr>
+          <w:p>
+            <w:pPr>
+              <w:spacing w:after="0"/>
+            </w:pPr>
+            <w:r>
+              <w:rPr>
+                <w:rFonts w:ascii="Consolas" w:cs="Consolas" w:eastAsia="Consolas" w:hAnsi="Consolas"/>
+                <w:b w:val="false"/>
+                <w:bCs w:val="false"/>
+                <w:sz w:val="17"/>
+                <w:szCs w:val="17"/>
+              </w:rPr>
+              <w:t xml:space="preserve">lumen eleicoes verificar</w:t>
+            </w:r>
+          </w:p>
+        </w:tc>
+        <w:tc>
+          <w:tcPr>
+            <w:tcW w:type="dxa" w:w="5200"/>
+            <w:shd w:fill="FFFFFF" w:val="clear"/>
             <w:tcMar>
               <w:top w:type="dxa" w:w="70"/>
               <w:left w:type="dxa" w:w="110"/>
@@ -24606,7 +26459,7 @@
                 <w:sz w:val="17"/>
                 <w:szCs w:val="17"/>
               </w:rPr>
-              <w:t xml:space="preserve">Eleições suplementares e consultas</w:t>
+              <w:t xml:space="preserve">Resultado por zona de 2026</w:t>
             </w:r>
           </w:p>
         </w:tc>
@@ -24633,7 +26486,7 @@
                 <w:sz w:val="17"/>
                 <w:szCs w:val="17"/>
               </w:rPr>
-              <w:t xml:space="preserve">Aparecem no catálogo, mas não estão nos testes</w:t>
+              <w:t xml:space="preserve">Os dados abertos de votação de 2026 saíram em 15/10/2026; com 2026 em ANOS_GERAIS, o 1º turno vem deles, com as zonas (ADR-029)</w:t>
             </w:r>
           </w:p>
         </w:tc>
@@ -24660,7 +26513,7 @@
                 <w:sz w:val="17"/>
                 <w:szCs w:val="17"/>
               </w:rPr>
-              <w:t xml:space="preserve">Após a carga histórica</w:t>
+              <w:t xml:space="preserve">Depois do 2º turno</w:t>
             </w:r>
           </w:p>
         </w:tc>
@@ -24692,7 +26545,7 @@
                 <w:sz w:val="17"/>
                 <w:szCs w:val="17"/>
               </w:rPr>
-              <w:t xml:space="preserve">Capturas de tela de referência no CI</w:t>
+              <w:t xml:space="preserve">Eleições suplementares e consultas</w:t>
             </w:r>
           </w:p>
         </w:tc>
@@ -24719,7 +26572,7 @@
                 <w:sz w:val="17"/>
                 <w:szCs w:val="17"/>
               </w:rPr>
-              <w:t xml:space="preserve">Hoje a conferência visual é manual (seção 10.2)</w:t>
+              <w:t xml:space="preserve">Aparecem no catálogo, mas não estão nos testes</w:t>
             </w:r>
           </w:p>
         </w:tc>
@@ -24746,7 +26599,7 @@
                 <w:sz w:val="17"/>
                 <w:szCs w:val="17"/>
               </w:rPr>
-              <w:t xml:space="preserve">Fase 1</w:t>
+              <w:t xml:space="preserve">Após a carga histórica</w:t>
             </w:r>
           </w:p>
         </w:tc>
@@ -24778,7 +26631,7 @@
                 <w:sz w:val="17"/>
                 <w:szCs w:val="17"/>
               </w:rPr>
-              <w:t xml:space="preserve">Política de retenção dos ZIPs</w:t>
+              <w:t xml:space="preserve">Capturas de tela de referência no CI</w:t>
             </w:r>
           </w:p>
         </w:tc>
@@ -24805,7 +26658,7 @@
                 <w:sz w:val="17"/>
                 <w:szCs w:val="17"/>
               </w:rPr>
-              <w:t xml:space="preserve">Ocupam espaço fora do armazenamento de objetos (ADR-021)</w:t>
+              <w:t xml:space="preserve">Hoje a conferência visual é manual (seção 10.2)</w:t>
             </w:r>
           </w:p>
         </w:tc>
@@ -24832,7 +26685,7 @@
                 <w:sz w:val="17"/>
                 <w:szCs w:val="17"/>
               </w:rPr>
-              <w:t xml:space="preserve">Junto com a política do bronze</w:t>
+              <w:t xml:space="preserve">Fase 1</w:t>
             </w:r>
           </w:p>
         </w:tc>
@@ -24864,7 +26717,7 @@
                 <w:sz w:val="17"/>
                 <w:szCs w:val="17"/>
               </w:rPr>
-              <w:t xml:space="preserve">Contexto eleitoral nas telas de contratação (família K)</w:t>
+              <w:t xml:space="preserve">Política de retenção dos ZIPs</w:t>
             </w:r>
           </w:p>
         </w:tc>
@@ -24891,7 +26744,7 @@
                 <w:sz w:val="17"/>
                 <w:szCs w:val="17"/>
               </w:rPr>
-              <w:t xml:space="preserve">ADR-024</w:t>
+              <w:t xml:space="preserve">Ocupam espaço fora do armazenamento de objetos (ADR-021)</w:t>
             </w:r>
           </w:p>
         </w:tc>
@@ -24918,7 +26771,7 @@
                 <w:sz w:val="17"/>
                 <w:szCs w:val="17"/>
               </w:rPr>
-              <w:t xml:space="preserve">Fase 2</w:t>
+              <w:t xml:space="preserve">Junto com a política do bronze</w:t>
             </w:r>
           </w:p>
         </w:tc>
@@ -24950,7 +26803,7 @@
                 <w:sz w:val="17"/>
                 <w:szCs w:val="17"/>
               </w:rPr>
-              <w:t xml:space="preserve">Prestação de contas de campanha (conector)</w:t>
+              <w:t xml:space="preserve">Contexto eleitoral nas telas de contratação (família K)</w:t>
             </w:r>
           </w:p>
         </w:tc>
@@ -24977,7 +26830,7 @@
                 <w:sz w:val="17"/>
                 <w:szCs w:val="17"/>
               </w:rPr>
-              <w:t xml:space="preserve">Pré-requisito da K-01</w:t>
+              <w:t xml:space="preserve">ADR-024</w:t>
             </w:r>
           </w:p>
         </w:tc>
@@ -24985,6 +26838,92 @@
           <w:tcPr>
             <w:tcW w:type="dxa" w:w="1700"/>
             <w:shd w:fill="F2F2F2" w:val="clear"/>
+            <w:tcMar>
+              <w:top w:type="dxa" w:w="70"/>
+              <w:left w:type="dxa" w:w="110"/>
+              <w:bottom w:type="dxa" w:w="70"/>
+              <w:right w:type="dxa" w:w="110"/>
+            </w:tcMar>
+            <w:vAlign w:val="center"/>
+          </w:tcPr>
+          <w:p>
+            <w:pPr>
+              <w:spacing w:after="0"/>
+            </w:pPr>
+            <w:r>
+              <w:rPr>
+                <w:b w:val="false"/>
+                <w:bCs w:val="false"/>
+                <w:sz w:val="17"/>
+                <w:szCs w:val="17"/>
+              </w:rPr>
+              <w:t xml:space="preserve">Fase 2</w:t>
+            </w:r>
+          </w:p>
+        </w:tc>
+      </w:tr>
+      <w:tr>
+        <w:trPr>
+          <w:cantSplit/>
+        </w:trPr>
+        <w:tc>
+          <w:tcPr>
+            <w:tcW w:type="dxa" w:w="3600"/>
+            <w:shd w:fill="FFFFFF" w:val="clear"/>
+            <w:tcMar>
+              <w:top w:type="dxa" w:w="70"/>
+              <w:left w:type="dxa" w:w="110"/>
+              <w:bottom w:type="dxa" w:w="70"/>
+              <w:right w:type="dxa" w:w="110"/>
+            </w:tcMar>
+            <w:vAlign w:val="center"/>
+          </w:tcPr>
+          <w:p>
+            <w:pPr>
+              <w:spacing w:after="0"/>
+            </w:pPr>
+            <w:r>
+              <w:rPr>
+                <w:b w:val="false"/>
+                <w:bCs w:val="false"/>
+                <w:sz w:val="17"/>
+                <w:szCs w:val="17"/>
+              </w:rPr>
+              <w:t xml:space="preserve">Prestação de contas de campanha (conector)</w:t>
+            </w:r>
+          </w:p>
+        </w:tc>
+        <w:tc>
+          <w:tcPr>
+            <w:tcW w:type="dxa" w:w="4300"/>
+            <w:shd w:fill="FFFFFF" w:val="clear"/>
+            <w:tcMar>
+              <w:top w:type="dxa" w:w="70"/>
+              <w:left w:type="dxa" w:w="110"/>
+              <w:bottom w:type="dxa" w:w="70"/>
+              <w:right w:type="dxa" w:w="110"/>
+            </w:tcMar>
+            <w:vAlign w:val="center"/>
+          </w:tcPr>
+          <w:p>
+            <w:pPr>
+              <w:spacing w:after="0"/>
+            </w:pPr>
+            <w:r>
+              <w:rPr>
+                <w:b w:val="false"/>
+                <w:bCs w:val="false"/>
+                <w:sz w:val="17"/>
+                <w:szCs w:val="17"/>
+              </w:rPr>
+              <w:t xml:space="preserve">Pré-requisito da K-01</w:t>
+            </w:r>
+          </w:p>
+        </w:tc>
+        <w:tc>
+          <w:tcPr>
+            <w:tcW w:type="dxa" w:w="1700"/>
+            <w:shd w:fill="FFFFFF" w:val="clear"/>
             <w:tcMar>
               <w:top w:type="dxa" w:w="70"/>
               <w:left w:type="dxa" w:w="110"/>
@@ -26801,7 +28740,7 @@
                 <w:sz w:val="18"/>
                 <w:szCs w:val="18"/>
               </w:rPr>
-              <w:t xml:space="preserve">Unidade de votação e agrupamento territorial do TSE; os dados abertos vêm por zona.</w:t>
+              <w:t xml:space="preserve">Unidade de votação e agrupamento territorial do TSE; os dados abertos vêm por zona. A zona não tem limite publicado: o mapa a desenha pelos locais de votação (seção 8.3).</w:t>
             </w:r>
           </w:p>
         </w:tc>
@@ -26833,7 +28772,7 @@
                 <w:sz w:val="18"/>
                 <w:szCs w:val="18"/>
               </w:rPr>
-              <w:t xml:space="preserve">Totalização</w:t>
+              <w:t xml:space="preserve">Local de votação</w:t>
             </w:r>
           </w:p>
         </w:tc>
@@ -26860,7 +28799,7 @@
                 <w:sz w:val="18"/>
                 <w:szCs w:val="18"/>
               </w:rPr>
-              <w:t xml:space="preserve">Contagem oficial dos votos das seções; o percentual de seções totalizadas mede o avanço.</w:t>
+              <w:t xml:space="preserve">Prédio onde ficam uma ou mais seções; tem zona, endereço e coordenadas nos dados abertos.</w:t>
             </w:r>
           </w:p>
         </w:tc>
@@ -26892,7 +28831,7 @@
                 <w:sz w:val="18"/>
                 <w:szCs w:val="18"/>
               </w:rPr>
-              <w:t xml:space="preserve">UF da época</w:t>
+              <w:t xml:space="preserve">Totalização</w:t>
             </w:r>
           </w:p>
         </w:tc>
@@ -26900,6 +28839,65 @@
           <w:tcPr>
             <w:tcW w:type="dxa" w:w="7200"/>
             <w:shd w:fill="F2F2F2" w:val="clear"/>
+            <w:tcMar>
+              <w:top w:type="dxa" w:w="70"/>
+              <w:left w:type="dxa" w:w="110"/>
+              <w:bottom w:type="dxa" w:w="70"/>
+              <w:right w:type="dxa" w:w="110"/>
+            </w:tcMar>
+            <w:vAlign w:val="center"/>
+          </w:tcPr>
+          <w:p>
+            <w:pPr>
+              <w:spacing w:after="0"/>
+            </w:pPr>
+            <w:r>
+              <w:rPr>
+                <w:b w:val="false"/>
+                <w:bCs w:val="false"/>
+                <w:sz w:val="18"/>
+                <w:szCs w:val="18"/>
+              </w:rPr>
+              <w:t xml:space="preserve">Contagem oficial dos votos das seções; o percentual de seções totalizadas mede o avanço.</w:t>
+            </w:r>
+          </w:p>
+        </w:tc>
+      </w:tr>
+      <w:tr>
+        <w:trPr>
+          <w:cantSplit/>
+        </w:trPr>
+        <w:tc>
+          <w:tcPr>
+            <w:tcW w:type="dxa" w:w="2400"/>
+            <w:shd w:fill="FFFFFF" w:val="clear"/>
+            <w:tcMar>
+              <w:top w:type="dxa" w:w="70"/>
+              <w:left w:type="dxa" w:w="110"/>
+              <w:bottom w:type="dxa" w:w="70"/>
+              <w:right w:type="dxa" w:w="110"/>
+            </w:tcMar>
+            <w:vAlign w:val="center"/>
+          </w:tcPr>
+          <w:p>
+            <w:pPr>
+              <w:spacing w:after="0"/>
+            </w:pPr>
+            <w:r>
+              <w:rPr>
+                <w:b/>
+                <w:bCs/>
+                <w:sz w:val="18"/>
+                <w:szCs w:val="18"/>
+              </w:rPr>
+              <w:t xml:space="preserve">UF da época</w:t>
+            </w:r>
+          </w:p>
+        </w:tc>
+        <w:tc>
+          <w:tcPr>
+            <w:tcW w:type="dxa" w:w="7200"/>
+            <w:shd w:fill="FFFFFF" w:val="clear"/>
             <w:tcMar>
               <w:top w:type="dxa" w:w="70"/>
               <w:left w:type="dxa" w:w="110"/>

</xml_diff>

<commit_message>
Documentação: DOC-12 e DOC-11 regerados
</commit_message>
<xml_diff>
--- a/docs/DOC-12_Eleicoes.docx
+++ b/docs/DOC-12_Eleicoes.docx
@@ -17103,7 +17103,7 @@
                 <w:sz w:val="17"/>
                 <w:szCs w:val="17"/>
               </w:rPr>
-              <w:t xml:space="preserve">lumen eleicoes ao-vivo --eleicao &lt;id&gt; [--nuvem]</w:t>
+              <w:t xml:space="preserve">lumen eleicoes mapas --contornos</w:t>
             </w:r>
           </w:p>
         </w:tc>
@@ -17130,7 +17130,7 @@
                 <w:sz w:val="17"/>
                 <w:szCs w:val="17"/>
               </w:rPr>
-              <w:t xml:space="preserve">Coleta a apuração em andamento (seção 5); com --nuvem, publica a cada passada</w:t>
+              <w:t xml:space="preserve">Baixa o contorno fino dos municípios listados nos índices das zonas (seção 6.4)</w:t>
             </w:r>
           </w:p>
         </w:tc>
@@ -17163,7 +17163,7 @@
                 <w:sz w:val="17"/>
                 <w:szCs w:val="17"/>
               </w:rPr>
-              <w:t xml:space="preserve">lumen eleicoes historico baixar --anos</w:t>
+              <w:t xml:space="preserve">lumen eleicoes ao-vivo --eleicao &lt;id&gt; [--nuvem]</w:t>
             </w:r>
           </w:p>
         </w:tc>
@@ -17190,7 +17190,7 @@
                 <w:sz w:val="17"/>
                 <w:szCs w:val="17"/>
               </w:rPr>
-              <w:t xml:space="preserve">Baixa os ZIPs dos dados abertos (1933 a 2024)</w:t>
+              <w:t xml:space="preserve">Coleta a apuração em andamento (seção 5); com --nuvem, publica a cada passada</w:t>
             </w:r>
           </w:p>
         </w:tc>
@@ -17223,7 +17223,7 @@
                 <w:sz w:val="17"/>
                 <w:szCs w:val="17"/>
               </w:rPr>
-              <w:t xml:space="preserve">lumen eleicoes historico processar --anos</w:t>
+              <w:t xml:space="preserve">lumen eleicoes historico baixar --anos</w:t>
             </w:r>
           </w:p>
         </w:tc>
@@ -17250,7 +17250,7 @@
                 <w:sz w:val="17"/>
                 <w:szCs w:val="17"/>
               </w:rPr>
-              <w:t xml:space="preserve">Gera os feeds das eleições passadas</w:t>
+              <w:t xml:space="preserve">Baixa os ZIPs dos dados abertos (1933 a 2024)</w:t>
             </w:r>
           </w:p>
         </w:tc>
@@ -17283,7 +17283,7 @@
                 <w:sz w:val="17"/>
                 <w:szCs w:val="17"/>
               </w:rPr>
-              <w:t xml:space="preserve">lumen eleicoes simular</w:t>
+              <w:t xml:space="preserve">lumen eleicoes historico processar --anos</w:t>
             </w:r>
           </w:p>
         </w:tc>
@@ -17310,7 +17310,7 @@
                 <w:sz w:val="17"/>
                 <w:szCs w:val="17"/>
               </w:rPr>
-              <w:t xml:space="preserve">Apuração fictícia a partir de arquivos finais reais</w:t>
+              <w:t xml:space="preserve">Gera os feeds das eleições passadas</w:t>
             </w:r>
           </w:p>
         </w:tc>
@@ -17343,7 +17343,7 @@
                 <w:sz w:val="17"/>
                 <w:szCs w:val="17"/>
               </w:rPr>
-              <w:t xml:space="preserve">lumen eleicoes amostra [--sem-referencias]</w:t>
+              <w:t xml:space="preserve">lumen eleicoes simular</w:t>
             </w:r>
           </w:p>
         </w:tc>
@@ -17370,7 +17370,7 @@
                 <w:sz w:val="17"/>
                 <w:szCs w:val="17"/>
               </w:rPr>
-              <w:t xml:space="preserve">Feeds de exemplo a partir das fixtures, sem rede, com o mapa e o cadastro</w:t>
+              <w:t xml:space="preserve">Apuração fictícia a partir de arquivos finais reais</w:t>
             </w:r>
           </w:p>
         </w:tc>
@@ -17403,7 +17403,7 @@
                 <w:sz w:val="17"/>
                 <w:szCs w:val="17"/>
               </w:rPr>
-              <w:t xml:space="preserve">lumen eleicoes servir [--porta 8080]</w:t>
+              <w:t xml:space="preserve">lumen eleicoes amostra [--sem-referencias]</w:t>
             </w:r>
           </w:p>
         </w:tc>
@@ -17430,7 +17430,7 @@
                 <w:sz w:val="17"/>
                 <w:szCs w:val="17"/>
               </w:rPr>
-              <w:t xml:space="preserve">Serve o portal exportado e os feeds localmente</w:t>
+              <w:t xml:space="preserve">Feeds de exemplo a partir das fixtures, sem rede, com o mapa e o cadastro</w:t>
             </w:r>
           </w:p>
         </w:tc>
@@ -17463,6 +17463,66 @@
                 <w:sz w:val="17"/>
                 <w:szCs w:val="17"/>
               </w:rPr>
+              <w:t xml:space="preserve">lumen eleicoes servir [--porta 8080]</w:t>
+            </w:r>
+          </w:p>
+        </w:tc>
+        <w:tc>
+          <w:tcPr>
+            <w:tcW w:type="dxa" w:w="5200"/>
+            <w:shd w:fill="FFFFFF" w:val="clear"/>
+            <w:tcMar>
+              <w:top w:type="dxa" w:w="70"/>
+              <w:left w:type="dxa" w:w="110"/>
+              <w:bottom w:type="dxa" w:w="70"/>
+              <w:right w:type="dxa" w:w="110"/>
+            </w:tcMar>
+            <w:vAlign w:val="center"/>
+          </w:tcPr>
+          <w:p>
+            <w:pPr>
+              <w:spacing w:after="0"/>
+            </w:pPr>
+            <w:r>
+              <w:rPr>
+                <w:b w:val="false"/>
+                <w:bCs w:val="false"/>
+                <w:sz w:val="17"/>
+                <w:szCs w:val="17"/>
+              </w:rPr>
+              <w:t xml:space="preserve">Serve o portal exportado e os feeds localmente</w:t>
+            </w:r>
+          </w:p>
+        </w:tc>
+      </w:tr>
+      <w:tr>
+        <w:trPr>
+          <w:cantSplit/>
+        </w:trPr>
+        <w:tc>
+          <w:tcPr>
+            <w:tcW w:type="dxa" w:w="4400"/>
+            <w:shd w:fill="F2F2F2" w:val="clear"/>
+            <w:tcMar>
+              <w:top w:type="dxa" w:w="70"/>
+              <w:left w:type="dxa" w:w="110"/>
+              <w:bottom w:type="dxa" w:w="70"/>
+              <w:right w:type="dxa" w:w="110"/>
+            </w:tcMar>
+            <w:vAlign w:val="center"/>
+          </w:tcPr>
+          <w:p>
+            <w:pPr>
+              <w:spacing w:after="0"/>
+            </w:pPr>
+            <w:r>
+              <w:rPr>
+                <w:rFonts w:ascii="Consolas" w:cs="Consolas" w:eastAsia="Consolas" w:hAnsi="Consolas"/>
+                <w:b w:val="false"/>
+                <w:bCs w:val="false"/>
+                <w:sz w:val="17"/>
+                <w:szCs w:val="17"/>
+              </w:rPr>
               <w:t xml:space="preserve">lumen eleicoes verificar</w:t>
             </w:r>
           </w:p>
@@ -17470,7 +17530,7 @@
         <w:tc>
           <w:tcPr>
             <w:tcW w:type="dxa" w:w="5200"/>
-            <w:shd w:fill="FFFFFF" w:val="clear"/>
+            <w:shd w:fill="F2F2F2" w:val="clear"/>
             <w:tcMar>
               <w:top w:type="dxa" w:w="70"/>
               <w:left w:type="dxa" w:w="110"/>

</xml_diff>

<commit_message>
Eleições: a entrada anos da carga manual vale com ELEICOES_SEM_HISTORICO e roteiro do 2º turno com a fila do grupo
A carga de 2026 disparada em 16/10 com o ensaio do eleicoes-ao-vivo ficou na
fila do grupo eleicoes-carga e foi cancelada quando a agendada entrou; e, com
ELEICOES_SEM_HISTORICO=true, a entrada anos sozinha era ignorada. O roteiro da
noite da eleição (DOC-12 1.6 e Wiki) passa a pedir a fila do grupo vazia e diz
quando o coletor para sem a marca de finalizada do TSE.
</commit_message>
<xml_diff>
--- a/docs/DOC-12_Eleicoes.docx
+++ b/docs/DOC-12_Eleicoes.docx
@@ -267,7 +267,7 @@
                 <w:sz w:val="19"/>
                 <w:szCs w:val="19"/>
               </w:rPr>
-              <w:t xml:space="preserve">1.5</w:t>
+              <w:t xml:space="preserve">1.6</w:t>
             </w:r>
           </w:p>
         </w:tc>
@@ -326,7 +326,7 @@
                 <w:sz w:val="19"/>
                 <w:szCs w:val="19"/>
               </w:rPr>
-              <w:t xml:space="preserve">15 de outubro de 2026</w:t>
+              <w:t xml:space="preserve">19 de outubro de 2026</w:t>
             </w:r>
           </w:p>
         </w:tc>
@@ -425,9 +425,11 @@
         <w:keepLines/>
         <w:spacing w:after="160" w:before="380"/>
       </w:pPr>
+      <w:bookmarkStart w:name="_Toc1" w:id="1"/>
       <w:r>
         <w:t xml:space="preserve">Sumário</w:t>
       </w:r>
+      <w:bookmarkEnd w:id="1"/>
     </w:p>
     <w:p>
       <w:pPr>
@@ -452,11 +454,1352 @@
       </w:sdtPr>
       <w:sdtContent>
         <w:p>
+          <w:pPr>
+            <w:pStyle w:val="TOC1"/>
+            <w:tabs>
+              <w:tab w:val="right" w:pos="9638" w:leader="dot"/>
+            </w:tabs>
+          </w:pPr>
           <w:r>
             <w:fldChar w:fldCharType="begin" w:dirty="true"/>
             <w:instrText xml:space="preserve">TOC \h \o "1-3"</w:instrText>
             <w:fldChar w:fldCharType="separate"/>
           </w:r>
+          <w:hyperlink w:history="1" w:anchor="_Toc1">
+            <w:r>
+              <w:t xml:space="preserve">Sumário</w:t>
+            </w:r>
+            <w:r>
+              <w:tab/>
+            </w:r>
+            <w:r>
+              <w:fldChar w:fldCharType="begin" w:dirty="true"/>
+              <w:instrText xml:space="preserve">PAGEREF _Toc1 \h</w:instrText>
+              <w:fldChar w:fldCharType="separate"/>
+              <w:fldChar w:fldCharType="end"/>
+            </w:r>
+          </w:hyperlink>
+        </w:p>
+        <w:p>
+          <w:pPr>
+            <w:pStyle w:val="TOC1"/>
+            <w:tabs>
+              <w:tab w:val="right" w:pos="9638" w:leader="dot"/>
+            </w:tabs>
+          </w:pPr>
+          <w:hyperlink w:history="1" w:anchor="_Toc2">
+            <w:r>
+              <w:t xml:space="preserve">1. Idealização</w:t>
+            </w:r>
+            <w:r>
+              <w:tab/>
+            </w:r>
+            <w:r>
+              <w:fldChar w:fldCharType="begin" w:dirty="true"/>
+              <w:instrText xml:space="preserve">PAGEREF _Toc2 \h</w:instrText>
+              <w:fldChar w:fldCharType="separate"/>
+              <w:fldChar w:fldCharType="end"/>
+            </w:r>
+          </w:hyperlink>
+        </w:p>
+        <w:p>
+          <w:pPr>
+            <w:pStyle w:val="TOC2"/>
+            <w:tabs>
+              <w:tab w:val="right" w:pos="9638" w:leader="dot"/>
+            </w:tabs>
+            <w:ind w:left="220"/>
+          </w:pPr>
+          <w:hyperlink w:history="1" w:anchor="_Toc3">
+            <w:r>
+              <w:t xml:space="preserve">1.1 Princípios</w:t>
+            </w:r>
+            <w:r>
+              <w:tab/>
+            </w:r>
+            <w:r>
+              <w:fldChar w:fldCharType="begin" w:dirty="true"/>
+              <w:instrText xml:space="preserve">PAGEREF _Toc3 \h</w:instrText>
+              <w:fldChar w:fldCharType="separate"/>
+              <w:fldChar w:fldCharType="end"/>
+            </w:r>
+          </w:hyperlink>
+        </w:p>
+        <w:p>
+          <w:pPr>
+            <w:pStyle w:val="TOC2"/>
+            <w:tabs>
+              <w:tab w:val="right" w:pos="9638" w:leader="dot"/>
+            </w:tabs>
+            <w:ind w:left="220"/>
+          </w:pPr>
+          <w:hyperlink w:history="1" w:anchor="_Toc4">
+            <w:r>
+              <w:t xml:space="preserve">1.2 Como a aba se apresenta</w:t>
+            </w:r>
+            <w:r>
+              <w:tab/>
+            </w:r>
+            <w:r>
+              <w:fldChar w:fldCharType="begin" w:dirty="true"/>
+              <w:instrText xml:space="preserve">PAGEREF _Toc4 \h</w:instrText>
+              <w:fldChar w:fldCharType="separate"/>
+              <w:fldChar w:fldCharType="end"/>
+            </w:r>
+          </w:hyperlink>
+        </w:p>
+        <w:p>
+          <w:pPr>
+            <w:pStyle w:val="TOC1"/>
+            <w:tabs>
+              <w:tab w:val="right" w:pos="9638" w:leader="dot"/>
+            </w:tabs>
+          </w:pPr>
+          <w:hyperlink w:history="1" w:anchor="_Toc5">
+            <w:r>
+              <w:t xml:space="preserve">2. Escopo</w:t>
+            </w:r>
+            <w:r>
+              <w:tab/>
+            </w:r>
+            <w:r>
+              <w:fldChar w:fldCharType="begin" w:dirty="true"/>
+              <w:instrText xml:space="preserve">PAGEREF _Toc5 \h</w:instrText>
+              <w:fldChar w:fldCharType="separate"/>
+              <w:fldChar w:fldCharType="end"/>
+            </w:r>
+          </w:hyperlink>
+        </w:p>
+        <w:p>
+          <w:pPr>
+            <w:pStyle w:val="TOC1"/>
+            <w:tabs>
+              <w:tab w:val="right" w:pos="9638" w:leader="dot"/>
+            </w:tabs>
+          </w:pPr>
+          <w:hyperlink w:history="1" w:anchor="_Toc6">
+            <w:r>
+              <w:t xml:space="preserve">3. Fontes de dados</w:t>
+            </w:r>
+            <w:r>
+              <w:tab/>
+            </w:r>
+            <w:r>
+              <w:fldChar w:fldCharType="begin" w:dirty="true"/>
+              <w:instrText xml:space="preserve">PAGEREF _Toc6 \h</w:instrText>
+              <w:fldChar w:fldCharType="separate"/>
+              <w:fldChar w:fldCharType="end"/>
+            </w:r>
+          </w:hyperlink>
+        </w:p>
+        <w:p>
+          <w:pPr>
+            <w:pStyle w:val="TOC2"/>
+            <w:tabs>
+              <w:tab w:val="right" w:pos="9638" w:leader="dot"/>
+            </w:tabs>
+            <w:ind w:left="220"/>
+          </w:pPr>
+          <w:hyperlink w:history="1" w:anchor="_Toc7">
+            <w:r>
+              <w:t xml:space="preserve">3.1 Sistema de divulgação de resultados do TSE</w:t>
+            </w:r>
+            <w:r>
+              <w:tab/>
+            </w:r>
+            <w:r>
+              <w:fldChar w:fldCharType="begin" w:dirty="true"/>
+              <w:instrText xml:space="preserve">PAGEREF _Toc7 \h</w:instrText>
+              <w:fldChar w:fldCharType="separate"/>
+              <w:fldChar w:fldCharType="end"/>
+            </w:r>
+          </w:hyperlink>
+        </w:p>
+        <w:p>
+          <w:pPr>
+            <w:pStyle w:val="TOC2"/>
+            <w:tabs>
+              <w:tab w:val="right" w:pos="9638" w:leader="dot"/>
+            </w:tabs>
+            <w:ind w:left="220"/>
+          </w:pPr>
+          <w:hyperlink w:history="1" w:anchor="_Toc8">
+            <w:r>
+              <w:t xml:space="preserve">3.2 Portal de Dados Abertos do TSE</w:t>
+            </w:r>
+            <w:r>
+              <w:tab/>
+            </w:r>
+            <w:r>
+              <w:fldChar w:fldCharType="begin" w:dirty="true"/>
+              <w:instrText xml:space="preserve">PAGEREF _Toc8 \h</w:instrText>
+              <w:fldChar w:fldCharType="separate"/>
+              <w:fldChar w:fldCharType="end"/>
+            </w:r>
+          </w:hyperlink>
+        </w:p>
+        <w:p>
+          <w:pPr>
+            <w:pStyle w:val="TOC3"/>
+            <w:tabs>
+              <w:tab w:val="right" w:pos="9638" w:leader="dot"/>
+            </w:tabs>
+            <w:ind w:left="440"/>
+          </w:pPr>
+          <w:hyperlink w:history="1" w:anchor="_Toc9">
+            <w:r>
+              <w:t xml:space="preserve">Diferenças entre anos que mudam o resultado</w:t>
+            </w:r>
+            <w:r>
+              <w:tab/>
+            </w:r>
+            <w:r>
+              <w:fldChar w:fldCharType="begin" w:dirty="true"/>
+              <w:instrText xml:space="preserve">PAGEREF _Toc9 \h</w:instrText>
+              <w:fldChar w:fldCharType="separate"/>
+              <w:fldChar w:fldCharType="end"/>
+            </w:r>
+          </w:hyperlink>
+        </w:p>
+        <w:p>
+          <w:pPr>
+            <w:pStyle w:val="TOC3"/>
+            <w:tabs>
+              <w:tab w:val="right" w:pos="9638" w:leader="dot"/>
+            </w:tabs>
+            <w:ind w:left="440"/>
+          </w:pPr>
+          <w:hyperlink w:history="1" w:anchor="_Toc10">
+            <w:r>
+              <w:t xml:space="preserve">Eleições de 1933 a 1990</w:t>
+            </w:r>
+            <w:r>
+              <w:tab/>
+            </w:r>
+            <w:r>
+              <w:fldChar w:fldCharType="begin" w:dirty="true"/>
+              <w:instrText xml:space="preserve">PAGEREF _Toc10 \h</w:instrText>
+              <w:fldChar w:fldCharType="separate"/>
+              <w:fldChar w:fldCharType="end"/>
+            </w:r>
+          </w:hyperlink>
+        </w:p>
+        <w:p>
+          <w:pPr>
+            <w:pStyle w:val="TOC2"/>
+            <w:tabs>
+              <w:tab w:val="right" w:pos="9638" w:leader="dot"/>
+            </w:tabs>
+            <w:ind w:left="220"/>
+          </w:pPr>
+          <w:hyperlink w:history="1" w:anchor="_Toc11">
+            <w:r>
+              <w:t xml:space="preserve">3.3 IBGE</w:t>
+            </w:r>
+            <w:r>
+              <w:tab/>
+            </w:r>
+            <w:r>
+              <w:fldChar w:fldCharType="begin" w:dirty="true"/>
+              <w:instrText xml:space="preserve">PAGEREF _Toc11 \h</w:instrText>
+              <w:fldChar w:fldCharType="separate"/>
+              <w:fldChar w:fldCharType="end"/>
+            </w:r>
+          </w:hyperlink>
+        </w:p>
+        <w:p>
+          <w:pPr>
+            <w:pStyle w:val="TOC2"/>
+            <w:tabs>
+              <w:tab w:val="right" w:pos="9638" w:leader="dot"/>
+            </w:tabs>
+            <w:ind w:left="220"/>
+          </w:pPr>
+          <w:hyperlink w:history="1" w:anchor="_Toc12">
+            <w:r>
+              <w:t xml:space="preserve">3.4 Conferências feitas contra os arquivos reais</w:t>
+            </w:r>
+            <w:r>
+              <w:tab/>
+            </w:r>
+            <w:r>
+              <w:fldChar w:fldCharType="begin" w:dirty="true"/>
+              <w:instrText xml:space="preserve">PAGEREF _Toc12 \h</w:instrText>
+              <w:fldChar w:fldCharType="separate"/>
+              <w:fldChar w:fldCharType="end"/>
+            </w:r>
+          </w:hyperlink>
+        </w:p>
+        <w:p>
+          <w:pPr>
+            <w:pStyle w:val="TOC1"/>
+            <w:tabs>
+              <w:tab w:val="right" w:pos="9638" w:leader="dot"/>
+            </w:tabs>
+          </w:pPr>
+          <w:hyperlink w:history="1" w:anchor="_Toc13">
+            <w:r>
+              <w:t xml:space="preserve">4. Arquitetura</w:t>
+            </w:r>
+            <w:r>
+              <w:tab/>
+            </w:r>
+            <w:r>
+              <w:fldChar w:fldCharType="begin" w:dirty="true"/>
+              <w:instrText xml:space="preserve">PAGEREF _Toc13 \h</w:instrText>
+              <w:fldChar w:fldCharType="separate"/>
+              <w:fldChar w:fldCharType="end"/>
+            </w:r>
+          </w:hyperlink>
+        </w:p>
+        <w:p>
+          <w:pPr>
+            <w:pStyle w:val="TOC2"/>
+            <w:tabs>
+              <w:tab w:val="right" w:pos="9638" w:leader="dot"/>
+            </w:tabs>
+            <w:ind w:left="220"/>
+          </w:pPr>
+          <w:hyperlink w:history="1" w:anchor="_Toc14">
+            <w:r>
+              <w:t xml:space="preserve">4.1 Módulos</w:t>
+            </w:r>
+            <w:r>
+              <w:tab/>
+            </w:r>
+            <w:r>
+              <w:fldChar w:fldCharType="begin" w:dirty="true"/>
+              <w:instrText xml:space="preserve">PAGEREF _Toc14 \h</w:instrText>
+              <w:fldChar w:fldCharType="separate"/>
+              <w:fldChar w:fldCharType="end"/>
+            </w:r>
+          </w:hyperlink>
+        </w:p>
+        <w:p>
+          <w:pPr>
+            <w:pStyle w:val="TOC2"/>
+            <w:tabs>
+              <w:tab w:val="right" w:pos="9638" w:leader="dot"/>
+            </w:tabs>
+            <w:ind w:left="220"/>
+          </w:pPr>
+          <w:hyperlink w:history="1" w:anchor="_Toc15">
+            <w:r>
+              <w:t xml:space="preserve">4.2 Por que feeds estáticos</w:t>
+            </w:r>
+            <w:r>
+              <w:tab/>
+            </w:r>
+            <w:r>
+              <w:fldChar w:fldCharType="begin" w:dirty="true"/>
+              <w:instrText xml:space="preserve">PAGEREF _Toc15 \h</w:instrText>
+              <w:fldChar w:fldCharType="separate"/>
+              <w:fldChar w:fldCharType="end"/>
+            </w:r>
+          </w:hyperlink>
+        </w:p>
+        <w:p>
+          <w:pPr>
+            <w:pStyle w:val="TOC1"/>
+            <w:tabs>
+              <w:tab w:val="right" w:pos="9638" w:leader="dot"/>
+            </w:tabs>
+          </w:pPr>
+          <w:hyperlink w:history="1" w:anchor="_Toc16">
+            <w:r>
+              <w:t xml:space="preserve">5. Coleta ao vivo</w:t>
+            </w:r>
+            <w:r>
+              <w:tab/>
+            </w:r>
+            <w:r>
+              <w:fldChar w:fldCharType="begin" w:dirty="true"/>
+              <w:instrText xml:space="preserve">PAGEREF _Toc16 \h</w:instrText>
+              <w:fldChar w:fldCharType="separate"/>
+              <w:fldChar w:fldCharType="end"/>
+            </w:r>
+          </w:hyperlink>
+        </w:p>
+        <w:p>
+          <w:pPr>
+            <w:pStyle w:val="TOC2"/>
+            <w:tabs>
+              <w:tab w:val="right" w:pos="9638" w:leader="dot"/>
+            </w:tabs>
+            <w:ind w:left="220"/>
+          </w:pPr>
+          <w:hyperlink w:history="1" w:anchor="_Toc17">
+            <w:r>
+              <w:t xml:space="preserve">5.1 O plano da noite</w:t>
+            </w:r>
+            <w:r>
+              <w:tab/>
+            </w:r>
+            <w:r>
+              <w:fldChar w:fldCharType="begin" w:dirty="true"/>
+              <w:instrText xml:space="preserve">PAGEREF _Toc17 \h</w:instrText>
+              <w:fldChar w:fldCharType="separate"/>
+              <w:fldChar w:fldCharType="end"/>
+            </w:r>
+          </w:hyperlink>
+        </w:p>
+        <w:p>
+          <w:pPr>
+            <w:pStyle w:val="TOC2"/>
+            <w:tabs>
+              <w:tab w:val="right" w:pos="9638" w:leader="dot"/>
+            </w:tabs>
+            <w:ind w:left="220"/>
+          </w:pPr>
+          <w:hyperlink w:history="1" w:anchor="_Toc18">
+            <w:r>
+              <w:t xml:space="preserve">5.2 Quanto tempo leva para tudo ficar em dia</w:t>
+            </w:r>
+            <w:r>
+              <w:tab/>
+            </w:r>
+            <w:r>
+              <w:fldChar w:fldCharType="begin" w:dirty="true"/>
+              <w:instrText xml:space="preserve">PAGEREF _Toc18 \h</w:instrText>
+              <w:fldChar w:fldCharType="separate"/>
+              <w:fldChar w:fldCharType="end"/>
+            </w:r>
+          </w:hyperlink>
+        </w:p>
+        <w:p>
+          <w:pPr>
+            <w:pStyle w:val="TOC2"/>
+            <w:tabs>
+              <w:tab w:val="right" w:pos="9638" w:leader="dot"/>
+            </w:tabs>
+            <w:ind w:left="220"/>
+          </w:pPr>
+          <w:hyperlink w:history="1" w:anchor="_Toc19">
+            <w:r>
+              <w:t xml:space="preserve">5.3 Cores fixas durante a noite</w:t>
+            </w:r>
+            <w:r>
+              <w:tab/>
+            </w:r>
+            <w:r>
+              <w:fldChar w:fldCharType="begin" w:dirty="true"/>
+              <w:instrText xml:space="preserve">PAGEREF _Toc19 \h</w:instrText>
+              <w:fldChar w:fldCharType="separate"/>
+              <w:fldChar w:fldCharType="end"/>
+            </w:r>
+          </w:hyperlink>
+        </w:p>
+        <w:p>
+          <w:pPr>
+            <w:pStyle w:val="TOC2"/>
+            <w:tabs>
+              <w:tab w:val="right" w:pos="9638" w:leader="dot"/>
+            </w:tabs>
+            <w:ind w:left="220"/>
+          </w:pPr>
+          <w:hyperlink w:history="1" w:anchor="_Toc20">
+            <w:r>
+              <w:t xml:space="preserve">5.4 Reinício e falhas</w:t>
+            </w:r>
+            <w:r>
+              <w:tab/>
+            </w:r>
+            <w:r>
+              <w:fldChar w:fldCharType="begin" w:dirty="true"/>
+              <w:instrText xml:space="preserve">PAGEREF _Toc20 \h</w:instrText>
+              <w:fldChar w:fldCharType="separate"/>
+              <w:fldChar w:fldCharType="end"/>
+            </w:r>
+          </w:hyperlink>
+        </w:p>
+        <w:p>
+          <w:pPr>
+            <w:pStyle w:val="TOC2"/>
+            <w:tabs>
+              <w:tab w:val="right" w:pos="9638" w:leader="dot"/>
+            </w:tabs>
+            <w:ind w:left="220"/>
+          </w:pPr>
+          <w:hyperlink w:history="1" w:anchor="_Toc21">
+            <w:r>
+              <w:t xml:space="preserve">5.5 Prova</w:t>
+            </w:r>
+            <w:r>
+              <w:tab/>
+            </w:r>
+            <w:r>
+              <w:fldChar w:fldCharType="begin" w:dirty="true"/>
+              <w:instrText xml:space="preserve">PAGEREF _Toc21 \h</w:instrText>
+              <w:fldChar w:fldCharType="separate"/>
+              <w:fldChar w:fldCharType="end"/>
+            </w:r>
+          </w:hyperlink>
+        </w:p>
+        <w:p>
+          <w:pPr>
+            <w:pStyle w:val="TOC1"/>
+            <w:tabs>
+              <w:tab w:val="right" w:pos="9638" w:leader="dot"/>
+            </w:tabs>
+          </w:pPr>
+          <w:hyperlink w:history="1" w:anchor="_Toc22">
+            <w:r>
+              <w:t xml:space="preserve">6. Eleições passadas</w:t>
+            </w:r>
+            <w:r>
+              <w:tab/>
+            </w:r>
+            <w:r>
+              <w:fldChar w:fldCharType="begin" w:dirty="true"/>
+              <w:instrText xml:space="preserve">PAGEREF _Toc22 \h</w:instrText>
+              <w:fldChar w:fldCharType="separate"/>
+              <w:fldChar w:fldCharType="end"/>
+            </w:r>
+          </w:hyperlink>
+        </w:p>
+        <w:p>
+          <w:pPr>
+            <w:pStyle w:val="TOC2"/>
+            <w:tabs>
+              <w:tab w:val="right" w:pos="9638" w:leader="dot"/>
+            </w:tabs>
+            <w:ind w:left="220"/>
+          </w:pPr>
+          <w:hyperlink w:history="1" w:anchor="_Toc23">
+            <w:r>
+              <w:t xml:space="preserve">6.1 Baixar</w:t>
+            </w:r>
+            <w:r>
+              <w:tab/>
+            </w:r>
+            <w:r>
+              <w:fldChar w:fldCharType="begin" w:dirty="true"/>
+              <w:instrText xml:space="preserve">PAGEREF _Toc23 \h</w:instrText>
+              <w:fldChar w:fldCharType="separate"/>
+              <w:fldChar w:fldCharType="end"/>
+            </w:r>
+          </w:hyperlink>
+        </w:p>
+        <w:p>
+          <w:pPr>
+            <w:pStyle w:val="TOC2"/>
+            <w:tabs>
+              <w:tab w:val="right" w:pos="9638" w:leader="dot"/>
+            </w:tabs>
+            <w:ind w:left="220"/>
+          </w:pPr>
+          <w:hyperlink w:history="1" w:anchor="_Toc24">
+            <w:r>
+              <w:t xml:space="preserve">6.2 Processar</w:t>
+            </w:r>
+            <w:r>
+              <w:tab/>
+            </w:r>
+            <w:r>
+              <w:fldChar w:fldCharType="begin" w:dirty="true"/>
+              <w:instrText xml:space="preserve">PAGEREF _Toc24 \h</w:instrText>
+              <w:fldChar w:fldCharType="separate"/>
+              <w:fldChar w:fldCharType="end"/>
+            </w:r>
+          </w:hyperlink>
+        </w:p>
+        <w:p>
+          <w:pPr>
+            <w:pStyle w:val="TOC2"/>
+            <w:tabs>
+              <w:tab w:val="right" w:pos="9638" w:leader="dot"/>
+            </w:tabs>
+            <w:ind w:left="220"/>
+          </w:pPr>
+          <w:hyperlink w:history="1" w:anchor="_Toc25">
+            <w:r>
+              <w:t xml:space="preserve">6.3 Eleições de 1933 a 1990</w:t>
+            </w:r>
+            <w:r>
+              <w:tab/>
+            </w:r>
+            <w:r>
+              <w:fldChar w:fldCharType="begin" w:dirty="true"/>
+              <w:instrText xml:space="preserve">PAGEREF _Toc25 \h</w:instrText>
+              <w:fldChar w:fldCharType="separate"/>
+              <w:fldChar w:fldCharType="end"/>
+            </w:r>
+          </w:hyperlink>
+        </w:p>
+        <w:p>
+          <w:pPr>
+            <w:pStyle w:val="TOC2"/>
+            <w:tabs>
+              <w:tab w:val="right" w:pos="9638" w:leader="dot"/>
+            </w:tabs>
+            <w:ind w:left="220"/>
+          </w:pPr>
+          <w:hyperlink w:history="1" w:anchor="_Toc26">
+            <w:r>
+              <w:t xml:space="preserve">6.4 Locais de votação e o mapa das zonas</w:t>
+            </w:r>
+            <w:r>
+              <w:tab/>
+            </w:r>
+            <w:r>
+              <w:fldChar w:fldCharType="begin" w:dirty="true"/>
+              <w:instrText xml:space="preserve">PAGEREF _Toc26 \h</w:instrText>
+              <w:fldChar w:fldCharType="separate"/>
+              <w:fldChar w:fldCharType="end"/>
+            </w:r>
+          </w:hyperlink>
+        </w:p>
+        <w:p>
+          <w:pPr>
+            <w:pStyle w:val="TOC1"/>
+            <w:tabs>
+              <w:tab w:val="right" w:pos="9638" w:leader="dot"/>
+            </w:tabs>
+          </w:pPr>
+          <w:hyperlink w:history="1" w:anchor="_Toc27">
+            <w:r>
+              <w:t xml:space="preserve">7. Contrato dos feeds (versão 1)</w:t>
+            </w:r>
+            <w:r>
+              <w:tab/>
+            </w:r>
+            <w:r>
+              <w:fldChar w:fldCharType="begin" w:dirty="true"/>
+              <w:instrText xml:space="preserve">PAGEREF _Toc27 \h</w:instrText>
+              <w:fldChar w:fldCharType="separate"/>
+              <w:fldChar w:fldCharType="end"/>
+            </w:r>
+          </w:hyperlink>
+        </w:p>
+        <w:p>
+          <w:pPr>
+            <w:pStyle w:val="TOC2"/>
+            <w:tabs>
+              <w:tab w:val="right" w:pos="9638" w:leader="dot"/>
+            </w:tabs>
+            <w:ind w:left="220"/>
+          </w:pPr>
+          <w:hyperlink w:history="1" w:anchor="_Toc28">
+            <w:r>
+              <w:t xml:space="preserve">7.1 Tipos de arquivo</w:t>
+            </w:r>
+            <w:r>
+              <w:tab/>
+            </w:r>
+            <w:r>
+              <w:fldChar w:fldCharType="begin" w:dirty="true"/>
+              <w:instrText xml:space="preserve">PAGEREF _Toc28 \h</w:instrText>
+              <w:fldChar w:fldCharType="separate"/>
+              <w:fldChar w:fldCharType="end"/>
+            </w:r>
+          </w:hyperlink>
+        </w:p>
+        <w:p>
+          <w:pPr>
+            <w:pStyle w:val="TOC2"/>
+            <w:tabs>
+              <w:tab w:val="right" w:pos="9638" w:leader="dot"/>
+            </w:tabs>
+            <w:ind w:left="220"/>
+          </w:pPr>
+          <w:hyperlink w:history="1" w:anchor="_Toc29">
+            <w:r>
+              <w:t xml:space="preserve">7.2 Regras do contrato</w:t>
+            </w:r>
+            <w:r>
+              <w:tab/>
+            </w:r>
+            <w:r>
+              <w:fldChar w:fldCharType="begin" w:dirty="true"/>
+              <w:instrText xml:space="preserve">PAGEREF _Toc29 \h</w:instrText>
+              <w:fldChar w:fldCharType="separate"/>
+              <w:fldChar w:fldCharType="end"/>
+            </w:r>
+          </w:hyperlink>
+        </w:p>
+        <w:p>
+          <w:pPr>
+            <w:pStyle w:val="TOC2"/>
+            <w:tabs>
+              <w:tab w:val="right" w:pos="9638" w:leader="dot"/>
+            </w:tabs>
+            <w:ind w:left="220"/>
+          </w:pPr>
+          <w:hyperlink w:history="1" w:anchor="_Toc30">
+            <w:r>
+              <w:t xml:space="preserve">7.3 Como o contrato é protegido</w:t>
+            </w:r>
+            <w:r>
+              <w:tab/>
+            </w:r>
+            <w:r>
+              <w:fldChar w:fldCharType="begin" w:dirty="true"/>
+              <w:instrText xml:space="preserve">PAGEREF _Toc30 \h</w:instrText>
+              <w:fldChar w:fldCharType="separate"/>
+              <w:fldChar w:fldCharType="end"/>
+            </w:r>
+          </w:hyperlink>
+        </w:p>
+        <w:p>
+          <w:pPr>
+            <w:pStyle w:val="TOC1"/>
+            <w:tabs>
+              <w:tab w:val="right" w:pos="9638" w:leader="dot"/>
+            </w:tabs>
+          </w:pPr>
+          <w:hyperlink w:history="1" w:anchor="_Toc31">
+            <w:r>
+              <w:t xml:space="preserve">8. Regras de exibição</w:t>
+            </w:r>
+            <w:r>
+              <w:tab/>
+            </w:r>
+            <w:r>
+              <w:fldChar w:fldCharType="begin" w:dirty="true"/>
+              <w:instrText xml:space="preserve">PAGEREF _Toc31 \h</w:instrText>
+              <w:fldChar w:fldCharType="separate"/>
+              <w:fldChar w:fldCharType="end"/>
+            </w:r>
+          </w:hyperlink>
+        </w:p>
+        <w:p>
+          <w:pPr>
+            <w:pStyle w:val="TOC2"/>
+            <w:tabs>
+              <w:tab w:val="right" w:pos="9638" w:leader="dot"/>
+            </w:tabs>
+            <w:ind w:left="220"/>
+          </w:pPr>
+          <w:hyperlink w:history="1" w:anchor="_Toc32">
+            <w:r>
+              <w:t xml:space="preserve">8.1 Paleta</w:t>
+            </w:r>
+            <w:r>
+              <w:tab/>
+            </w:r>
+            <w:r>
+              <w:fldChar w:fldCharType="begin" w:dirty="true"/>
+              <w:instrText xml:space="preserve">PAGEREF _Toc32 \h</w:instrText>
+              <w:fldChar w:fldCharType="separate"/>
+              <w:fldChar w:fldCharType="end"/>
+            </w:r>
+          </w:hyperlink>
+        </w:p>
+        <w:p>
+          <w:pPr>
+            <w:pStyle w:val="TOC2"/>
+            <w:tabs>
+              <w:tab w:val="right" w:pos="9638" w:leader="dot"/>
+            </w:tabs>
+            <w:ind w:left="220"/>
+          </w:pPr>
+          <w:hyperlink w:history="1" w:anchor="_Toc33">
+            <w:r>
+              <w:t xml:space="preserve">8.2 Leitura da tela</w:t>
+            </w:r>
+            <w:r>
+              <w:tab/>
+            </w:r>
+            <w:r>
+              <w:fldChar w:fldCharType="begin" w:dirty="true"/>
+              <w:instrText xml:space="preserve">PAGEREF _Toc33 \h</w:instrText>
+              <w:fldChar w:fldCharType="separate"/>
+              <w:fldChar w:fldCharType="end"/>
+            </w:r>
+          </w:hyperlink>
+        </w:p>
+        <w:p>
+          <w:pPr>
+            <w:pStyle w:val="TOC2"/>
+            <w:tabs>
+              <w:tab w:val="right" w:pos="9638" w:leader="dot"/>
+            </w:tabs>
+            <w:ind w:left="220"/>
+          </w:pPr>
+          <w:hyperlink w:history="1" w:anchor="_Toc34">
+            <w:r>
+              <w:t xml:space="preserve">8.3 Zonas eleitorais no mapa do município (ADR-029)</w:t>
+            </w:r>
+            <w:r>
+              <w:tab/>
+            </w:r>
+            <w:r>
+              <w:fldChar w:fldCharType="begin" w:dirty="true"/>
+              <w:instrText xml:space="preserve">PAGEREF _Toc34 \h</w:instrText>
+              <w:fldChar w:fldCharType="separate"/>
+              <w:fldChar w:fldCharType="end"/>
+            </w:r>
+          </w:hyperlink>
+        </w:p>
+        <w:p>
+          <w:pPr>
+            <w:pStyle w:val="TOC1"/>
+            <w:tabs>
+              <w:tab w:val="right" w:pos="9638" w:leader="dot"/>
+            </w:tabs>
+          </w:pPr>
+          <w:hyperlink w:history="1" w:anchor="_Toc35">
+            <w:r>
+              <w:t xml:space="preserve">9. Operação</w:t>
+            </w:r>
+            <w:r>
+              <w:tab/>
+            </w:r>
+            <w:r>
+              <w:fldChar w:fldCharType="begin" w:dirty="true"/>
+              <w:instrText xml:space="preserve">PAGEREF _Toc35 \h</w:instrText>
+              <w:fldChar w:fldCharType="separate"/>
+              <w:fldChar w:fldCharType="end"/>
+            </w:r>
+          </w:hyperlink>
+        </w:p>
+        <w:p>
+          <w:pPr>
+            <w:pStyle w:val="TOC2"/>
+            <w:tabs>
+              <w:tab w:val="right" w:pos="9638" w:leader="dot"/>
+            </w:tabs>
+            <w:ind w:left="220"/>
+          </w:pPr>
+          <w:hyperlink w:history="1" w:anchor="_Toc36">
+            <w:r>
+              <w:t xml:space="preserve">9.1 Deixar pronto num comando</w:t>
+            </w:r>
+            <w:r>
+              <w:tab/>
+            </w:r>
+            <w:r>
+              <w:fldChar w:fldCharType="begin" w:dirty="true"/>
+              <w:instrText xml:space="preserve">PAGEREF _Toc36 \h</w:instrText>
+              <w:fldChar w:fldCharType="separate"/>
+              <w:fldChar w:fldCharType="end"/>
+            </w:r>
+          </w:hyperlink>
+        </w:p>
+        <w:p>
+          <w:pPr>
+            <w:pStyle w:val="TOC2"/>
+            <w:tabs>
+              <w:tab w:val="right" w:pos="9638" w:leader="dot"/>
+            </w:tabs>
+            <w:ind w:left="220"/>
+          </w:pPr>
+          <w:hyperlink w:history="1" w:anchor="_Toc37">
+            <w:r>
+              <w:t xml:space="preserve">9.2 Configuração</w:t>
+            </w:r>
+            <w:r>
+              <w:tab/>
+            </w:r>
+            <w:r>
+              <w:fldChar w:fldCharType="begin" w:dirty="true"/>
+              <w:instrText xml:space="preserve">PAGEREF _Toc37 \h</w:instrText>
+              <w:fldChar w:fldCharType="separate"/>
+              <w:fldChar w:fldCharType="end"/>
+            </w:r>
+          </w:hyperlink>
+        </w:p>
+        <w:p>
+          <w:pPr>
+            <w:pStyle w:val="TOC2"/>
+            <w:tabs>
+              <w:tab w:val="right" w:pos="9638" w:leader="dot"/>
+            </w:tabs>
+            <w:ind w:left="220"/>
+          </w:pPr>
+          <w:hyperlink w:history="1" w:anchor="_Toc38">
+            <w:r>
+              <w:t xml:space="preserve">9.3 Comandos</w:t>
+            </w:r>
+            <w:r>
+              <w:tab/>
+            </w:r>
+            <w:r>
+              <w:fldChar w:fldCharType="begin" w:dirty="true"/>
+              <w:instrText xml:space="preserve">PAGEREF _Toc38 \h</w:instrText>
+              <w:fldChar w:fldCharType="separate"/>
+              <w:fldChar w:fldCharType="end"/>
+            </w:r>
+          </w:hyperlink>
+        </w:p>
+        <w:p>
+          <w:pPr>
+            <w:pStyle w:val="TOC2"/>
+            <w:tabs>
+              <w:tab w:val="right" w:pos="9638" w:leader="dot"/>
+            </w:tabs>
+            <w:ind w:left="220"/>
+          </w:pPr>
+          <w:hyperlink w:history="1" w:anchor="_Toc39">
+            <w:r>
+              <w:t xml:space="preserve">9.4 Roteiro da noite da eleição</w:t>
+            </w:r>
+            <w:r>
+              <w:tab/>
+            </w:r>
+            <w:r>
+              <w:fldChar w:fldCharType="begin" w:dirty="true"/>
+              <w:instrText xml:space="preserve">PAGEREF _Toc39 \h</w:instrText>
+              <w:fldChar w:fldCharType="separate"/>
+              <w:fldChar w:fldCharType="end"/>
+            </w:r>
+          </w:hyperlink>
+        </w:p>
+        <w:p>
+          <w:pPr>
+            <w:pStyle w:val="TOC3"/>
+            <w:tabs>
+              <w:tab w:val="right" w:pos="9638" w:leader="dot"/>
+            </w:tabs>
+            <w:ind w:left="440"/>
+          </w:pPr>
+          <w:hyperlink w:history="1" w:anchor="_Toc40">
+            <w:r>
+              <w:t xml:space="preserve">Na semana anterior</w:t>
+            </w:r>
+            <w:r>
+              <w:tab/>
+            </w:r>
+            <w:r>
+              <w:fldChar w:fldCharType="begin" w:dirty="true"/>
+              <w:instrText xml:space="preserve">PAGEREF _Toc40 \h</w:instrText>
+              <w:fldChar w:fldCharType="separate"/>
+              <w:fldChar w:fldCharType="end"/>
+            </w:r>
+          </w:hyperlink>
+        </w:p>
+        <w:p>
+          <w:pPr>
+            <w:pStyle w:val="TOC3"/>
+            <w:tabs>
+              <w:tab w:val="right" w:pos="9638" w:leader="dot"/>
+            </w:tabs>
+            <w:ind w:left="440"/>
+          </w:pPr>
+          <w:hyperlink w:history="1" w:anchor="_Toc41">
+            <w:r>
+              <w:t xml:space="preserve">No dia</w:t>
+            </w:r>
+            <w:r>
+              <w:tab/>
+            </w:r>
+            <w:r>
+              <w:fldChar w:fldCharType="begin" w:dirty="true"/>
+              <w:instrText xml:space="preserve">PAGEREF _Toc41 \h</w:instrText>
+              <w:fldChar w:fldCharType="separate"/>
+              <w:fldChar w:fldCharType="end"/>
+            </w:r>
+          </w:hyperlink>
+        </w:p>
+        <w:p>
+          <w:pPr>
+            <w:pStyle w:val="TOC3"/>
+            <w:tabs>
+              <w:tab w:val="right" w:pos="9638" w:leader="dot"/>
+            </w:tabs>
+            <w:ind w:left="440"/>
+          </w:pPr>
+          <w:hyperlink w:history="1" w:anchor="_Toc42">
+            <w:r>
+              <w:t xml:space="preserve">Depois</w:t>
+            </w:r>
+            <w:r>
+              <w:tab/>
+            </w:r>
+            <w:r>
+              <w:fldChar w:fldCharType="begin" w:dirty="true"/>
+              <w:instrText xml:space="preserve">PAGEREF _Toc42 \h</w:instrText>
+              <w:fldChar w:fldCharType="separate"/>
+              <w:fldChar w:fldCharType="end"/>
+            </w:r>
+          </w:hyperlink>
+        </w:p>
+        <w:p>
+          <w:pPr>
+            <w:pStyle w:val="TOC2"/>
+            <w:tabs>
+              <w:tab w:val="right" w:pos="9638" w:leader="dot"/>
+            </w:tabs>
+            <w:ind w:left="220"/>
+          </w:pPr>
+          <w:hyperlink w:history="1" w:anchor="_Toc43">
+            <w:r>
+              <w:t xml:space="preserve">9.5 Na nuvem, sem computador ligado (ADR-026)</w:t>
+            </w:r>
+            <w:r>
+              <w:tab/>
+            </w:r>
+            <w:r>
+              <w:fldChar w:fldCharType="begin" w:dirty="true"/>
+              <w:instrText xml:space="preserve">PAGEREF _Toc43 \h</w:instrText>
+              <w:fldChar w:fldCharType="separate"/>
+              <w:fldChar w:fldCharType="end"/>
+            </w:r>
+          </w:hyperlink>
+        </w:p>
+        <w:p>
+          <w:pPr>
+            <w:pStyle w:val="TOC3"/>
+            <w:tabs>
+              <w:tab w:val="right" w:pos="9638" w:leader="dot"/>
+            </w:tabs>
+            <w:ind w:left="440"/>
+          </w:pPr>
+          <w:hyperlink w:history="1" w:anchor="_Toc44">
+            <w:r>
+              <w:t xml:space="preserve">Como a carga continua de uma execução para outra</w:t>
+            </w:r>
+            <w:r>
+              <w:tab/>
+            </w:r>
+            <w:r>
+              <w:fldChar w:fldCharType="begin" w:dirty="true"/>
+              <w:instrText xml:space="preserve">PAGEREF _Toc44 \h</w:instrText>
+              <w:fldChar w:fldCharType="separate"/>
+              <w:fldChar w:fldCharType="end"/>
+            </w:r>
+          </w:hyperlink>
+        </w:p>
+        <w:p>
+          <w:pPr>
+            <w:pStyle w:val="TOC3"/>
+            <w:tabs>
+              <w:tab w:val="right" w:pos="9638" w:leader="dot"/>
+            </w:tabs>
+            <w:ind w:left="440"/>
+          </w:pPr>
+          <w:hyperlink w:history="1" w:anchor="_Toc45">
+            <w:r>
+              <w:t xml:space="preserve">Configuração, uma vez</w:t>
+            </w:r>
+            <w:r>
+              <w:tab/>
+            </w:r>
+            <w:r>
+              <w:fldChar w:fldCharType="begin" w:dirty="true"/>
+              <w:instrText xml:space="preserve">PAGEREF _Toc45 \h</w:instrText>
+              <w:fldChar w:fldCharType="separate"/>
+              <w:fldChar w:fldCharType="end"/>
+            </w:r>
+          </w:hyperlink>
+        </w:p>
+        <w:p>
+          <w:pPr>
+            <w:pStyle w:val="TOC3"/>
+            <w:tabs>
+              <w:tab w:val="right" w:pos="9638" w:leader="dot"/>
+            </w:tabs>
+            <w:ind w:left="440"/>
+          </w:pPr>
+          <w:hyperlink w:history="1" w:anchor="_Toc46">
+            <w:r>
+              <w:t xml:space="preserve">Sem o GitHub Actions</w:t>
+            </w:r>
+            <w:r>
+              <w:tab/>
+            </w:r>
+            <w:r>
+              <w:fldChar w:fldCharType="begin" w:dirty="true"/>
+              <w:instrText xml:space="preserve">PAGEREF _Toc46 \h</w:instrText>
+              <w:fldChar w:fldCharType="separate"/>
+              <w:fldChar w:fldCharType="end"/>
+            </w:r>
+          </w:hyperlink>
+        </w:p>
+        <w:p>
+          <w:pPr>
+            <w:pStyle w:val="TOC2"/>
+            <w:tabs>
+              <w:tab w:val="right" w:pos="9638" w:leader="dot"/>
+            </w:tabs>
+            <w:ind w:left="220"/>
+          </w:pPr>
+          <w:hyperlink w:history="1" w:anchor="_Toc47">
+            <w:r>
+              <w:t xml:space="preserve">9.6 Limites do plano gratuito</w:t>
+            </w:r>
+            <w:r>
+              <w:tab/>
+            </w:r>
+            <w:r>
+              <w:fldChar w:fldCharType="begin" w:dirty="true"/>
+              <w:instrText xml:space="preserve">PAGEREF _Toc47 \h</w:instrText>
+              <w:fldChar w:fldCharType="separate"/>
+              <w:fldChar w:fldCharType="end"/>
+            </w:r>
+          </w:hyperlink>
+        </w:p>
+        <w:p>
+          <w:pPr>
+            <w:pStyle w:val="TOC2"/>
+            <w:tabs>
+              <w:tab w:val="right" w:pos="9638" w:leader="dot"/>
+            </w:tabs>
+            <w:ind w:left="220"/>
+          </w:pPr>
+          <w:hyperlink w:history="1" w:anchor="_Toc48">
+            <w:r>
+              <w:t xml:space="preserve">9.7 Alternativa sem cartão: Supabase Storage (adendo do ADR-026)</w:t>
+            </w:r>
+            <w:r>
+              <w:tab/>
+            </w:r>
+            <w:r>
+              <w:fldChar w:fldCharType="begin" w:dirty="true"/>
+              <w:instrText xml:space="preserve">PAGEREF _Toc48 \h</w:instrText>
+              <w:fldChar w:fldCharType="separate"/>
+              <w:fldChar w:fldCharType="end"/>
+            </w:r>
+          </w:hyperlink>
+        </w:p>
+        <w:p>
+          <w:pPr>
+            <w:pStyle w:val="TOC3"/>
+            <w:tabs>
+              <w:tab w:val="right" w:pos="9638" w:leader="dot"/>
+            </w:tabs>
+            <w:ind w:left="440"/>
+          </w:pPr>
+          <w:hyperlink w:history="1" w:anchor="_Toc49">
+            <w:r>
+              <w:t xml:space="preserve">Configuração, uma vez</w:t>
+            </w:r>
+            <w:r>
+              <w:tab/>
+            </w:r>
+            <w:r>
+              <w:fldChar w:fldCharType="begin" w:dirty="true"/>
+              <w:instrText xml:space="preserve">PAGEREF _Toc49 \h</w:instrText>
+              <w:fldChar w:fldCharType="separate"/>
+              <w:fldChar w:fldCharType="end"/>
+            </w:r>
+          </w:hyperlink>
+        </w:p>
+        <w:p>
+          <w:pPr>
+            <w:pStyle w:val="TOC1"/>
+            <w:tabs>
+              <w:tab w:val="right" w:pos="9638" w:leader="dot"/>
+            </w:tabs>
+          </w:pPr>
+          <w:hyperlink w:history="1" w:anchor="_Toc50">
+            <w:r>
+              <w:t xml:space="preserve">10. Verificação</w:t>
+            </w:r>
+            <w:r>
+              <w:tab/>
+            </w:r>
+            <w:r>
+              <w:fldChar w:fldCharType="begin" w:dirty="true"/>
+              <w:instrText xml:space="preserve">PAGEREF _Toc50 \h</w:instrText>
+              <w:fldChar w:fldCharType="separate"/>
+              <w:fldChar w:fldCharType="end"/>
+            </w:r>
+          </w:hyperlink>
+        </w:p>
+        <w:p>
+          <w:pPr>
+            <w:pStyle w:val="TOC2"/>
+            <w:tabs>
+              <w:tab w:val="right" w:pos="9638" w:leader="dot"/>
+            </w:tabs>
+            <w:ind w:left="220"/>
+          </w:pPr>
+          <w:hyperlink w:history="1" w:anchor="_Toc51">
+            <w:r>
+              <w:t xml:space="preserve">10.1 Testes automatizados</w:t>
+            </w:r>
+            <w:r>
+              <w:tab/>
+            </w:r>
+            <w:r>
+              <w:fldChar w:fldCharType="begin" w:dirty="true"/>
+              <w:instrText xml:space="preserve">PAGEREF _Toc51 \h</w:instrText>
+              <w:fldChar w:fldCharType="separate"/>
+              <w:fldChar w:fldCharType="end"/>
+            </w:r>
+          </w:hyperlink>
+        </w:p>
+        <w:p>
+          <w:pPr>
+            <w:pStyle w:val="TOC2"/>
+            <w:tabs>
+              <w:tab w:val="right" w:pos="9638" w:leader="dot"/>
+            </w:tabs>
+            <w:ind w:left="220"/>
+          </w:pPr>
+          <w:hyperlink w:history="1" w:anchor="_Toc52">
+            <w:r>
+              <w:t xml:space="preserve">10.2 Verificação visual</w:t>
+            </w:r>
+            <w:r>
+              <w:tab/>
+            </w:r>
+            <w:r>
+              <w:fldChar w:fldCharType="begin" w:dirty="true"/>
+              <w:instrText xml:space="preserve">PAGEREF _Toc52 \h</w:instrText>
+              <w:fldChar w:fldCharType="separate"/>
+              <w:fldChar w:fldCharType="end"/>
+            </w:r>
+          </w:hyperlink>
+        </w:p>
+        <w:p>
+          <w:pPr>
+            <w:pStyle w:val="TOC2"/>
+            <w:tabs>
+              <w:tab w:val="right" w:pos="9638" w:leader="dot"/>
+            </w:tabs>
+            <w:ind w:left="220"/>
+          </w:pPr>
+          <w:hyperlink w:history="1" w:anchor="_Toc53">
+            <w:r>
+              <w:t xml:space="preserve">10.3 Testes de contrato</w:t>
+            </w:r>
+            <w:r>
+              <w:tab/>
+            </w:r>
+            <w:r>
+              <w:fldChar w:fldCharType="begin" w:dirty="true"/>
+              <w:instrText xml:space="preserve">PAGEREF _Toc53 \h</w:instrText>
+              <w:fldChar w:fldCharType="separate"/>
+              <w:fldChar w:fldCharType="end"/>
+            </w:r>
+          </w:hyperlink>
+        </w:p>
+        <w:p>
+          <w:pPr>
+            <w:pStyle w:val="TOC1"/>
+            <w:tabs>
+              <w:tab w:val="right" w:pos="9638" w:leader="dot"/>
+            </w:tabs>
+          </w:pPr>
+          <w:hyperlink w:history="1" w:anchor="_Toc54">
+            <w:r>
+              <w:t xml:space="preserve">11. Integração com o Lumen</w:t>
+            </w:r>
+            <w:r>
+              <w:tab/>
+            </w:r>
+            <w:r>
+              <w:fldChar w:fldCharType="begin" w:dirty="true"/>
+              <w:instrText xml:space="preserve">PAGEREF _Toc54 \h</w:instrText>
+              <w:fldChar w:fldCharType="separate"/>
+              <w:fldChar w:fldCharType="end"/>
+            </w:r>
+          </w:hyperlink>
+        </w:p>
+        <w:p>
+          <w:pPr>
+            <w:pStyle w:val="TOC3"/>
+            <w:tabs>
+              <w:tab w:val="right" w:pos="9638" w:leader="dot"/>
+            </w:tabs>
+            <w:ind w:left="440"/>
+          </w:pPr>
+          <w:hyperlink w:history="1" w:anchor="_Toc55">
+            <w:r>
+              <w:t xml:space="preserve">Integração prevista (Fase 2 em diante)</w:t>
+            </w:r>
+            <w:r>
+              <w:tab/>
+            </w:r>
+            <w:r>
+              <w:fldChar w:fldCharType="begin" w:dirty="true"/>
+              <w:instrText xml:space="preserve">PAGEREF _Toc55 \h</w:instrText>
+              <w:fldChar w:fldCharType="separate"/>
+              <w:fldChar w:fldCharType="end"/>
+            </w:r>
+          </w:hyperlink>
+        </w:p>
+        <w:p>
+          <w:pPr>
+            <w:pStyle w:val="TOC1"/>
+            <w:tabs>
+              <w:tab w:val="right" w:pos="9638" w:leader="dot"/>
+            </w:tabs>
+          </w:pPr>
+          <w:hyperlink w:history="1" w:anchor="_Toc56">
+            <w:r>
+              <w:t xml:space="preserve">12. Próximos passos e riscos</w:t>
+            </w:r>
+            <w:r>
+              <w:tab/>
+            </w:r>
+            <w:r>
+              <w:fldChar w:fldCharType="begin" w:dirty="true"/>
+              <w:instrText xml:space="preserve">PAGEREF _Toc56 \h</w:instrText>
+              <w:fldChar w:fldCharType="separate"/>
+              <w:fldChar w:fldCharType="end"/>
+            </w:r>
+          </w:hyperlink>
+        </w:p>
+        <w:p>
+          <w:pPr>
+            <w:pStyle w:val="TOC2"/>
+            <w:tabs>
+              <w:tab w:val="right" w:pos="9638" w:leader="dot"/>
+            </w:tabs>
+            <w:ind w:left="220"/>
+          </w:pPr>
+          <w:hyperlink w:history="1" w:anchor="_Toc57">
+            <w:r>
+              <w:t xml:space="preserve">12.1 Próximos passos</w:t>
+            </w:r>
+            <w:r>
+              <w:tab/>
+            </w:r>
+            <w:r>
+              <w:fldChar w:fldCharType="begin" w:dirty="true"/>
+              <w:instrText xml:space="preserve">PAGEREF _Toc57 \h</w:instrText>
+              <w:fldChar w:fldCharType="separate"/>
+              <w:fldChar w:fldCharType="end"/>
+            </w:r>
+          </w:hyperlink>
+        </w:p>
+        <w:p>
+          <w:pPr>
+            <w:pStyle w:val="TOC2"/>
+            <w:tabs>
+              <w:tab w:val="right" w:pos="9638" w:leader="dot"/>
+            </w:tabs>
+            <w:ind w:left="220"/>
+          </w:pPr>
+          <w:hyperlink w:history="1" w:anchor="_Toc58">
+            <w:r>
+              <w:t xml:space="preserve">12.2 Riscos</w:t>
+            </w:r>
+            <w:r>
+              <w:tab/>
+            </w:r>
+            <w:r>
+              <w:fldChar w:fldCharType="begin" w:dirty="true"/>
+              <w:instrText xml:space="preserve">PAGEREF _Toc58 \h</w:instrText>
+              <w:fldChar w:fldCharType="separate"/>
+              <w:fldChar w:fldCharType="end"/>
+            </w:r>
+          </w:hyperlink>
+        </w:p>
+        <w:p>
+          <w:pPr>
+            <w:pStyle w:val="TOC1"/>
+            <w:tabs>
+              <w:tab w:val="right" w:pos="9638" w:leader="dot"/>
+            </w:tabs>
+          </w:pPr>
+          <w:hyperlink w:history="1" w:anchor="_Toc59">
+            <w:r>
+              <w:t xml:space="preserve">Apêndice A. Glossário</w:t>
+            </w:r>
+            <w:r>
+              <w:tab/>
+            </w:r>
+            <w:r>
+              <w:fldChar w:fldCharType="begin" w:dirty="true"/>
+              <w:instrText xml:space="preserve">PAGEREF _Toc59 \h</w:instrText>
+              <w:fldChar w:fldCharType="separate"/>
+              <w:fldChar w:fldCharType="end"/>
+            </w:r>
+          </w:hyperlink>
         </w:p>
         <w:p>
           <w:r>
@@ -477,9 +1820,11 @@
         <w:keepLines/>
         <w:spacing w:after="160" w:before="380"/>
       </w:pPr>
+      <w:bookmarkStart w:name="_Toc2" w:id="2"/>
       <w:r>
         <w:t xml:space="preserve">1. Idealização</w:t>
       </w:r>
+      <w:bookmarkEnd w:id="2"/>
     </w:p>
     <w:p>
       <w:pPr>
@@ -504,9 +1849,11 @@
         <w:keepLines/>
         <w:spacing w:after="120" w:before="280"/>
       </w:pPr>
+      <w:bookmarkStart w:name="_Toc3" w:id="3"/>
       <w:r>
         <w:t xml:space="preserve">1.1 Princípios</w:t>
       </w:r>
+      <w:bookmarkEnd w:id="3"/>
     </w:p>
     <w:tbl>
       <w:tblPr>
@@ -1022,9 +2369,11 @@
         <w:keepLines/>
         <w:spacing w:after="120" w:before="280"/>
       </w:pPr>
+      <w:bookmarkStart w:name="_Toc4" w:id="4"/>
       <w:r>
         <w:t xml:space="preserve">1.2 Como a aba se apresenta</w:t>
       </w:r>
+      <w:bookmarkEnd w:id="4"/>
     </w:p>
     <w:p>
       <w:pPr>
@@ -1236,9 +2585,11 @@
         <w:pageBreakBefore/>
         <w:spacing w:after="160" w:before="380"/>
       </w:pPr>
+      <w:bookmarkStart w:name="_Toc5" w:id="5"/>
       <w:r>
         <w:t xml:space="preserve">2. Escopo</w:t>
       </w:r>
+      <w:bookmarkEnd w:id="5"/>
     </w:p>
     <w:tbl>
       <w:tblPr>
@@ -2044,9 +3395,11 @@
         <w:keepLines/>
         <w:spacing w:after="160" w:before="380"/>
       </w:pPr>
+      <w:bookmarkStart w:name="_Toc6" w:id="6"/>
       <w:r>
         <w:t xml:space="preserve">3. Fontes de dados</w:t>
       </w:r>
+      <w:bookmarkEnd w:id="6"/>
     </w:p>
     <w:p>
       <w:pPr>
@@ -2085,9 +3438,11 @@
         <w:keepLines/>
         <w:spacing w:after="120" w:before="280"/>
       </w:pPr>
+      <w:bookmarkStart w:name="_Toc7" w:id="7"/>
       <w:r>
         <w:t xml:space="preserve">3.1 Sistema de divulgação de resultados do TSE</w:t>
       </w:r>
+      <w:bookmarkEnd w:id="7"/>
     </w:p>
     <w:p>
       <w:pPr>
@@ -2747,9 +4102,11 @@
         <w:keepLines/>
         <w:spacing w:after="120" w:before="280"/>
       </w:pPr>
+      <w:bookmarkStart w:name="_Toc8" w:id="8"/>
       <w:r>
         <w:t xml:space="preserve">3.2 Portal de Dados Abertos do TSE</w:t>
       </w:r>
+      <w:bookmarkEnd w:id="8"/>
     </w:p>
     <w:p>
       <w:pPr>
@@ -3316,9 +4673,11 @@
         <w:keepLines/>
         <w:spacing w:after="100" w:before="220"/>
       </w:pPr>
+      <w:bookmarkStart w:name="_Toc9" w:id="9"/>
       <w:r>
         <w:t xml:space="preserve">Diferenças entre anos que mudam o resultado</w:t>
       </w:r>
+      <w:bookmarkEnd w:id="9"/>
     </w:p>
     <w:tbl>
       <w:tblPr>
@@ -3877,9 +5236,11 @@
         <w:keepLines/>
         <w:spacing w:after="100" w:before="220"/>
       </w:pPr>
+      <w:bookmarkStart w:name="_Toc10" w:id="10"/>
       <w:r>
         <w:t xml:space="preserve">Eleições de 1933 a 1990</w:t>
       </w:r>
+      <w:bookmarkEnd w:id="10"/>
     </w:p>
     <w:p>
       <w:pPr>
@@ -5554,9 +6915,11 @@
         <w:keepLines/>
         <w:spacing w:after="120" w:before="280"/>
       </w:pPr>
+      <w:bookmarkStart w:name="_Toc11" w:id="11"/>
       <w:r>
         <w:t xml:space="preserve">3.3 IBGE</w:t>
       </w:r>
+      <w:bookmarkEnd w:id="11"/>
     </w:p>
     <w:p>
       <w:pPr>
@@ -5732,9 +7095,11 @@
         <w:keepLines/>
         <w:spacing w:after="120" w:before="280"/>
       </w:pPr>
+      <w:bookmarkStart w:name="_Toc12" w:id="12"/>
       <w:r>
         <w:t xml:space="preserve">3.4 Conferências feitas contra os arquivos reais</w:t>
       </w:r>
+      <w:bookmarkEnd w:id="12"/>
     </w:p>
     <w:tbl>
       <w:tblPr>
@@ -5999,9 +7364,11 @@
         <w:pageBreakBefore/>
         <w:spacing w:after="160" w:before="380"/>
       </w:pPr>
+      <w:bookmarkStart w:name="_Toc13" w:id="13"/>
       <w:r>
         <w:t xml:space="preserve">4. Arquitetura</w:t>
       </w:r>
+      <w:bookmarkEnd w:id="13"/>
     </w:p>
     <w:p>
       <w:pPr>
@@ -6102,9 +7469,11 @@
         <w:keepLines/>
         <w:spacing w:after="120" w:before="280"/>
       </w:pPr>
+      <w:bookmarkStart w:name="_Toc14" w:id="14"/>
       <w:r>
         <w:t xml:space="preserve">4.1 Módulos</w:t>
       </w:r>
+      <w:bookmarkEnd w:id="14"/>
     </w:p>
     <w:tbl>
       <w:tblPr>
@@ -7224,9 +8593,11 @@
         <w:keepLines/>
         <w:spacing w:after="120" w:before="280"/>
       </w:pPr>
+      <w:bookmarkStart w:name="_Toc15" w:id="15"/>
       <w:r>
         <w:t xml:space="preserve">4.2 Por que feeds estáticos</w:t>
       </w:r>
+      <w:bookmarkEnd w:id="15"/>
     </w:p>
     <w:p>
       <w:pPr>
@@ -7255,9 +8626,11 @@
         <w:pageBreakBefore/>
         <w:spacing w:after="160" w:before="380"/>
       </w:pPr>
+      <w:bookmarkStart w:name="_Toc16" w:id="16"/>
       <w:r>
         <w:t xml:space="preserve">5. Coleta ao vivo</w:t>
       </w:r>
+      <w:bookmarkEnd w:id="16"/>
     </w:p>
     <w:p>
       <w:pPr>
@@ -7347,9 +8720,11 @@
         <w:keepLines/>
         <w:spacing w:after="120" w:before="280"/>
       </w:pPr>
+      <w:bookmarkStart w:name="_Toc17" w:id="17"/>
       <w:r>
         <w:t xml:space="preserve">5.1 O plano da noite</w:t>
       </w:r>
+      <w:bookmarkEnd w:id="17"/>
     </w:p>
     <w:p>
       <w:pPr>
@@ -7532,9 +8907,11 @@
         <w:keepLines/>
         <w:spacing w:after="120" w:before="280"/>
       </w:pPr>
+      <w:bookmarkStart w:name="_Toc18" w:id="18"/>
       <w:r>
         <w:t xml:space="preserve">5.2 Quanto tempo leva para tudo ficar em dia</w:t>
       </w:r>
+      <w:bookmarkEnd w:id="18"/>
     </w:p>
     <w:p>
       <w:pPr>
@@ -7830,9 +9207,11 @@
         <w:keepLines/>
         <w:spacing w:after="120" w:before="280"/>
       </w:pPr>
+      <w:bookmarkStart w:name="_Toc19" w:id="19"/>
       <w:r>
         <w:t xml:space="preserve">5.3 Cores fixas durante a noite</w:t>
       </w:r>
+      <w:bookmarkEnd w:id="19"/>
     </w:p>
     <w:p>
       <w:pPr>
@@ -7860,9 +9239,11 @@
         <w:keepLines/>
         <w:spacing w:after="120" w:before="280"/>
       </w:pPr>
+      <w:bookmarkStart w:name="_Toc20" w:id="20"/>
       <w:r>
         <w:t xml:space="preserve">5.4 Reinício e falhas</w:t>
       </w:r>
+      <w:bookmarkEnd w:id="20"/>
     </w:p>
     <w:p>
       <w:pPr>
@@ -7973,9 +9354,11 @@
         <w:keepLines/>
         <w:spacing w:after="120" w:before="280"/>
       </w:pPr>
+      <w:bookmarkStart w:name="_Toc21" w:id="21"/>
       <w:r>
         <w:t xml:space="preserve">5.5 Prova</w:t>
       </w:r>
+      <w:bookmarkEnd w:id="21"/>
     </w:p>
     <w:p>
       <w:pPr>
@@ -8014,9 +9397,11 @@
         <w:keepLines/>
         <w:spacing w:after="160" w:before="380"/>
       </w:pPr>
+      <w:bookmarkStart w:name="_Toc22" w:id="22"/>
       <w:r>
         <w:t xml:space="preserve">6. Eleições passadas</w:t>
       </w:r>
+      <w:bookmarkEnd w:id="22"/>
     </w:p>
     <w:p>
       <w:pPr>
@@ -8158,9 +9543,11 @@
         <w:keepLines/>
         <w:spacing w:after="120" w:before="280"/>
       </w:pPr>
+      <w:bookmarkStart w:name="_Toc23" w:id="23"/>
       <w:r>
         <w:t xml:space="preserve">6.1 Baixar</w:t>
       </w:r>
+      <w:bookmarkEnd w:id="23"/>
     </w:p>
     <w:p>
       <w:pPr>
@@ -8237,9 +9624,11 @@
         <w:keepLines/>
         <w:spacing w:after="120" w:before="280"/>
       </w:pPr>
+      <w:bookmarkStart w:name="_Toc24" w:id="24"/>
       <w:r>
         <w:t xml:space="preserve">6.2 Processar</w:t>
       </w:r>
+      <w:bookmarkEnd w:id="24"/>
     </w:p>
     <w:p>
       <w:pPr>
@@ -8689,9 +10078,11 @@
         <w:keepLines/>
         <w:spacing w:after="120" w:before="280"/>
       </w:pPr>
+      <w:bookmarkStart w:name="_Toc25" w:id="25"/>
       <w:r>
         <w:t xml:space="preserve">6.3 Eleições de 1933 a 1990</w:t>
       </w:r>
+      <w:bookmarkEnd w:id="25"/>
     </w:p>
     <w:p>
       <w:pPr>
@@ -8961,9 +10352,11 @@
         <w:keepLines/>
         <w:spacing w:after="120" w:before="280"/>
       </w:pPr>
+      <w:bookmarkStart w:name="_Toc26" w:id="26"/>
       <w:r>
         <w:t xml:space="preserve">6.4 Locais de votação e o mapa das zonas</w:t>
       </w:r>
+      <w:bookmarkEnd w:id="26"/>
     </w:p>
     <w:p>
       <w:pPr>
@@ -10234,9 +11627,11 @@
         <w:pageBreakBefore/>
         <w:spacing w:after="160" w:before="380"/>
       </w:pPr>
+      <w:bookmarkStart w:name="_Toc27" w:id="27"/>
       <w:r>
         <w:t xml:space="preserve">7. Contrato dos feeds (versão 1)</w:t>
       </w:r>
+      <w:bookmarkEnd w:id="27"/>
     </w:p>
     <w:p>
       <w:pPr>
@@ -10833,9 +12228,11 @@
         <w:keepLines/>
         <w:spacing w:after="120" w:before="280"/>
       </w:pPr>
+      <w:bookmarkStart w:name="_Toc28" w:id="28"/>
       <w:r>
         <w:t xml:space="preserve">7.1 Tipos de arquivo</w:t>
       </w:r>
+      <w:bookmarkEnd w:id="28"/>
     </w:p>
     <w:tbl>
       <w:tblPr>
@@ -11386,9 +12783,11 @@
         <w:keepLines/>
         <w:spacing w:after="120" w:before="280"/>
       </w:pPr>
+      <w:bookmarkStart w:name="_Toc29" w:id="29"/>
       <w:r>
         <w:t xml:space="preserve">7.2 Regras do contrato</w:t>
       </w:r>
+      <w:bookmarkEnd w:id="29"/>
     </w:p>
     <w:p>
       <w:pPr>
@@ -11605,9 +13004,11 @@
         <w:keepLines/>
         <w:spacing w:after="120" w:before="280"/>
       </w:pPr>
+      <w:bookmarkStart w:name="_Toc30" w:id="30"/>
       <w:r>
         <w:t xml:space="preserve">7.3 Como o contrato é protegido</w:t>
       </w:r>
+      <w:bookmarkEnd w:id="30"/>
     </w:p>
     <w:p>
       <w:pPr>
@@ -11711,9 +13112,11 @@
         <w:keepLines/>
         <w:spacing w:after="160" w:before="380"/>
       </w:pPr>
+      <w:bookmarkStart w:name="_Toc31" w:id="31"/>
       <w:r>
         <w:t xml:space="preserve">8. Regras de exibição</w:t>
       </w:r>
+      <w:bookmarkEnd w:id="31"/>
     </w:p>
     <w:p>
       <w:pPr>
@@ -11722,9 +13125,11 @@
         <w:keepLines/>
         <w:spacing w:after="120" w:before="280"/>
       </w:pPr>
+      <w:bookmarkStart w:name="_Toc32" w:id="32"/>
       <w:r>
         <w:t xml:space="preserve">8.1 Paleta</w:t>
       </w:r>
+      <w:bookmarkEnd w:id="32"/>
     </w:p>
     <w:p>
       <w:pPr>
@@ -12813,9 +14218,11 @@
         <w:keepLines/>
         <w:spacing w:after="120" w:before="280"/>
       </w:pPr>
+      <w:bookmarkStart w:name="_Toc33" w:id="33"/>
       <w:r>
         <w:t xml:space="preserve">8.2 Leitura da tela</w:t>
       </w:r>
+      <w:bookmarkEnd w:id="33"/>
     </w:p>
     <w:tbl>
       <w:tblPr>
@@ -13787,9 +15194,11 @@
         <w:keepLines/>
         <w:spacing w:after="120" w:before="280"/>
       </w:pPr>
+      <w:bookmarkStart w:name="_Toc34" w:id="34"/>
       <w:r>
         <w:t xml:space="preserve">8.3 Zonas eleitorais no mapa do município (ADR-029)</w:t>
       </w:r>
+      <w:bookmarkEnd w:id="34"/>
     </w:p>
     <w:p>
       <w:pPr>
@@ -13887,9 +15296,11 @@
         <w:keepLines/>
         <w:spacing w:after="160" w:before="380"/>
       </w:pPr>
+      <w:bookmarkStart w:name="_Toc35" w:id="35"/>
       <w:r>
         <w:t xml:space="preserve">9. Operação</w:t>
       </w:r>
+      <w:bookmarkEnd w:id="35"/>
     </w:p>
     <w:p>
       <w:pPr>
@@ -13898,9 +15309,11 @@
         <w:keepLines/>
         <w:spacing w:after="120" w:before="280"/>
       </w:pPr>
+      <w:bookmarkStart w:name="_Toc36" w:id="36"/>
       <w:r>
         <w:t xml:space="preserve">9.1 Deixar pronto num comando</w:t>
       </w:r>
+      <w:bookmarkEnd w:id="36"/>
     </w:p>
     <w:p>
       <w:pPr>
@@ -14810,9 +16223,11 @@
         <w:keepLines/>
         <w:spacing w:after="120" w:before="280"/>
       </w:pPr>
+      <w:bookmarkStart w:name="_Toc37" w:id="37"/>
       <w:r>
         <w:t xml:space="preserve">9.2 Configuração</w:t>
       </w:r>
+      <w:bookmarkEnd w:id="37"/>
     </w:p>
     <w:p>
       <w:pPr>
@@ -16514,9 +17929,11 @@
         <w:keepLines/>
         <w:spacing w:after="120" w:before="280"/>
       </w:pPr>
+      <w:bookmarkStart w:name="_Toc38" w:id="38"/>
       <w:r>
         <w:t xml:space="preserve">9.3 Comandos</w:t>
       </w:r>
+      <w:bookmarkEnd w:id="38"/>
     </w:p>
     <w:tbl>
       <w:tblPr>
@@ -17628,9 +19045,11 @@
         <w:keepLines/>
         <w:spacing w:after="120" w:before="280"/>
       </w:pPr>
+      <w:bookmarkStart w:name="_Toc39" w:id="39"/>
       <w:r>
         <w:t xml:space="preserve">9.4 Roteiro da noite da eleição</w:t>
       </w:r>
+      <w:bookmarkEnd w:id="39"/>
     </w:p>
     <w:p>
       <w:pPr>
@@ -17639,9 +19058,11 @@
         <w:keepLines/>
         <w:spacing w:after="100" w:before="220"/>
       </w:pPr>
+      <w:bookmarkStart w:name="_Toc40" w:id="40"/>
       <w:r>
         <w:t xml:space="preserve">Na semana anterior</w:t>
       </w:r>
+      <w:bookmarkEnd w:id="40"/>
     </w:p>
     <w:p>
       <w:pPr>
@@ -17825,9 +19246,11 @@
         <w:keepLines/>
         <w:spacing w:after="100" w:before="220"/>
       </w:pPr>
+      <w:bookmarkStart w:name="_Toc41" w:id="41"/>
       <w:r>
         <w:t xml:space="preserve">No dia</w:t>
       </w:r>
+      <w:bookmarkEnd w:id="41"/>
     </w:p>
     <w:p>
       <w:pPr>
@@ -17863,7 +19286,18 @@
         <w:t xml:space="preserve">eleicoes-ao-vivo</w:t>
       </w:r>
       <w:r>
-        <w:t xml:space="preserve"> → Run workflow, com o id da eleição. Numa máquina:</w:t>
+        <w:t xml:space="preserve"> → Run workflow, com o id da eleição, com nada do grupo </w:t>
+      </w:r>
+      <w:r>
+        <w:rPr>
+          <w:rFonts w:ascii="Consolas" w:cs="Consolas" w:eastAsia="Consolas" w:hAnsi="Consolas"/>
+          <w:sz w:val="19"/>
+          <w:szCs w:val="19"/>
+        </w:rPr>
+        <w:t xml:space="preserve">eleicoes-carga</w:t>
+      </w:r>
+      <w:r>
+        <w:t xml:space="preserve"> rodando ou na fila: o grupo guarda uma só execução na espera, e outra que entre na fila cancela a que espera. Numa máquina:</w:t>
       </w:r>
     </w:p>
     <w:tbl>
@@ -17948,9 +19382,11 @@
         <w:keepLines/>
         <w:spacing w:after="100" w:before="220"/>
       </w:pPr>
+      <w:bookmarkStart w:name="_Toc42" w:id="42"/>
       <w:r>
         <w:t xml:space="preserve">Depois</w:t>
       </w:r>
+      <w:bookmarkEnd w:id="42"/>
     </w:p>
     <w:p>
       <w:pPr>
@@ -17962,7 +19398,18 @@
         <w:spacing w:after="70"/>
       </w:pPr>
       <w:r>
-        <w:t xml:space="preserve">O coletor termina sozinho quando a totalização acaba. O índice fica com </w:t>
+        <w:t xml:space="preserve">O coletor termina sozinho quando a totalização acaba, ou quando todas as seções estão totalizadas e nada muda há 60 minutos (</w:t>
+      </w:r>
+      <w:r>
+        <w:rPr>
+          <w:rFonts w:ascii="Consolas" w:cs="Consolas" w:eastAsia="Consolas" w:hAnsi="Consolas"/>
+          <w:sz w:val="19"/>
+          <w:szCs w:val="19"/>
+        </w:rPr>
+        <w:t xml:space="preserve">--parar-estavel</w:t>
+      </w:r>
+      <w:r>
+        <w:t xml:space="preserve">), mesmo sem a marca de finalizada do TSE: no 1º turno de 2026, os deputados de Rondônia ficaram com 100% das seções sem a marca. O índice fica com </w:t>
       </w:r>
       <w:r>
         <w:rPr>
@@ -18007,9 +19454,11 @@
         <w:keepLines/>
         <w:spacing w:after="120" w:before="280"/>
       </w:pPr>
+      <w:bookmarkStart w:name="_Toc43" w:id="43"/>
       <w:r>
         <w:t xml:space="preserve">9.5 Na nuvem, sem computador ligado (ADR-026)</w:t>
       </w:r>
+      <w:bookmarkEnd w:id="43"/>
     </w:p>
     <w:p>
       <w:pPr>
@@ -18574,9 +20023,11 @@
         <w:keepLines/>
         <w:spacing w:after="100" w:before="220"/>
       </w:pPr>
+      <w:bookmarkStart w:name="_Toc44" w:id="44"/>
       <w:r>
         <w:t xml:space="preserve">Como a carga continua de uma execução para outra</w:t>
       </w:r>
+      <w:bookmarkEnd w:id="44"/>
     </w:p>
     <w:p>
       <w:pPr>
@@ -18832,9 +20283,11 @@
         <w:keepLines/>
         <w:spacing w:after="100" w:before="220"/>
       </w:pPr>
+      <w:bookmarkStart w:name="_Toc45" w:id="45"/>
       <w:r>
         <w:t xml:space="preserve">Configuração, uma vez</w:t>
       </w:r>
+      <w:bookmarkEnd w:id="45"/>
     </w:p>
     <w:p>
       <w:pPr>
@@ -20376,9 +21829,11 @@
         <w:keepLines/>
         <w:spacing w:after="100" w:before="220"/>
       </w:pPr>
+      <w:bookmarkStart w:name="_Toc46" w:id="46"/>
       <w:r>
         <w:t xml:space="preserve">Sem o GitHub Actions</w:t>
       </w:r>
+      <w:bookmarkEnd w:id="46"/>
     </w:p>
     <w:p>
       <w:pPr>
@@ -20417,9 +21872,11 @@
         <w:keepLines/>
         <w:spacing w:after="120" w:before="280"/>
       </w:pPr>
+      <w:bookmarkStart w:name="_Toc47" w:id="47"/>
       <w:r>
         <w:t xml:space="preserve">9.6 Limites do plano gratuito</w:t>
       </w:r>
+      <w:bookmarkEnd w:id="47"/>
     </w:p>
     <w:p>
       <w:pPr>
@@ -21231,9 +22688,11 @@
         <w:keepLines/>
         <w:spacing w:after="120" w:before="280"/>
       </w:pPr>
+      <w:bookmarkStart w:name="_Toc48" w:id="48"/>
       <w:r>
         <w:t xml:space="preserve">9.7 Alternativa sem cartão: Supabase Storage (adendo do ADR-026)</w:t>
       </w:r>
+      <w:bookmarkEnd w:id="48"/>
     </w:p>
     <w:p>
       <w:pPr>
@@ -23805,9 +25264,11 @@
         <w:keepLines/>
         <w:spacing w:after="100" w:before="220"/>
       </w:pPr>
+      <w:bookmarkStart w:name="_Toc49" w:id="49"/>
       <w:r>
         <w:t xml:space="preserve">Configuração, uma vez</w:t>
       </w:r>
+      <w:bookmarkEnd w:id="49"/>
     </w:p>
     <w:p>
       <w:pPr>
@@ -24604,7 +26065,7 @@
                 <w:sz w:val="17"/>
                 <w:szCs w:val="17"/>
               </w:rPr>
-              <w:t xml:space="preserve">false (ou ausente): a carga inclui os dados abertos de 1933 a 2024; true deixa só 2026, e a entrada historico da execução manual passa por cima</w:t>
+              <w:t xml:space="preserve">false (ou ausente): a carga inclui os dados abertos de 1933 a 2024; true deixa só 2026 e o mapa das zonas (perto de 2 MB por ano), e as entradas anos e historico da execução manual passam por cima</w:t>
             </w:r>
           </w:p>
         </w:tc>
@@ -24988,9 +26449,11 @@
         <w:keepLines/>
         <w:spacing w:after="160" w:before="380"/>
       </w:pPr>
+      <w:bookmarkStart w:name="_Toc50" w:id="50"/>
       <w:r>
         <w:t xml:space="preserve">10. Verificação</w:t>
       </w:r>
+      <w:bookmarkEnd w:id="50"/>
     </w:p>
     <w:p>
       <w:pPr>
@@ -24999,9 +26462,11 @@
         <w:keepLines/>
         <w:spacing w:after="120" w:before="280"/>
       </w:pPr>
+      <w:bookmarkStart w:name="_Toc51" w:id="51"/>
       <w:r>
         <w:t xml:space="preserve">10.1 Testes automatizados</w:t>
       </w:r>
+      <w:bookmarkEnd w:id="51"/>
     </w:p>
     <w:tbl>
       <w:tblPr>
@@ -25410,9 +26875,11 @@
         <w:keepLines/>
         <w:spacing w:after="120" w:before="280"/>
       </w:pPr>
+      <w:bookmarkStart w:name="_Toc52" w:id="52"/>
       <w:r>
         <w:t xml:space="preserve">10.2 Verificação visual</w:t>
       </w:r>
+      <w:bookmarkEnd w:id="52"/>
     </w:p>
     <w:p>
       <w:pPr>
@@ -25429,9 +26896,11 @@
         <w:keepLines/>
         <w:spacing w:after="120" w:before="280"/>
       </w:pPr>
+      <w:bookmarkStart w:name="_Toc53" w:id="53"/>
       <w:r>
         <w:t xml:space="preserve">10.3 Testes de contrato</w:t>
       </w:r>
+      <w:bookmarkEnd w:id="53"/>
     </w:p>
     <w:p>
       <w:pPr>
@@ -25481,9 +26950,11 @@
         <w:keepLines/>
         <w:spacing w:after="160" w:before="380"/>
       </w:pPr>
+      <w:bookmarkStart w:name="_Toc54" w:id="54"/>
       <w:r>
         <w:t xml:space="preserve">11. Integração com o Lumen</w:t>
       </w:r>
+      <w:bookmarkEnd w:id="54"/>
     </w:p>
     <w:p>
       <w:pPr>
@@ -25819,9 +27290,11 @@
         <w:keepLines/>
         <w:spacing w:after="100" w:before="220"/>
       </w:pPr>
+      <w:bookmarkStart w:name="_Toc55" w:id="55"/>
       <w:r>
         <w:t xml:space="preserve">Integração prevista (Fase 2 em diante)</w:t>
       </w:r>
+      <w:bookmarkEnd w:id="55"/>
     </w:p>
     <w:p>
       <w:pPr>
@@ -25941,9 +27414,11 @@
         <w:pageBreakBefore/>
         <w:spacing w:after="160" w:before="380"/>
       </w:pPr>
+      <w:bookmarkStart w:name="_Toc56" w:id="56"/>
       <w:r>
         <w:t xml:space="preserve">12. Próximos passos e riscos</w:t>
       </w:r>
+      <w:bookmarkEnd w:id="56"/>
     </w:p>
     <w:p>
       <w:pPr>
@@ -25952,9 +27427,11 @@
         <w:keepLines/>
         <w:spacing w:after="120" w:before="280"/>
       </w:pPr>
+      <w:bookmarkStart w:name="_Toc57" w:id="57"/>
       <w:r>
         <w:t xml:space="preserve">12.1 Próximos passos</w:t>
       </w:r>
+      <w:bookmarkEnd w:id="57"/>
     </w:p>
     <w:tbl>
       <w:tblPr>
@@ -27016,9 +28493,11 @@
         <w:keepLines/>
         <w:spacing w:after="120" w:before="280"/>
       </w:pPr>
+      <w:bookmarkStart w:name="_Toc58" w:id="58"/>
       <w:r>
         <w:t xml:space="preserve">12.2 Riscos</w:t>
       </w:r>
+      <w:bookmarkEnd w:id="58"/>
     </w:p>
     <w:tbl>
       <w:tblPr>
@@ -28252,9 +29731,11 @@
         <w:keepLines/>
         <w:spacing w:after="160" w:before="380"/>
       </w:pPr>
+      <w:bookmarkStart w:name="_Toc59" w:id="59"/>
       <w:r>
         <w:t xml:space="preserve">Apêndice A. Glossário</w:t>
       </w:r>
+      <w:bookmarkEnd w:id="59"/>
     </w:p>
     <w:tbl>
       <w:tblPr>
@@ -29350,6 +30831,21 @@
   <w:style w:type="paragraph" w:styleId="Normal" w:default="1">
     <w:name w:val="Normal"/>
     <w:qFormat/>
+  </w:style>
+  <w:style w:type="table" w:styleId="TableNormal" w:default="true">
+    <w:name w:val="Normal Table"/>
+    <w:uiPriority w:val="99"/>
+    <w:semiHidden/>
+    <w:unhideWhenUsed/>
+    <w:tblPr>
+      <w:tblInd w:type="dxa" w:w="0"/>
+      <w:tblCellMar>
+        <w:top w:type="dxa" w:w="0"/>
+        <w:left w:type="dxa" w:w="108"/>
+        <w:bottom w:type="dxa" w:w="0"/>
+        <w:right w:type="dxa" w:w="108"/>
+      </w:tblCellMar>
+    </w:tblPr>
   </w:style>
   <w:style w:type="paragraph" w:styleId="Title">
     <w:name w:val="Title"/>

</xml_diff>

<commit_message>
Eleições: 2º turno ao vivo sem disparo à mão e continuação depois do prazo da máquina
O eleicoes-ao-vivo ganha agendamentos em 25/10/2026, horas antes da apuração,
porque o GitHub tem atrasado os agendamentos de 4 a 7 horas e meia: a primeira
tarefa espera até AGENDA_INICIO (16h45 de Brasília) e, se a espera passa de
5h30, dispara o próprio fluxo. A coleta usa o novo ao-vivo --limite-minutos
330, que para ao fim da passada e sai com o código 3 se a apuração não
terminou; com ele, o fluxo dispara a continuação (até três). Adendo do ADR-026,
DOC-12 1.6, DOC-11 regerado com a referência do código atual, Wiki, README e
CHANGELOG. O arquivo de configuração dos testes da linha de comando grava o
caminho com barras, e esses testes passam a rodar no Windows.
</commit_message>
<xml_diff>
--- a/docs/DOC-12_Eleicoes.docx
+++ b/docs/DOC-12_Eleicoes.docx
@@ -15850,7 +15850,7 @@
                 <w:sz w:val="17"/>
                 <w:szCs w:val="17"/>
               </w:rPr>
-              <w:t xml:space="preserve">Pula a etapa correspondente (sem o histórico, as zonas também ficam de fora)</w:t>
+              <w:t xml:space="preserve">Pula a etapa correspondente (o mapa das zonas roda mesmo sem o histórico, desde 19/10/2026)</w:t>
             </w:r>
           </w:p>
         </w:tc>
@@ -18580,7 +18580,7 @@
                 <w:sz w:val="17"/>
                 <w:szCs w:val="17"/>
               </w:rPr>
-              <w:t xml:space="preserve">lumen eleicoes ao-vivo --eleicao &lt;id&gt; [--nuvem]</w:t>
+              <w:t xml:space="preserve">lumen eleicoes ao-vivo --eleicao &lt;id&gt; [--nuvem] [--limite-minutos]</w:t>
             </w:r>
           </w:p>
         </w:tc>
@@ -18607,7 +18607,7 @@
                 <w:sz w:val="17"/>
                 <w:szCs w:val="17"/>
               </w:rPr>
-              <w:t xml:space="preserve">Coleta a apuração em andamento (seção 5); com --nuvem, publica a cada passada</w:t>
+              <w:t xml:space="preserve">Coleta a apuração em andamento (seção 5); com --nuvem, publica a cada passada; com --limite-minutos, para depois do prazo e sai com o código 3 se a apuração não terminou</w:t>
             </w:r>
           </w:p>
         </w:tc>
@@ -19275,7 +19275,29 @@
         <w:spacing w:after="70"/>
       </w:pPr>
       <w:r>
-        <w:t xml:space="preserve">Iniciar o coletor antes da divulgação dos primeiros resultados. Na nuvem: Actions → </w:t>
+        <w:t xml:space="preserve">Na nuvem, o coletor começa sozinho: o </w:t>
+      </w:r>
+      <w:r>
+        <w:rPr>
+          <w:rFonts w:ascii="Consolas" w:cs="Consolas" w:eastAsia="Consolas" w:hAnsi="Consolas"/>
+          <w:sz w:val="19"/>
+          <w:szCs w:val="19"/>
+        </w:rPr>
+        <w:t xml:space="preserve">eleicoes-ao-vivo</w:t>
+      </w:r>
+      <w:r>
+        <w:t xml:space="preserve"> tem agendamentos no dia da eleição e espera até </w:t>
+      </w:r>
+      <w:r>
+        <w:rPr>
+          <w:rFonts w:ascii="Consolas" w:cs="Consolas" w:eastAsia="Consolas" w:hAnsi="Consolas"/>
+          <w:sz w:val="19"/>
+          <w:szCs w:val="19"/>
+        </w:rPr>
+        <w:t xml:space="preserve">AGENDA_INICIO</w:t>
+      </w:r>
+      <w:r>
+        <w:t xml:space="preserve"> (16h45 de Brasília no 2º turno de 2026; seção 9.5). Conferir de manhã, em Actions, que uma execução agendada está esperando. À mão, Actions → </w:t>
       </w:r>
       <w:r>
         <w:rPr>
@@ -19372,7 +19394,18 @@
         <w:spacing w:after="70"/>
       </w:pPr>
       <w:r>
-        <w:t xml:space="preserve">Se for preciso reiniciar, basta rodar o mesmo comando: o estado preserva cores e evolução. Na nuvem, a máquina tem prazo de 6 horas; se a totalização não terminou, dispare o fluxo de novo, e o estado guardado no bucket privado continua a série.</w:t>
+        <w:t xml:space="preserve">Se for preciso reiniciar, basta rodar o mesmo comando: o estado preserva cores e evolução. Na nuvem, a máquina tem prazo de 6 horas: o coletor para aos 330 minutos (</w:t>
+      </w:r>
+      <w:r>
+        <w:rPr>
+          <w:rFonts w:ascii="Consolas" w:cs="Consolas" w:eastAsia="Consolas" w:hAnsi="Consolas"/>
+          <w:sz w:val="19"/>
+          <w:szCs w:val="19"/>
+        </w:rPr>
+        <w:t xml:space="preserve">--limite-minutos</w:t>
+      </w:r>
+      <w:r>
+        <w:t xml:space="preserve">) e, se a totalização não terminou, o fluxo dispara a continuação (até três), que segue do estado guardado no bucket privado.</w:t>
       </w:r>
     </w:p>
     <w:p>
@@ -19752,7 +19785,7 @@
                 <w:sz w:val="17"/>
                 <w:szCs w:val="17"/>
               </w:rPr>
-              <w:t xml:space="preserve">À mão, com o id da eleição; publica a cada passada que gravou feeds</w:t>
+              <w:t xml:space="preserve">Agendado no dia da eleição, espera até AGENDA_INICIO; ou à mão, com o id da eleição. Publica a cada passada que gravou feeds e, perto do prazo da máquina, dispara a continuação</w:t>
             </w:r>
           </w:p>
         </w:tc>
@@ -20016,6 +20049,36 @@
         </w:tc>
       </w:tr>
     </w:tbl>
+    <w:p>
+      <w:pPr>
+        <w:spacing w:after="120"/>
+      </w:pPr>
+      <w:r>
+        <w:t xml:space="preserve">Os agendamentos do GitHub chegam atrasados: em outubro de 2026, o das 04:41 de Brasília começou entre 08:44 e 12:14. Por isso o </w:t>
+      </w:r>
+      <w:r>
+        <w:rPr>
+          <w:rFonts w:ascii="Consolas" w:cs="Consolas" w:eastAsia="Consolas" w:hAnsi="Consolas"/>
+          <w:sz w:val="19"/>
+          <w:szCs w:val="19"/>
+        </w:rPr>
+        <w:t xml:space="preserve">eleicoes-ao-vivo</w:t>
+      </w:r>
+      <w:r>
+        <w:t xml:space="preserve"> agenda várias execuções horas antes da apuração e tem duas tarefas. A primeira espera até </w:t>
+      </w:r>
+      <w:r>
+        <w:rPr>
+          <w:rFonts w:ascii="Consolas" w:cs="Consolas" w:eastAsia="Consolas" w:hAnsi="Consolas"/>
+          <w:sz w:val="19"/>
+          <w:szCs w:val="19"/>
+        </w:rPr>
+        <w:t xml:space="preserve">AGENDA_INICIO</w:t>
+      </w:r>
+      <w:r>
+        <w:t xml:space="preserve">; se a espera passar de 5h30, ela dispara o próprio fluxo no fim, e a nova execução continua esperando. A segunda coleta, no grupo de concorrência da carga. Se mais de uma execução agendada chegar à coleta, a segunda espera a primeira, recomeça do estado e para ao ver a totalização terminada.</w:t>
+      </w:r>
+    </w:p>
     <w:p>
       <w:pPr>
         <w:pStyle w:val="Heading3"/>
@@ -26339,7 +26402,7 @@
         <w:t xml:space="preserve">eleicoes-carga</w:t>
       </w:r>
       <w:r>
-        <w:t xml:space="preserve"> → Run workflow (publica 2026 e, em duas ou três execuções, o histórico). Na noite do 2º turno, </w:t>
+        <w:t xml:space="preserve"> → Run workflow (publica 2026 e, em duas ou três execuções, o histórico). Na noite do 2º turno, o </w:t>
       </w:r>
       <w:r>
         <w:rPr>
@@ -26350,7 +26413,7 @@
         <w:t xml:space="preserve">eleicoes-ao-vivo</w:t>
       </w:r>
       <w:r>
-        <w:t xml:space="preserve"> com </w:t>
+        <w:t xml:space="preserve"> agendado para </w:t>
       </w:r>
       <w:r>
         <w:rPr>
@@ -26361,7 +26424,7 @@
         <w:t xml:space="preserve">2026-2t-geral</w:t>
       </w:r>
       <w:r>
-        <w:t xml:space="preserve">, como na seção 9.4.</w:t>
+        <w:t xml:space="preserve"> começa sozinho, como na seção 9.4.</w:t>
       </w:r>
     </w:p>
     <w:p>

</xml_diff>

<commit_message>
Eleições: PL azul e PT vermelho sempre, exterior no mapa, evolução legível, zonas e comparação com o 1º turno (ADR-052)
- Cores: PL tem sempre a posição 0 (azul) e PT a 1 (vermelho), pelo partido do
  candidato ou pela sigla; os demais seguem a ordem de votação a partir da 2.
  Paleta reordenada e validada de novo para daltonismo nos dois temas; o mapa
  pinta quatro posições. VERSAO_PROCESSAMENTO 3 refaz os feeds publicados,
  inclusive 1933 a 1990 e a coleta ao vivo.
- Mapa do Brasil: o exterior é um quadrado tracejado no Atlântico, com cor,
  dica e clique.
- Evolução da apuração: escala ajustada aos dados a partir de 2% das seções,
  leitura "Vantagem" em pontos percentuais, detalhe sempre visível e setas.
- Zonas: traços em unidades do mapa, sem non-scaling-stroke (faixas largas no
  Chrome com aceleração de vídeo); sem resultado por zona, o tom de quem
  venceu no município.
- 2º turno: comparação com o 1º turno, com a conta dos votos a mais.
</commit_message>
<xml_diff>
--- a/docs/DOC-12_Eleicoes.docx
+++ b/docs/DOC-12_Eleicoes.docx
@@ -2136,7 +2136,7 @@
                 <w:sz w:val="19"/>
                 <w:szCs w:val="19"/>
               </w:rPr>
-              <w:t xml:space="preserve">Neutro</w:t>
+              <w:t xml:space="preserve">Cores</w:t>
             </w:r>
           </w:p>
         </w:tc>
@@ -2163,7 +2163,7 @@
                 <w:sz w:val="19"/>
                 <w:szCs w:val="19"/>
               </w:rPr>
-              <w:t xml:space="preserve">A cor identifica a posição na votação, não o partido (ADR-020). Nenhum texto qualifica candidato ou partido.</w:t>
+              <w:t xml:space="preserve">PL é sempre azul e PT sempre vermelho (ADR-052); os demais candidatos e partidos têm a cor pela posição na votação (ADR-020). Nenhum texto qualifica candidato ou partido.</w:t>
             </w:r>
           </w:p>
         </w:tc>
@@ -13136,7 +13136,7 @@
         <w:spacing w:after="120"/>
       </w:pPr>
       <w:r>
-        <w:t xml:space="preserve">Paleta categórica de oito posições em ordem fixa, com versão própria para o fundo escuro (modo TV e tema escuro), validada para deuteranopia, protanopia e tritanopia (ADR-020). Os valores abaixo são lidos de </w:t>
+        <w:t xml:space="preserve">Paleta categórica de oito posições em ordem fixa, com versão própria para o fundo escuro (modo TV e tema escuro), validada para deuteranopia, protanopia e tritanopia (ADR-020, ADR-052). A posição 0 (azul) é sempre do PL e a 1 (vermelho) sempre do PT, em qualquer eleição; nenhum outro partido as recebe. Os valores abaixo são lidos de </w:t>
       </w:r>
       <w:r>
         <w:rPr>
@@ -13430,7 +13430,7 @@
         <w:tc>
           <w:tcPr>
             <w:tcW w:type="dxa" w:w="1500"/>
-            <w:shd w:fill="EB6834" w:val="clear"/>
+            <w:shd w:fill="E34948" w:val="clear"/>
             <w:tcMar>
               <w:top w:type="dxa" w:w="60"/>
               <w:left w:type="dxa" w:w="110"/>
@@ -13452,14 +13452,14 @@
                 <w:sz w:val="19"/>
                 <w:szCs w:val="19"/>
               </w:rPr>
-              <w:t xml:space="preserve">#EB6834</w:t>
+              <w:t xml:space="preserve">#E34948</w:t>
             </w:r>
           </w:p>
         </w:tc>
         <w:tc>
           <w:tcPr>
             <w:tcW w:type="dxa" w:w="1500"/>
-            <w:shd w:fill="D95926" w:val="clear"/>
+            <w:shd w:fill="E34948" w:val="clear"/>
             <w:tcMar>
               <w:top w:type="dxa" w:w="60"/>
               <w:left w:type="dxa" w:w="110"/>
@@ -13481,7 +13481,7 @@
                 <w:sz w:val="19"/>
                 <w:szCs w:val="19"/>
               </w:rPr>
-              <w:t xml:space="preserve">#D95926</w:t>
+              <w:t xml:space="preserve">#E34948</w:t>
             </w:r>
           </w:p>
         </w:tc>
@@ -13544,7 +13544,7 @@
         <w:tc>
           <w:tcPr>
             <w:tcW w:type="dxa" w:w="1500"/>
-            <w:shd w:fill="1BAF7A" w:val="clear"/>
+            <w:shd w:fill="EDA100" w:val="clear"/>
             <w:tcMar>
               <w:top w:type="dxa" w:w="60"/>
               <w:left w:type="dxa" w:w="110"/>
@@ -13566,14 +13566,14 @@
                 <w:sz w:val="19"/>
                 <w:szCs w:val="19"/>
               </w:rPr>
-              <w:t xml:space="preserve">#1BAF7A</w:t>
+              <w:t xml:space="preserve">#EDA100</w:t>
             </w:r>
           </w:p>
         </w:tc>
         <w:tc>
           <w:tcPr>
             <w:tcW w:type="dxa" w:w="1500"/>
-            <w:shd w:fill="199E70" w:val="clear"/>
+            <w:shd w:fill="C98500" w:val="clear"/>
             <w:tcMar>
               <w:top w:type="dxa" w:w="60"/>
               <w:left w:type="dxa" w:w="110"/>
@@ -13595,7 +13595,7 @@
                 <w:sz w:val="19"/>
                 <w:szCs w:val="19"/>
               </w:rPr>
-              <w:t xml:space="preserve">#199E70</w:t>
+              <w:t xml:space="preserve">#C98500</w:t>
             </w:r>
           </w:p>
         </w:tc>
@@ -13658,7 +13658,7 @@
         <w:tc>
           <w:tcPr>
             <w:tcW w:type="dxa" w:w="1500"/>
-            <w:shd w:fill="EDA100" w:val="clear"/>
+            <w:shd w:fill="008300" w:val="clear"/>
             <w:tcMar>
               <w:top w:type="dxa" w:w="60"/>
               <w:left w:type="dxa" w:w="110"/>
@@ -13676,18 +13676,18 @@
                 <w:rFonts w:ascii="Consolas" w:cs="Consolas" w:eastAsia="Consolas" w:hAnsi="Consolas"/>
                 <w:b w:val="false"/>
                 <w:bCs w:val="false"/>
-                <w:color w:val="000000"/>
+                <w:color w:val="FFFFFF"/>
                 <w:sz w:val="19"/>
                 <w:szCs w:val="19"/>
               </w:rPr>
-              <w:t xml:space="preserve">#EDA100</w:t>
+              <w:t xml:space="preserve">#008300</w:t>
             </w:r>
           </w:p>
         </w:tc>
         <w:tc>
           <w:tcPr>
             <w:tcW w:type="dxa" w:w="1500"/>
-            <w:shd w:fill="C98500" w:val="clear"/>
+            <w:shd w:fill="008300" w:val="clear"/>
             <w:tcMar>
               <w:top w:type="dxa" w:w="60"/>
               <w:left w:type="dxa" w:w="110"/>
@@ -13705,11 +13705,11 @@
                 <w:rFonts w:ascii="Consolas" w:cs="Consolas" w:eastAsia="Consolas" w:hAnsi="Consolas"/>
                 <w:b w:val="false"/>
                 <w:bCs w:val="false"/>
-                <w:color w:val="000000"/>
+                <w:color w:val="FFFFFF"/>
                 <w:sz w:val="19"/>
                 <w:szCs w:val="19"/>
               </w:rPr>
-              <w:t xml:space="preserve">#C98500</w:t>
+              <w:t xml:space="preserve">#008300</w:t>
             </w:r>
           </w:p>
         </w:tc>
@@ -13736,7 +13736,7 @@
                 <w:sz w:val="19"/>
                 <w:szCs w:val="19"/>
               </w:rPr>
-              <w:t xml:space="preserve">Lista, legenda e gráfico; no mapa, aparece como “Outros”</w:t>
+              <w:t xml:space="preserve">Lista, legenda, gráfico e mapa</w:t>
             </w:r>
           </w:p>
         </w:tc>
@@ -13886,7 +13886,7 @@
         <w:tc>
           <w:tcPr>
             <w:tcW w:type="dxa" w:w="1500"/>
-            <w:shd w:fill="008300" w:val="clear"/>
+            <w:shd w:fill="4A3AA7" w:val="clear"/>
             <w:tcMar>
               <w:top w:type="dxa" w:w="60"/>
               <w:left w:type="dxa" w:w="110"/>
@@ -13908,14 +13908,14 @@
                 <w:sz w:val="19"/>
                 <w:szCs w:val="19"/>
               </w:rPr>
-              <w:t xml:space="preserve">#008300</w:t>
+              <w:t xml:space="preserve">#4A3AA7</w:t>
             </w:r>
           </w:p>
         </w:tc>
         <w:tc>
           <w:tcPr>
             <w:tcW w:type="dxa" w:w="1500"/>
-            <w:shd w:fill="008300" w:val="clear"/>
+            <w:shd w:fill="9085E9" w:val="clear"/>
             <w:tcMar>
               <w:top w:type="dxa" w:w="60"/>
               <w:left w:type="dxa" w:w="110"/>
@@ -13933,11 +13933,11 @@
                 <w:rFonts w:ascii="Consolas" w:cs="Consolas" w:eastAsia="Consolas" w:hAnsi="Consolas"/>
                 <w:b w:val="false"/>
                 <w:bCs w:val="false"/>
-                <w:color w:val="FFFFFF"/>
+                <w:color w:val="000000"/>
                 <w:sz w:val="19"/>
                 <w:szCs w:val="19"/>
               </w:rPr>
-              <w:t xml:space="preserve">#008300</w:t>
+              <w:t xml:space="preserve">#9085E9</w:t>
             </w:r>
           </w:p>
         </w:tc>
@@ -14000,36 +14000,7 @@
         <w:tc>
           <w:tcPr>
             <w:tcW w:type="dxa" w:w="1500"/>
-            <w:shd w:fill="4A3AA7" w:val="clear"/>
-            <w:tcMar>
-              <w:top w:type="dxa" w:w="60"/>
-              <w:left w:type="dxa" w:w="110"/>
-              <w:bottom w:type="dxa" w:w="60"/>
-              <w:right w:type="dxa" w:w="110"/>
-            </w:tcMar>
-            <w:vAlign w:val="center"/>
-          </w:tcPr>
-          <w:p>
-            <w:pPr>
-              <w:spacing w:after="0"/>
-            </w:pPr>
-            <w:r>
-              <w:rPr>
-                <w:rFonts w:ascii="Consolas" w:cs="Consolas" w:eastAsia="Consolas" w:hAnsi="Consolas"/>
-                <w:b w:val="false"/>
-                <w:bCs w:val="false"/>
-                <w:color w:val="FFFFFF"/>
-                <w:sz w:val="19"/>
-                <w:szCs w:val="19"/>
-              </w:rPr>
-              <w:t xml:space="preserve">#4A3AA7</w:t>
-            </w:r>
-          </w:p>
-        </w:tc>
-        <w:tc>
-          <w:tcPr>
-            <w:tcW w:type="dxa" w:w="1500"/>
-            <w:shd w:fill="9085E9" w:val="clear"/>
+            <w:shd w:fill="1BAF7A" w:val="clear"/>
             <w:tcMar>
               <w:top w:type="dxa" w:w="60"/>
               <w:left w:type="dxa" w:w="110"/>
@@ -14051,7 +14022,36 @@
                 <w:sz w:val="19"/>
                 <w:szCs w:val="19"/>
               </w:rPr>
-              <w:t xml:space="preserve">#9085E9</w:t>
+              <w:t xml:space="preserve">#1BAF7A</w:t>
+            </w:r>
+          </w:p>
+        </w:tc>
+        <w:tc>
+          <w:tcPr>
+            <w:tcW w:type="dxa" w:w="1500"/>
+            <w:shd w:fill="199E70" w:val="clear"/>
+            <w:tcMar>
+              <w:top w:type="dxa" w:w="60"/>
+              <w:left w:type="dxa" w:w="110"/>
+              <w:bottom w:type="dxa" w:w="60"/>
+              <w:right w:type="dxa" w:w="110"/>
+            </w:tcMar>
+            <w:vAlign w:val="center"/>
+          </w:tcPr>
+          <w:p>
+            <w:pPr>
+              <w:spacing w:after="0"/>
+            </w:pPr>
+            <w:r>
+              <w:rPr>
+                <w:rFonts w:ascii="Consolas" w:cs="Consolas" w:eastAsia="Consolas" w:hAnsi="Consolas"/>
+                <w:b w:val="false"/>
+                <w:bCs w:val="false"/>
+                <w:color w:val="000000"/>
+                <w:sz w:val="19"/>
+                <w:szCs w:val="19"/>
+              </w:rPr>
+              <w:t xml:space="preserve">#199E70</w:t>
             </w:r>
           </w:p>
         </w:tc>
@@ -14114,7 +14114,7 @@
         <w:tc>
           <w:tcPr>
             <w:tcW w:type="dxa" w:w="1500"/>
-            <w:shd w:fill="E34948" w:val="clear"/>
+            <w:shd w:fill="EB6834" w:val="clear"/>
             <w:tcMar>
               <w:top w:type="dxa" w:w="60"/>
               <w:left w:type="dxa" w:w="110"/>
@@ -14136,14 +14136,14 @@
                 <w:sz w:val="19"/>
                 <w:szCs w:val="19"/>
               </w:rPr>
-              <w:t xml:space="preserve">#E34948</w:t>
+              <w:t xml:space="preserve">#EB6834</w:t>
             </w:r>
           </w:p>
         </w:tc>
         <w:tc>
           <w:tcPr>
             <w:tcW w:type="dxa" w:w="1500"/>
-            <w:shd w:fill="E66767" w:val="clear"/>
+            <w:shd w:fill="D95926" w:val="clear"/>
             <w:tcMar>
               <w:top w:type="dxa" w:w="60"/>
               <w:left w:type="dxa" w:w="110"/>
@@ -14165,7 +14165,7 @@
                 <w:sz w:val="19"/>
                 <w:szCs w:val="19"/>
               </w:rPr>
-              <w:t xml:space="preserve">#E66767</w:t>
+              <w:t xml:space="preserve">#D95926</w:t>
             </w:r>
           </w:p>
         </w:tc>
@@ -14208,7 +14208,7 @@
         <w:spacing w:after="120"/>
       </w:pPr>
       <w:r>
-        <w:t xml:space="preserve">No mapa (coroplético: todas as áreas lado a lado) só as três primeiras posições passam na validação de todos os pares; da quarta em diante, a área aparece como “Outros”, e o nome continua na dica, na lista e na tabela. Nos panoramas e nos cargos proporcionais, a cor é do partido, pela ordem do placar (eleitos, depois partes lideradas, depois votos) — de novo pela posição, nunca pela cor tradicional do partido.</w:t>
+        <w:t xml:space="preserve">No mapa (coroplético: todas as áreas lado a lado) só as quatro primeiras posições (azul, vermelho, amarelo e verde) passam na validação de todos os pares; da quinta em diante, a área aparece como “Outros”, e o nome continua na dica, na lista e na tabela. Nos panoramas e nos cargos proporcionais, a cor é do partido: PL e PT com a sua, os demais pela ordem do placar (eleitos, depois partes lideradas, depois votos).</w:t>
       </w:r>
     </w:p>
     <w:p>
@@ -29695,7 +29695,7 @@
                 <w:sz w:val="17"/>
                 <w:szCs w:val="17"/>
               </w:rPr>
-              <w:t xml:space="preserve">Cor por posição, nunca por partido; tabela sempre ao lado</w:t>
+              <w:t xml:space="preserve">Só PL (azul) e PT (vermelho) têm cor própria, a mesma em todas as eleições (ADR-052); os demais, pela posição; tabela sempre ao lado</w:t>
             </w:r>
           </w:p>
         </w:tc>

</xml_diff>